<commit_message>
UPDATE: отчет+sources DATE: 2026-09-24 01:33:15
</commit_message>
<xml_diff>
--- a/Учеба 4 семестр/ОСИ/Курсовая работа/Курсовая работа.docx
+++ b/Учеба 4 семестр/ОСИ/Курсовая работа/Курсовая работа.docx
@@ -663,6 +663,145 @@
           <w:szCs w:val="28"/>
         </w:rPr>
         <w:tab/>
+        <w:t>4</w:t>
+      </w:r>
+    </w:p>
+    <w:p>
+      <w:pPr>
+        <w:tabs>
+          <w:tab w:val="right" w:leader="dot" w:pos="9000"/>
+        </w:tabs>
+        <w:spacing w:line="360" w:lineRule="auto"/>
+        <w:jc w:val="both"/>
+      </w:pPr>
+      <w:r>
+        <w:rPr>
+          <w:sz w:val="28"/>
+          <w:szCs w:val="28"/>
+        </w:rPr>
+        <w:t xml:space="preserve">1. Исследование </w:t>
+      </w:r>
+      <w:r>
+        <w:rPr>
+          <w:sz w:val="28"/>
+          <w:szCs w:val="28"/>
+        </w:rPr>
+        <w:t>механизма переключения в режим ядра</w:t>
+      </w:r>
+      <w:r>
+        <w:rPr>
+          <w:sz w:val="28"/>
+          <w:szCs w:val="28"/>
+        </w:rPr>
+        <w:tab/>
+      </w:r>
+      <w:r>
+        <w:rPr>
+          <w:sz w:val="28"/>
+          <w:szCs w:val="28"/>
+        </w:rPr>
+        <w:t>5</w:t>
+      </w:r>
+    </w:p>
+    <w:p>
+      <w:pPr>
+        <w:tabs>
+          <w:tab w:val="right" w:leader="dot" w:pos="9000"/>
+        </w:tabs>
+        <w:spacing w:line="360" w:lineRule="auto"/>
+        <w:ind w:left="360"/>
+        <w:jc w:val="both"/>
+      </w:pPr>
+      <w:r>
+        <w:rPr>
+          <w:sz w:val="28"/>
+          <w:szCs w:val="28"/>
+        </w:rPr>
+        <w:t xml:space="preserve">1.1. </w:t>
+      </w:r>
+      <w:r>
+        <w:rPr>
+          <w:sz w:val="28"/>
+          <w:szCs w:val="28"/>
+        </w:rPr>
+        <w:t>Кольца защиты и разделение привилегий</w:t>
+      </w:r>
+      <w:r>
+        <w:rPr>
+          <w:sz w:val="28"/>
+          <w:szCs w:val="28"/>
+        </w:rPr>
+        <w:tab/>
+      </w:r>
+      <w:r>
+        <w:rPr>
+          <w:sz w:val="28"/>
+          <w:szCs w:val="28"/>
+        </w:rPr>
+        <w:t>5</w:t>
+      </w:r>
+    </w:p>
+    <w:p>
+      <w:pPr>
+        <w:tabs>
+          <w:tab w:val="right" w:leader="dot" w:pos="9000"/>
+        </w:tabs>
+        <w:spacing w:line="360" w:lineRule="auto"/>
+        <w:ind w:left="360"/>
+        <w:jc w:val="both"/>
+        <w:rPr>
+          <w:sz w:val="28"/>
+          <w:szCs w:val="28"/>
+        </w:rPr>
+      </w:pPr>
+      <w:r>
+        <w:rPr>
+          <w:sz w:val="28"/>
+          <w:szCs w:val="28"/>
+        </w:rPr>
+        <w:t xml:space="preserve">1.2. </w:t>
+      </w:r>
+      <w:r>
+        <w:rPr>
+          <w:sz w:val="28"/>
+          <w:szCs w:val="28"/>
+        </w:rPr>
+        <w:t>Понятие системного вызова</w:t>
+      </w:r>
+      <w:r>
+        <w:rPr>
+          <w:sz w:val="28"/>
+          <w:szCs w:val="28"/>
+        </w:rPr>
+        <w:tab/>
+      </w:r>
+      <w:r>
+        <w:rPr>
+          <w:sz w:val="28"/>
+          <w:szCs w:val="28"/>
+        </w:rPr>
+        <w:t>6</w:t>
+      </w:r>
+    </w:p>
+    <w:p>
+      <w:pPr>
+        <w:tabs>
+          <w:tab w:val="right" w:leader="dot" w:pos="9000"/>
+        </w:tabs>
+        <w:spacing w:line="360" w:lineRule="auto"/>
+        <w:ind w:left="360"/>
+        <w:jc w:val="both"/>
+        <w:rPr>
+          <w:sz w:val="28"/>
+          <w:szCs w:val="28"/>
+        </w:rPr>
+      </w:pPr>
+      <w:r>
+        <w:rPr>
+          <w:sz w:val="28"/>
+          <w:szCs w:val="28"/>
+        </w:rPr>
+        <w:t>1.</w:t>
       </w:r>
       <w:r>
         <w:rPr>
@@ -671,6 +810,211 @@
         </w:rPr>
         <w:t>3</w:t>
       </w:r>
+      <w:r>
+        <w:rPr>
+          <w:sz w:val="28"/>
+          <w:szCs w:val="28"/>
+        </w:rPr>
+        <w:t>. П</w:t>
+      </w:r>
+      <w:r>
+        <w:rPr>
+          <w:sz w:val="28"/>
+          <w:szCs w:val="28"/>
+        </w:rPr>
+        <w:t>ередача информации о системном вызове</w:t>
+      </w:r>
+      <w:r>
+        <w:rPr>
+          <w:sz w:val="28"/>
+          <w:szCs w:val="28"/>
+        </w:rPr>
+        <w:tab/>
+        <w:t>7</w:t>
+      </w:r>
+    </w:p>
+    <w:p>
+      <w:pPr>
+        <w:tabs>
+          <w:tab w:val="right" w:leader="dot" w:pos="9000"/>
+        </w:tabs>
+        <w:spacing w:line="360" w:lineRule="auto"/>
+        <w:ind w:left="360"/>
+        <w:jc w:val="both"/>
+        <w:rPr>
+          <w:sz w:val="28"/>
+          <w:szCs w:val="28"/>
+        </w:rPr>
+      </w:pPr>
+      <w:r>
+        <w:rPr>
+          <w:sz w:val="28"/>
+          <w:szCs w:val="28"/>
+        </w:rPr>
+        <w:t>1.</w:t>
+      </w:r>
+      <w:r>
+        <w:rPr>
+          <w:sz w:val="28"/>
+          <w:szCs w:val="28"/>
+        </w:rPr>
+        <w:t>4</w:t>
+      </w:r>
+      <w:r>
+        <w:rPr>
+          <w:sz w:val="28"/>
+          <w:szCs w:val="28"/>
+        </w:rPr>
+        <w:t xml:space="preserve">. </w:t>
+      </w:r>
+      <w:r>
+        <w:rPr>
+          <w:sz w:val="28"/>
+          <w:szCs w:val="28"/>
+        </w:rPr>
+        <w:t xml:space="preserve">Инструкция </w:t>
+      </w:r>
+      <w:proofErr w:type="spellStart"/>
+      <w:r>
+        <w:rPr>
+          <w:sz w:val="28"/>
+          <w:szCs w:val="28"/>
+          <w:lang w:val="en-US"/>
+        </w:rPr>
+        <w:t>syscall</w:t>
+      </w:r>
+      <w:proofErr w:type="spellEnd"/>
+      <w:r>
+        <w:rPr>
+          <w:sz w:val="28"/>
+          <w:szCs w:val="28"/>
+        </w:rPr>
+        <w:t xml:space="preserve"> и переход в режим ядра</w:t>
+      </w:r>
+      <w:r>
+        <w:rPr>
+          <w:sz w:val="28"/>
+          <w:szCs w:val="28"/>
+        </w:rPr>
+        <w:tab/>
+        <w:t>7</w:t>
+      </w:r>
+    </w:p>
+    <w:p>
+      <w:pPr>
+        <w:tabs>
+          <w:tab w:val="right" w:leader="dot" w:pos="9000"/>
+        </w:tabs>
+        <w:spacing w:line="360" w:lineRule="auto"/>
+        <w:ind w:left="360"/>
+        <w:jc w:val="both"/>
+        <w:rPr>
+          <w:sz w:val="28"/>
+          <w:szCs w:val="28"/>
+        </w:rPr>
+      </w:pPr>
+      <w:r>
+        <w:rPr>
+          <w:sz w:val="28"/>
+          <w:szCs w:val="28"/>
+        </w:rPr>
+        <w:t xml:space="preserve">1.4. </w:t>
+      </w:r>
+      <w:r>
+        <w:rPr>
+          <w:sz w:val="28"/>
+          <w:szCs w:val="28"/>
+        </w:rPr>
+        <w:t>Обработка системного вызова внутри ядра</w:t>
+      </w:r>
+      <w:r>
+        <w:rPr>
+          <w:sz w:val="28"/>
+          <w:szCs w:val="28"/>
+        </w:rPr>
+        <w:tab/>
+      </w:r>
+      <w:r>
+        <w:rPr>
+          <w:sz w:val="28"/>
+          <w:szCs w:val="28"/>
+        </w:rPr>
+        <w:t>9</w:t>
+      </w:r>
+    </w:p>
+    <w:p>
+      <w:pPr>
+        <w:tabs>
+          <w:tab w:val="right" w:leader="dot" w:pos="9000"/>
+        </w:tabs>
+        <w:spacing w:line="360" w:lineRule="auto"/>
+        <w:ind w:left="360"/>
+        <w:jc w:val="both"/>
+        <w:rPr>
+          <w:sz w:val="28"/>
+          <w:szCs w:val="28"/>
+        </w:rPr>
+      </w:pPr>
+    </w:p>
+    <w:p>
+      <w:pPr>
+        <w:tabs>
+          <w:tab w:val="right" w:leader="dot" w:pos="9000"/>
+        </w:tabs>
+        <w:spacing w:line="360" w:lineRule="auto"/>
+        <w:ind w:left="360"/>
+        <w:jc w:val="both"/>
+        <w:rPr>
+          <w:sz w:val="28"/>
+          <w:szCs w:val="28"/>
+        </w:rPr>
+      </w:pPr>
+    </w:p>
+    <w:p>
+      <w:pPr>
+        <w:tabs>
+          <w:tab w:val="right" w:leader="dot" w:pos="9000"/>
+        </w:tabs>
+        <w:spacing w:line="360" w:lineRule="auto"/>
+        <w:jc w:val="both"/>
+      </w:pPr>
+      <w:r>
+        <w:rPr>
+          <w:sz w:val="28"/>
+          <w:szCs w:val="28"/>
+        </w:rPr>
+        <w:t xml:space="preserve">2. </w:t>
+      </w:r>
+      <w:r>
+        <w:rPr>
+          <w:sz w:val="28"/>
+          <w:szCs w:val="28"/>
+        </w:rPr>
+        <w:tab/>
+        <w:t>9</w:t>
+      </w:r>
+    </w:p>
+    <w:p>
+      <w:pPr>
+        <w:tabs>
+          <w:tab w:val="right" w:leader="dot" w:pos="9000"/>
+        </w:tabs>
+        <w:spacing w:line="360" w:lineRule="auto"/>
+        <w:jc w:val="both"/>
+        <w:rPr>
+          <w:sz w:val="28"/>
+          <w:szCs w:val="28"/>
+        </w:rPr>
+      </w:pPr>
+    </w:p>
+    <w:p>
+      <w:pPr>
+        <w:tabs>
+          <w:tab w:val="right" w:leader="dot" w:pos="9000"/>
+        </w:tabs>
+        <w:spacing w:line="360" w:lineRule="auto"/>
+        <w:jc w:val="both"/>
+      </w:pPr>
     </w:p>
     <w:p>
       <w:pPr>
@@ -755,13 +1099,6 @@
     <w:p/>
     <w:p/>
     <w:p/>
-    <w:p/>
-    <w:p/>
-    <w:p/>
-    <w:p/>
-    <w:p/>
-    <w:p/>
-    <w:p/>
     <w:p>
       <w:pPr>
         <w:spacing w:line="360" w:lineRule="auto"/>
@@ -780,7 +1117,6 @@
           <w:sz w:val="32"/>
           <w:szCs w:val="32"/>
         </w:rPr>
-        <w:lastRenderedPageBreak/>
         <w:t>Введение</w:t>
       </w:r>
     </w:p>
@@ -910,6 +1246,7 @@
           <w:sz w:val="28"/>
           <w:szCs w:val="28"/>
         </w:rPr>
+        <w:lastRenderedPageBreak/>
         <w:t>Актуальность:</w:t>
       </w:r>
       <w:r>
@@ -1071,7 +1408,6 @@
           <w:sz w:val="28"/>
           <w:szCs w:val="28"/>
         </w:rPr>
-        <w:lastRenderedPageBreak/>
         <w:t>Задачи:</w:t>
       </w:r>
     </w:p>
@@ -1350,33 +1686,6 @@
     </w:p>
     <w:p>
       <w:pPr>
-        <w:spacing w:line="360" w:lineRule="auto"/>
-        <w:rPr>
-          <w:sz w:val="28"/>
-          <w:szCs w:val="28"/>
-        </w:rPr>
-      </w:pPr>
-    </w:p>
-    <w:p>
-      <w:pPr>
-        <w:spacing w:line="360" w:lineRule="auto"/>
-        <w:rPr>
-          <w:sz w:val="28"/>
-          <w:szCs w:val="28"/>
-        </w:rPr>
-      </w:pPr>
-    </w:p>
-    <w:p>
-      <w:pPr>
-        <w:spacing w:line="360" w:lineRule="auto"/>
-        <w:rPr>
-          <w:sz w:val="28"/>
-          <w:szCs w:val="28"/>
-        </w:rPr>
-      </w:pPr>
-    </w:p>
-    <w:p>
-      <w:pPr>
         <w:pStyle w:val="a7"/>
         <w:numPr>
           <w:ilvl w:val="0"/>
@@ -1391,6 +1700,7 @@
           <w:szCs w:val="32"/>
         </w:rPr>
       </w:pPr>
+      <w:bookmarkStart w:id="1" w:name="_Hlk241102808"/>
       <w:r>
         <w:rPr>
           <w:b/>
@@ -1398,10 +1708,10 @@
           <w:sz w:val="32"/>
           <w:szCs w:val="32"/>
         </w:rPr>
-        <w:lastRenderedPageBreak/>
         <w:t>Исследование механизма переключения в режим ядра</w:t>
       </w:r>
     </w:p>
+    <w:bookmarkEnd w:id="1"/>
     <w:p>
       <w:pPr>
         <w:spacing w:line="360" w:lineRule="auto"/>
@@ -1779,7 +2089,15 @@
           <w:sz w:val="28"/>
           <w:szCs w:val="28"/>
         </w:rPr>
-        <w:t xml:space="preserve"> -r. Нумерация ядра происходит по следующей X-Y-Z схеме: X - номер версии, Y - мажорный номер версии, Z - патч. </w:t>
+        <w:t xml:space="preserve"> -r. Нумерация ядра происходит по следующей X-</w:t>
+      </w:r>
+      <w:r>
+        <w:rPr>
+          <w:sz w:val="28"/>
+          <w:szCs w:val="28"/>
+        </w:rPr>
+        <w:lastRenderedPageBreak/>
+        <w:t xml:space="preserve">Y-Z схеме: X - номер версии, Y - мажорный номер версии, Z - патч. </w:t>
       </w:r>
       <w:r>
         <w:rPr>
@@ -1873,15 +2191,7 @@
           <w:sz w:val="28"/>
           <w:szCs w:val="28"/>
         </w:rPr>
-        <w:t xml:space="preserve">ользовательским программам регулярно требуется доступ к ресурсам, управляемым ядром: файлам, сетевым соединениям, устройствам. Для этого </w:t>
-      </w:r>
-      <w:r>
-        <w:rPr>
-          <w:sz w:val="28"/>
-          <w:szCs w:val="28"/>
-        </w:rPr>
-        <w:lastRenderedPageBreak/>
-        <w:t>механизм системных вызовов</w:t>
+        <w:t>ользовательским программам регулярно требуется доступ к ресурсам, управляемым ядром: файлам, сетевым соединениям, устройствам. Для этого механизм системных вызовов</w:t>
       </w:r>
       <w:r>
         <w:rPr>
@@ -1936,23 +2246,11 @@
     <w:p>
       <w:pPr>
         <w:spacing w:line="360" w:lineRule="auto"/>
-        <w:ind w:left="708"/>
-        <w:jc w:val="both"/>
-        <w:rPr>
-          <w:sz w:val="28"/>
-          <w:szCs w:val="28"/>
-        </w:rPr>
-      </w:pPr>
-    </w:p>
-    <w:p>
-      <w:pPr>
-        <w:spacing w:line="360" w:lineRule="auto"/>
         <w:ind w:firstLine="708"/>
         <w:jc w:val="both"/>
         <w:rPr>
           <w:sz w:val="28"/>
           <w:szCs w:val="28"/>
-          <w:lang w:val="en-US"/>
         </w:rPr>
       </w:pPr>
       <w:r>
@@ -1994,6 +2292,7 @@
           <w:szCs w:val="28"/>
           <w:lang w:val="en-US"/>
         </w:rPr>
+        <w:lastRenderedPageBreak/>
         <w:drawing>
           <wp:inline distT="0" distB="0" distL="0" distR="0" wp14:anchorId="4A562D2F" wp14:editId="2D386938">
             <wp:extent cx="4412098" cy="5882640"/>
@@ -2063,45 +2362,861 @@
           <w:sz w:val="28"/>
           <w:szCs w:val="28"/>
         </w:rPr>
+        <w:t>П</w:t>
+      </w:r>
+      <w:r>
+        <w:rPr>
+          <w:sz w:val="28"/>
+          <w:szCs w:val="28"/>
+        </w:rPr>
+        <w:t xml:space="preserve">оследовательность обращений, порождаемых командой чтения файла утилитой </w:t>
+      </w:r>
+      <w:proofErr w:type="spellStart"/>
+      <w:r>
+        <w:rPr>
+          <w:sz w:val="28"/>
+          <w:szCs w:val="28"/>
+        </w:rPr>
+        <w:t>cat</w:t>
+      </w:r>
+      <w:proofErr w:type="spellEnd"/>
+      <w:r>
+        <w:rPr>
+          <w:sz w:val="28"/>
+          <w:szCs w:val="28"/>
+        </w:rPr>
+        <w:t xml:space="preserve"> показана на </w:t>
+      </w:r>
+      <w:r>
+        <w:rPr>
+          <w:sz w:val="28"/>
+          <w:szCs w:val="28"/>
+        </w:rPr>
+        <w:t>[</w:t>
+      </w:r>
+      <w:r>
+        <w:rPr>
+          <w:sz w:val="28"/>
+          <w:szCs w:val="28"/>
+        </w:rPr>
+        <w:t>Рисунок 2</w:t>
+      </w:r>
+      <w:r>
+        <w:rPr>
+          <w:sz w:val="28"/>
+          <w:szCs w:val="28"/>
+        </w:rPr>
+        <w:t>]</w:t>
+      </w:r>
+      <w:r>
+        <w:rPr>
+          <w:sz w:val="28"/>
+          <w:szCs w:val="28"/>
+        </w:rPr>
+        <w:t>.</w:t>
+      </w:r>
+    </w:p>
+    <w:p>
+      <w:pPr>
+        <w:spacing w:line="360" w:lineRule="auto"/>
+        <w:ind w:firstLine="708"/>
+        <w:jc w:val="both"/>
+        <w:rPr>
+          <w:sz w:val="28"/>
+          <w:szCs w:val="28"/>
+        </w:rPr>
+      </w:pPr>
+      <w:r>
+        <w:rPr>
+          <w:sz w:val="28"/>
+          <w:szCs w:val="28"/>
+        </w:rPr>
+        <w:t xml:space="preserve">Когда пользователь вводит команду в командной оболочке </w:t>
+      </w:r>
+      <w:proofErr w:type="spellStart"/>
+      <w:r>
+        <w:rPr>
+          <w:sz w:val="28"/>
+          <w:szCs w:val="28"/>
+        </w:rPr>
+        <w:t>bash</w:t>
+      </w:r>
+      <w:proofErr w:type="spellEnd"/>
+      <w:r>
+        <w:rPr>
+          <w:sz w:val="28"/>
+          <w:szCs w:val="28"/>
+        </w:rPr>
+        <w:t xml:space="preserve">, оболочка запускает программу </w:t>
+      </w:r>
+      <w:proofErr w:type="spellStart"/>
+      <w:r>
+        <w:rPr>
+          <w:sz w:val="28"/>
+          <w:szCs w:val="28"/>
+        </w:rPr>
+        <w:t>cat</w:t>
+      </w:r>
+      <w:proofErr w:type="spellEnd"/>
+      <w:r>
+        <w:rPr>
+          <w:sz w:val="28"/>
+          <w:szCs w:val="28"/>
+        </w:rPr>
+        <w:t xml:space="preserve">. Для того чтобы прочитать содержимое файла и вывести его на экран, программа </w:t>
+      </w:r>
+      <w:proofErr w:type="spellStart"/>
+      <w:r>
+        <w:rPr>
+          <w:sz w:val="28"/>
+          <w:szCs w:val="28"/>
+        </w:rPr>
+        <w:t>cat</w:t>
+      </w:r>
+      <w:proofErr w:type="spellEnd"/>
+      <w:r>
+        <w:rPr>
+          <w:sz w:val="28"/>
+          <w:szCs w:val="28"/>
+        </w:rPr>
+        <w:t xml:space="preserve"> не может напрямую обратиться к диску или терминалу — эти ресурсы находятся под управлением ядра. Вместо этого она обращается к ядру через системные вызовы: </w:t>
+      </w:r>
+      <w:proofErr w:type="spellStart"/>
+      <w:r>
+        <w:rPr>
+          <w:sz w:val="28"/>
+          <w:szCs w:val="28"/>
+        </w:rPr>
+        <w:t>open</w:t>
+      </w:r>
+      <w:proofErr w:type="spellEnd"/>
+      <w:r>
+        <w:rPr>
+          <w:sz w:val="28"/>
+          <w:szCs w:val="28"/>
+        </w:rPr>
+        <w:t xml:space="preserve"> для открытия файла, </w:t>
+      </w:r>
+      <w:proofErr w:type="spellStart"/>
+      <w:r>
+        <w:rPr>
+          <w:sz w:val="28"/>
+          <w:szCs w:val="28"/>
+        </w:rPr>
+        <w:t>read</w:t>
+      </w:r>
+      <w:proofErr w:type="spellEnd"/>
+      <w:r>
+        <w:rPr>
+          <w:sz w:val="28"/>
+          <w:szCs w:val="28"/>
+        </w:rPr>
+        <w:t xml:space="preserve"> для чтения его содержимого и </w:t>
+      </w:r>
+      <w:proofErr w:type="spellStart"/>
+      <w:r>
+        <w:rPr>
+          <w:sz w:val="28"/>
+          <w:szCs w:val="28"/>
+        </w:rPr>
+        <w:t>write</w:t>
+      </w:r>
+      <w:proofErr w:type="spellEnd"/>
+      <w:r>
+        <w:rPr>
+          <w:sz w:val="28"/>
+          <w:szCs w:val="28"/>
+        </w:rPr>
+        <w:t xml:space="preserve"> для вывода данных. Каждый из этих вызовов инициирует переход в режим ядра, после чего ядро выполняет </w:t>
+      </w:r>
+      <w:r>
+        <w:rPr>
+          <w:sz w:val="28"/>
+          <w:szCs w:val="28"/>
+        </w:rPr>
         <w:lastRenderedPageBreak/>
-        <w:t>П</w:t>
-      </w:r>
-      <w:r>
-        <w:rPr>
-          <w:sz w:val="28"/>
-          <w:szCs w:val="28"/>
-        </w:rPr>
-        <w:t xml:space="preserve">оследовательность обращений, порождаемых командой чтения файла утилитой </w:t>
+        <w:t>запрошенную операцию, взаимодействуя с файловой системой, драйвером диска и драйвером терминала.</w:t>
+      </w:r>
+    </w:p>
+    <w:p>
+      <w:pPr>
+        <w:spacing w:line="360" w:lineRule="auto"/>
+        <w:ind w:firstLine="708"/>
+        <w:jc w:val="both"/>
+        <w:rPr>
+          <w:sz w:val="28"/>
+          <w:szCs w:val="28"/>
+        </w:rPr>
+      </w:pPr>
+    </w:p>
+    <w:p>
+      <w:pPr>
+        <w:pStyle w:val="a7"/>
+        <w:numPr>
+          <w:ilvl w:val="1"/>
+          <w:numId w:val="4"/>
+        </w:numPr>
+        <w:spacing w:line="360" w:lineRule="auto"/>
+        <w:jc w:val="center"/>
+        <w:rPr>
+          <w:b/>
+          <w:bCs/>
+          <w:sz w:val="28"/>
+          <w:szCs w:val="28"/>
+        </w:rPr>
+      </w:pPr>
+      <w:r>
+        <w:rPr>
+          <w:b/>
+          <w:bCs/>
+          <w:sz w:val="28"/>
+          <w:szCs w:val="28"/>
+        </w:rPr>
+        <w:t>Передача информации о системном вызове</w:t>
+      </w:r>
+    </w:p>
+    <w:p>
+      <w:pPr>
+        <w:spacing w:line="360" w:lineRule="auto"/>
+        <w:ind w:firstLine="708"/>
+        <w:jc w:val="both"/>
+        <w:rPr>
+          <w:sz w:val="28"/>
+          <w:szCs w:val="28"/>
+        </w:rPr>
+      </w:pPr>
+      <w:r>
+        <w:rPr>
+          <w:sz w:val="28"/>
+          <w:szCs w:val="28"/>
+        </w:rPr>
+        <w:t>В архитектуре x86-64 передача информации о системном вызове происходит через регистры процессора по строго определённому соглашению</w:t>
+      </w:r>
+      <w:r>
+        <w:rPr>
+          <w:sz w:val="28"/>
+          <w:szCs w:val="28"/>
+        </w:rPr>
+        <w:t xml:space="preserve">: регистр </w:t>
+      </w:r>
+      <w:r>
+        <w:rPr>
+          <w:sz w:val="28"/>
+          <w:szCs w:val="28"/>
+          <w:lang w:val="en-US"/>
+        </w:rPr>
+        <w:t>RAX</w:t>
+      </w:r>
+      <w:r>
+        <w:rPr>
+          <w:sz w:val="28"/>
+          <w:szCs w:val="28"/>
+        </w:rPr>
+        <w:t xml:space="preserve"> содержит номер системного вызова, аргументы вызова записываются в регистры </w:t>
+      </w:r>
+      <w:r>
+        <w:rPr>
+          <w:sz w:val="28"/>
+          <w:szCs w:val="28"/>
+          <w:lang w:val="en-US"/>
+        </w:rPr>
+        <w:t>RDI</w:t>
+      </w:r>
+      <w:r>
+        <w:rPr>
+          <w:sz w:val="28"/>
+          <w:szCs w:val="28"/>
+        </w:rPr>
+        <w:t xml:space="preserve">, </w:t>
+      </w:r>
+      <w:r>
+        <w:rPr>
+          <w:sz w:val="28"/>
+          <w:szCs w:val="28"/>
+          <w:lang w:val="en-US"/>
+        </w:rPr>
+        <w:t>RSI</w:t>
+      </w:r>
+      <w:r>
+        <w:rPr>
+          <w:sz w:val="28"/>
+          <w:szCs w:val="28"/>
+        </w:rPr>
+        <w:t xml:space="preserve">, </w:t>
+      </w:r>
+      <w:r>
+        <w:rPr>
+          <w:sz w:val="28"/>
+          <w:szCs w:val="28"/>
+          <w:lang w:val="en-US"/>
+        </w:rPr>
+        <w:t>RDX</w:t>
+      </w:r>
+      <w:r>
+        <w:rPr>
+          <w:sz w:val="28"/>
+          <w:szCs w:val="28"/>
+        </w:rPr>
+        <w:t xml:space="preserve">, </w:t>
+      </w:r>
+      <w:r>
+        <w:rPr>
+          <w:sz w:val="28"/>
+          <w:szCs w:val="28"/>
+          <w:lang w:val="en-US"/>
+        </w:rPr>
+        <w:t>R</w:t>
+      </w:r>
+      <w:r>
+        <w:rPr>
+          <w:sz w:val="28"/>
+          <w:szCs w:val="28"/>
+        </w:rPr>
+        <w:t xml:space="preserve">10, </w:t>
+      </w:r>
+      <w:r>
+        <w:rPr>
+          <w:sz w:val="28"/>
+          <w:szCs w:val="28"/>
+          <w:lang w:val="en-US"/>
+        </w:rPr>
+        <w:t>R</w:t>
+      </w:r>
+      <w:r>
+        <w:rPr>
+          <w:sz w:val="28"/>
+          <w:szCs w:val="28"/>
+        </w:rPr>
+        <w:t xml:space="preserve">8, </w:t>
+      </w:r>
+      <w:r>
+        <w:rPr>
+          <w:sz w:val="28"/>
+          <w:szCs w:val="28"/>
+          <w:lang w:val="en-US"/>
+        </w:rPr>
+        <w:t>R</w:t>
+      </w:r>
+      <w:r>
+        <w:rPr>
+          <w:sz w:val="28"/>
+          <w:szCs w:val="28"/>
+        </w:rPr>
+        <w:t xml:space="preserve">9 </w:t>
+      </w:r>
+      <w:r>
+        <w:rPr>
+          <w:sz w:val="28"/>
+          <w:szCs w:val="28"/>
+        </w:rPr>
+        <w:t>–</w:t>
+      </w:r>
+      <w:r>
+        <w:rPr>
+          <w:sz w:val="28"/>
+          <w:szCs w:val="28"/>
+        </w:rPr>
+        <w:t xml:space="preserve"> </w:t>
+      </w:r>
+      <w:r>
+        <w:rPr>
+          <w:sz w:val="28"/>
+          <w:szCs w:val="28"/>
+        </w:rPr>
+        <w:t xml:space="preserve">в указанном порядке, результат выполнения возвращается в регистр </w:t>
+      </w:r>
+      <w:r>
+        <w:rPr>
+          <w:sz w:val="28"/>
+          <w:szCs w:val="28"/>
+          <w:lang w:val="en-US"/>
+        </w:rPr>
+        <w:t>RAX</w:t>
+      </w:r>
+      <w:r>
+        <w:rPr>
+          <w:sz w:val="28"/>
+          <w:szCs w:val="28"/>
+        </w:rPr>
+        <w:t xml:space="preserve">. </w:t>
+      </w:r>
+      <w:r>
+        <w:rPr>
+          <w:sz w:val="28"/>
+          <w:szCs w:val="28"/>
+        </w:rPr>
+        <w:t>Больше шести аргументов через регистры не передают.</w:t>
+      </w:r>
+      <w:r>
+        <w:rPr>
+          <w:sz w:val="28"/>
+          <w:szCs w:val="28"/>
+        </w:rPr>
+        <w:t xml:space="preserve"> Регистр </w:t>
+      </w:r>
+      <w:r>
+        <w:rPr>
+          <w:sz w:val="28"/>
+          <w:szCs w:val="28"/>
+          <w:lang w:val="en-US"/>
+        </w:rPr>
+        <w:t>RCX</w:t>
+      </w:r>
+      <w:r>
+        <w:rPr>
+          <w:sz w:val="28"/>
+          <w:szCs w:val="28"/>
+        </w:rPr>
+        <w:t xml:space="preserve"> </w:t>
+      </w:r>
+      <w:r>
+        <w:rPr>
+          <w:sz w:val="28"/>
+          <w:szCs w:val="28"/>
+        </w:rPr>
+        <w:t xml:space="preserve">используется для хранения адреса возврата. </w:t>
+      </w:r>
+    </w:p>
+    <w:p>
+      <w:pPr>
+        <w:spacing w:line="360" w:lineRule="auto"/>
+        <w:ind w:left="708"/>
+        <w:jc w:val="both"/>
+        <w:rPr>
+          <w:sz w:val="28"/>
+          <w:szCs w:val="28"/>
+        </w:rPr>
+      </w:pPr>
+    </w:p>
+    <w:p>
+      <w:pPr>
+        <w:pStyle w:val="a7"/>
+        <w:numPr>
+          <w:ilvl w:val="1"/>
+          <w:numId w:val="4"/>
+        </w:numPr>
+        <w:spacing w:line="360" w:lineRule="auto"/>
+        <w:jc w:val="center"/>
+        <w:rPr>
+          <w:sz w:val="28"/>
+          <w:szCs w:val="28"/>
+        </w:rPr>
+      </w:pPr>
+      <w:r>
+        <w:rPr>
+          <w:b/>
+          <w:bCs/>
+          <w:sz w:val="28"/>
+          <w:szCs w:val="28"/>
+        </w:rPr>
+        <w:t xml:space="preserve">Инструкция </w:t>
       </w:r>
       <w:proofErr w:type="spellStart"/>
       <w:r>
         <w:rPr>
-          <w:sz w:val="28"/>
-          <w:szCs w:val="28"/>
-        </w:rPr>
-        <w:t>cat</w:t>
+          <w:b/>
+          <w:bCs/>
+          <w:sz w:val="28"/>
+          <w:szCs w:val="28"/>
+          <w:lang w:val="en-US"/>
+        </w:rPr>
+        <w:t>syscall</w:t>
       </w:r>
       <w:proofErr w:type="spellEnd"/>
       <w:r>
         <w:rPr>
-          <w:sz w:val="28"/>
-          <w:szCs w:val="28"/>
-        </w:rPr>
-        <w:t xml:space="preserve"> показана на </w:t>
-      </w:r>
-      <w:r>
-        <w:rPr>
-          <w:sz w:val="28"/>
-          <w:szCs w:val="28"/>
-        </w:rPr>
-        <w:t>[</w:t>
-      </w:r>
-      <w:r>
-        <w:rPr>
-          <w:sz w:val="28"/>
-          <w:szCs w:val="28"/>
-        </w:rPr>
-        <w:t>Рисунок 2</w:t>
+          <w:b/>
+          <w:bCs/>
+          <w:sz w:val="28"/>
+          <w:szCs w:val="28"/>
+        </w:rPr>
+        <w:t xml:space="preserve"> </w:t>
+      </w:r>
+      <w:r>
+        <w:rPr>
+          <w:b/>
+          <w:bCs/>
+          <w:sz w:val="28"/>
+          <w:szCs w:val="28"/>
+        </w:rPr>
+        <w:t>и переход в режим ядра</w:t>
+      </w:r>
+    </w:p>
+    <w:p>
+      <w:pPr>
+        <w:spacing w:line="360" w:lineRule="auto"/>
+        <w:ind w:firstLine="708"/>
+        <w:jc w:val="both"/>
+        <w:rPr>
+          <w:sz w:val="28"/>
+          <w:szCs w:val="28"/>
+        </w:rPr>
+      </w:pPr>
+      <w:r>
+        <w:rPr>
+          <w:sz w:val="28"/>
+          <w:szCs w:val="28"/>
+        </w:rPr>
+        <w:t xml:space="preserve">В современных системах переход в режим ядра осуществляется с помощью вызова инструкции </w:t>
+      </w:r>
+      <w:proofErr w:type="spellStart"/>
+      <w:r>
+        <w:rPr>
+          <w:sz w:val="28"/>
+          <w:szCs w:val="28"/>
+          <w:lang w:val="en-US"/>
+        </w:rPr>
+        <w:t>syscall</w:t>
+      </w:r>
+      <w:proofErr w:type="spellEnd"/>
+      <w:r>
+        <w:rPr>
+          <w:sz w:val="28"/>
+          <w:szCs w:val="28"/>
+        </w:rPr>
+        <w:t xml:space="preserve">, при выполнении которой происходит следующее: </w:t>
+      </w:r>
+    </w:p>
+    <w:p>
+      <w:pPr>
+        <w:pStyle w:val="a7"/>
+        <w:numPr>
+          <w:ilvl w:val="0"/>
+          <w:numId w:val="8"/>
+        </w:numPr>
+        <w:spacing w:line="360" w:lineRule="auto"/>
+        <w:jc w:val="both"/>
+        <w:rPr>
+          <w:sz w:val="28"/>
+          <w:szCs w:val="28"/>
+        </w:rPr>
+      </w:pPr>
+      <w:r>
+        <w:rPr>
+          <w:sz w:val="28"/>
+          <w:szCs w:val="28"/>
+        </w:rPr>
+        <w:t xml:space="preserve">сохраняется адрес возврата в регистр </w:t>
+      </w:r>
+      <w:r>
+        <w:rPr>
+          <w:sz w:val="28"/>
+          <w:szCs w:val="28"/>
+          <w:lang w:val="en-US"/>
+        </w:rPr>
+        <w:t>RCX</w:t>
+      </w:r>
+      <w:r>
+        <w:rPr>
+          <w:sz w:val="28"/>
+          <w:szCs w:val="28"/>
+        </w:rPr>
+        <w:t>;</w:t>
+      </w:r>
+    </w:p>
+    <w:p>
+      <w:pPr>
+        <w:pStyle w:val="a7"/>
+        <w:numPr>
+          <w:ilvl w:val="0"/>
+          <w:numId w:val="8"/>
+        </w:numPr>
+        <w:spacing w:line="360" w:lineRule="auto"/>
+        <w:jc w:val="both"/>
+        <w:rPr>
+          <w:sz w:val="28"/>
+          <w:szCs w:val="28"/>
+        </w:rPr>
+      </w:pPr>
+      <w:r>
+        <w:rPr>
+          <w:sz w:val="28"/>
+          <w:szCs w:val="28"/>
+        </w:rPr>
+        <w:t xml:space="preserve">сохраняет содержимое регистра флагов </w:t>
+      </w:r>
+      <w:r>
+        <w:rPr>
+          <w:sz w:val="28"/>
+          <w:szCs w:val="28"/>
+          <w:lang w:val="en-US"/>
+        </w:rPr>
+        <w:t>RFLAGS</w:t>
+      </w:r>
+      <w:r>
+        <w:rPr>
+          <w:sz w:val="28"/>
+          <w:szCs w:val="28"/>
+        </w:rPr>
+        <w:t xml:space="preserve"> </w:t>
+      </w:r>
+      <w:r>
+        <w:rPr>
+          <w:sz w:val="28"/>
+          <w:szCs w:val="28"/>
+        </w:rPr>
+        <w:t xml:space="preserve">в регистре </w:t>
+      </w:r>
+      <w:r>
+        <w:rPr>
+          <w:sz w:val="28"/>
+          <w:szCs w:val="28"/>
+          <w:lang w:val="en-US"/>
+        </w:rPr>
+        <w:t>R</w:t>
+      </w:r>
+      <w:r>
+        <w:rPr>
+          <w:sz w:val="28"/>
+          <w:szCs w:val="28"/>
+        </w:rPr>
+        <w:t>11;</w:t>
+      </w:r>
+    </w:p>
+    <w:p>
+      <w:pPr>
+        <w:pStyle w:val="a7"/>
+        <w:numPr>
+          <w:ilvl w:val="0"/>
+          <w:numId w:val="8"/>
+        </w:numPr>
+        <w:spacing w:line="360" w:lineRule="auto"/>
+        <w:jc w:val="both"/>
+        <w:rPr>
+          <w:sz w:val="28"/>
+          <w:szCs w:val="28"/>
+        </w:rPr>
+      </w:pPr>
+      <w:r>
+        <w:rPr>
+          <w:sz w:val="28"/>
+          <w:szCs w:val="28"/>
+        </w:rPr>
+        <w:t xml:space="preserve">загружает адрес точки входа в ядро из специального регистра </w:t>
+      </w:r>
+      <w:r>
+        <w:rPr>
+          <w:sz w:val="28"/>
+          <w:szCs w:val="28"/>
+          <w:lang w:val="en-US"/>
+        </w:rPr>
+        <w:t>MSR</w:t>
+      </w:r>
+      <w:r>
+        <w:rPr>
+          <w:sz w:val="28"/>
+          <w:szCs w:val="28"/>
+        </w:rPr>
+        <w:t>_</w:t>
+      </w:r>
+      <w:r>
+        <w:rPr>
+          <w:sz w:val="28"/>
+          <w:szCs w:val="28"/>
+          <w:lang w:val="en-US"/>
+        </w:rPr>
+        <w:t>LSTAR</w:t>
+      </w:r>
+      <w:r>
+        <w:rPr>
+          <w:sz w:val="28"/>
+          <w:szCs w:val="28"/>
+        </w:rPr>
+        <w:t>;</w:t>
+      </w:r>
+    </w:p>
+    <w:p>
+      <w:pPr>
+        <w:pStyle w:val="a7"/>
+        <w:numPr>
+          <w:ilvl w:val="0"/>
+          <w:numId w:val="8"/>
+        </w:numPr>
+        <w:spacing w:line="360" w:lineRule="auto"/>
+        <w:jc w:val="both"/>
+        <w:rPr>
+          <w:sz w:val="28"/>
+          <w:szCs w:val="28"/>
+        </w:rPr>
+      </w:pPr>
+      <w:r>
+        <w:rPr>
+          <w:sz w:val="28"/>
+          <w:szCs w:val="28"/>
+        </w:rPr>
+        <w:t>переключает уровень привилегий с кольца 3 на кольцо 0</w:t>
+      </w:r>
+      <w:r>
+        <w:rPr>
+          <w:sz w:val="28"/>
+          <w:szCs w:val="28"/>
+        </w:rPr>
+        <w:t>;</w:t>
+      </w:r>
+    </w:p>
+    <w:p>
+      <w:pPr>
+        <w:spacing w:line="360" w:lineRule="auto"/>
+        <w:ind w:firstLine="708"/>
+        <w:jc w:val="both"/>
+        <w:rPr>
+          <w:sz w:val="28"/>
+          <w:szCs w:val="28"/>
+        </w:rPr>
+      </w:pPr>
+      <w:r>
+        <w:rPr>
+          <w:sz w:val="28"/>
+          <w:szCs w:val="28"/>
+        </w:rPr>
+        <w:t>Адрес обработчика в регистре MSR_LSTAR заранее устанавливается ядром на этапе загрузки системы и указывает на функцию точки входа</w:t>
+      </w:r>
+      <w:r>
+        <w:rPr>
+          <w:sz w:val="28"/>
+          <w:szCs w:val="28"/>
+        </w:rPr>
+        <w:t xml:space="preserve"> в ядро: </w:t>
+      </w:r>
+      <w:r>
+        <w:rPr>
+          <w:sz w:val="28"/>
+          <w:szCs w:val="28"/>
+        </w:rPr>
+        <w:t>entry_SYSCALL_64.</w:t>
+      </w:r>
+      <w:r>
+        <w:rPr>
+          <w:sz w:val="28"/>
+          <w:szCs w:val="28"/>
+        </w:rPr>
+        <w:t xml:space="preserve"> </w:t>
+      </w:r>
+      <w:r>
+        <w:rPr>
+          <w:sz w:val="28"/>
+          <w:szCs w:val="28"/>
+        </w:rPr>
+        <w:t>Таким образом, программа не может передать управление в произвольную точку ядра</w:t>
+      </w:r>
+      <w:r>
+        <w:rPr>
+          <w:sz w:val="28"/>
+          <w:szCs w:val="28"/>
+        </w:rPr>
+        <w:t xml:space="preserve">. </w:t>
+      </w:r>
+    </w:p>
+    <w:p>
+      <w:pPr>
+        <w:spacing w:line="360" w:lineRule="auto"/>
+        <w:ind w:firstLine="708"/>
+        <w:jc w:val="both"/>
+        <w:rPr>
+          <w:sz w:val="28"/>
+          <w:szCs w:val="28"/>
+        </w:rPr>
+      </w:pPr>
+    </w:p>
+    <w:p>
+      <w:pPr>
+        <w:spacing w:line="360" w:lineRule="auto"/>
+        <w:ind w:firstLine="708"/>
+        <w:jc w:val="both"/>
+        <w:rPr>
+          <w:sz w:val="28"/>
+          <w:szCs w:val="28"/>
+        </w:rPr>
+      </w:pPr>
+    </w:p>
+    <w:p>
+      <w:pPr>
+        <w:spacing w:line="360" w:lineRule="auto"/>
+        <w:ind w:firstLine="708"/>
+        <w:jc w:val="both"/>
+        <w:rPr>
+          <w:sz w:val="28"/>
+          <w:szCs w:val="28"/>
+        </w:rPr>
+      </w:pPr>
+    </w:p>
+    <w:p>
+      <w:pPr>
+        <w:spacing w:line="360" w:lineRule="auto"/>
+        <w:ind w:firstLine="708"/>
+        <w:jc w:val="both"/>
+        <w:rPr>
+          <w:sz w:val="28"/>
+          <w:szCs w:val="28"/>
+        </w:rPr>
+      </w:pPr>
+    </w:p>
+    <w:p>
+      <w:pPr>
+        <w:spacing w:line="360" w:lineRule="auto"/>
+        <w:ind w:firstLine="708"/>
+        <w:jc w:val="both"/>
+        <w:rPr>
+          <w:sz w:val="28"/>
+          <w:szCs w:val="28"/>
+        </w:rPr>
+      </w:pPr>
+    </w:p>
+    <w:p>
+      <w:pPr>
+        <w:pStyle w:val="a7"/>
+        <w:numPr>
+          <w:ilvl w:val="1"/>
+          <w:numId w:val="4"/>
+        </w:numPr>
+        <w:spacing w:line="360" w:lineRule="auto"/>
+        <w:jc w:val="center"/>
+        <w:rPr>
+          <w:sz w:val="28"/>
+          <w:szCs w:val="28"/>
+          <w:lang w:val="en-US"/>
+        </w:rPr>
+      </w:pPr>
+      <w:r>
+        <w:rPr>
+          <w:b/>
+          <w:bCs/>
+          <w:sz w:val="28"/>
+          <w:szCs w:val="28"/>
+        </w:rPr>
+        <w:lastRenderedPageBreak/>
+        <w:t>Обработка системного вызова внутри ядра</w:t>
+      </w:r>
+    </w:p>
+    <w:p>
+      <w:pPr>
+        <w:spacing w:line="360" w:lineRule="auto"/>
+        <w:ind w:firstLine="708"/>
+        <w:rPr>
+          <w:sz w:val="28"/>
+          <w:szCs w:val="28"/>
+        </w:rPr>
+      </w:pPr>
+      <w:r>
+        <w:rPr>
+          <w:sz w:val="28"/>
+          <w:szCs w:val="28"/>
+        </w:rPr>
+        <w:t>После передачи управления в точку входа entry_SYSCALL_64 ядро выполняет следующую последовательность действий</w:t>
+      </w:r>
+      <w:r>
+        <w:rPr>
+          <w:sz w:val="28"/>
+          <w:szCs w:val="28"/>
+        </w:rPr>
+        <w:t xml:space="preserve"> [</w:t>
+      </w:r>
+      <w:r>
+        <w:rPr>
+          <w:sz w:val="28"/>
+          <w:szCs w:val="28"/>
+        </w:rPr>
+        <w:t>Рисунок 3</w:t>
       </w:r>
       <w:r>
         <w:rPr>
@@ -2115,33 +3230,328 @@
           <w:sz w:val="28"/>
           <w:szCs w:val="28"/>
         </w:rPr>
-        <w:t>.</w:t>
-      </w:r>
-    </w:p>
-    <w:p>
-      <w:pPr>
-        <w:spacing w:line="360" w:lineRule="auto"/>
-        <w:ind w:firstLine="708"/>
-        <w:jc w:val="both"/>
-        <w:rPr>
-          <w:sz w:val="28"/>
-          <w:szCs w:val="28"/>
-        </w:rPr>
-      </w:pPr>
-      <w:r>
-        <w:rPr>
-          <w:sz w:val="28"/>
-          <w:szCs w:val="28"/>
-        </w:rPr>
-        <w:t xml:space="preserve">Когда пользователь вводит команду в командной оболочке </w:t>
-      </w:r>
+        <w:t>:</w:t>
+      </w:r>
+    </w:p>
+    <w:p>
+      <w:pPr>
+        <w:pStyle w:val="a7"/>
+        <w:numPr>
+          <w:ilvl w:val="0"/>
+          <w:numId w:val="9"/>
+        </w:numPr>
+        <w:spacing w:line="360" w:lineRule="auto"/>
+        <w:rPr>
+          <w:sz w:val="28"/>
+          <w:szCs w:val="28"/>
+        </w:rPr>
+      </w:pPr>
+      <w:r>
+        <w:rPr>
+          <w:sz w:val="28"/>
+          <w:szCs w:val="28"/>
+        </w:rPr>
+        <w:t>сохранение регистров (</w:t>
+      </w:r>
+      <w:r>
+        <w:rPr>
+          <w:sz w:val="28"/>
+          <w:szCs w:val="28"/>
+          <w:lang w:val="en-US"/>
+        </w:rPr>
+        <w:t>RAX</w:t>
+      </w:r>
+      <w:r>
+        <w:rPr>
+          <w:sz w:val="28"/>
+          <w:szCs w:val="28"/>
+        </w:rPr>
+        <w:t xml:space="preserve">, </w:t>
+      </w:r>
+      <w:r>
+        <w:rPr>
+          <w:sz w:val="28"/>
+          <w:szCs w:val="28"/>
+          <w:lang w:val="en-US"/>
+        </w:rPr>
+        <w:t>RDI</w:t>
+      </w:r>
+      <w:r>
+        <w:rPr>
+          <w:sz w:val="28"/>
+          <w:szCs w:val="28"/>
+        </w:rPr>
+        <w:t xml:space="preserve">, </w:t>
+      </w:r>
+      <w:r>
+        <w:rPr>
+          <w:sz w:val="28"/>
+          <w:szCs w:val="28"/>
+          <w:lang w:val="en-US"/>
+        </w:rPr>
+        <w:t>RSI</w:t>
+      </w:r>
+      <w:r>
+        <w:rPr>
+          <w:sz w:val="28"/>
+          <w:szCs w:val="28"/>
+        </w:rPr>
+        <w:t xml:space="preserve"> и так далее)</w:t>
+      </w:r>
+      <w:r>
+        <w:rPr>
+          <w:sz w:val="28"/>
+          <w:szCs w:val="28"/>
+        </w:rPr>
+        <w:t>;</w:t>
+      </w:r>
+    </w:p>
+    <w:p>
+      <w:pPr>
+        <w:pStyle w:val="a7"/>
+        <w:numPr>
+          <w:ilvl w:val="0"/>
+          <w:numId w:val="9"/>
+        </w:numPr>
+        <w:spacing w:line="360" w:lineRule="auto"/>
+        <w:rPr>
+          <w:sz w:val="28"/>
+          <w:szCs w:val="28"/>
+        </w:rPr>
+      </w:pPr>
+      <w:r>
+        <w:rPr>
+          <w:sz w:val="28"/>
+          <w:szCs w:val="28"/>
+        </w:rPr>
+        <w:t>переключение на стек ядра</w:t>
+      </w:r>
+      <w:r>
+        <w:rPr>
+          <w:sz w:val="28"/>
+          <w:szCs w:val="28"/>
+          <w:lang w:val="en-US"/>
+        </w:rPr>
+        <w:t>;</w:t>
+      </w:r>
+    </w:p>
+    <w:p>
+      <w:pPr>
+        <w:pStyle w:val="a7"/>
+        <w:numPr>
+          <w:ilvl w:val="0"/>
+          <w:numId w:val="9"/>
+        </w:numPr>
+        <w:spacing w:line="360" w:lineRule="auto"/>
+        <w:rPr>
+          <w:sz w:val="28"/>
+          <w:szCs w:val="28"/>
+        </w:rPr>
+      </w:pPr>
+      <w:r>
+        <w:rPr>
+          <w:sz w:val="28"/>
+          <w:szCs w:val="28"/>
+        </w:rPr>
+        <w:t xml:space="preserve">проверяет и извлекает номер системного вызова из регистра </w:t>
+      </w:r>
+      <w:r>
+        <w:rPr>
+          <w:sz w:val="28"/>
+          <w:szCs w:val="28"/>
+          <w:lang w:val="en-US"/>
+        </w:rPr>
+        <w:t>RAX</w:t>
+      </w:r>
+      <w:r>
+        <w:rPr>
+          <w:sz w:val="28"/>
+          <w:szCs w:val="28"/>
+        </w:rPr>
+        <w:t>;</w:t>
+      </w:r>
+    </w:p>
+    <w:p>
+      <w:pPr>
+        <w:pStyle w:val="a7"/>
+        <w:numPr>
+          <w:ilvl w:val="0"/>
+          <w:numId w:val="9"/>
+        </w:numPr>
+        <w:spacing w:line="360" w:lineRule="auto"/>
+        <w:rPr>
+          <w:sz w:val="28"/>
+          <w:szCs w:val="28"/>
+        </w:rPr>
+      </w:pPr>
+      <w:r>
+        <w:rPr>
+          <w:sz w:val="28"/>
+          <w:szCs w:val="28"/>
+        </w:rPr>
+        <w:t xml:space="preserve">поиск обработчика по таблице </w:t>
+      </w:r>
+      <w:r>
+        <w:rPr>
+          <w:sz w:val="28"/>
+          <w:szCs w:val="28"/>
+          <w:lang w:val="en-US"/>
+        </w:rPr>
+        <w:t>sys</w:t>
+      </w:r>
+      <w:r>
+        <w:rPr>
+          <w:sz w:val="28"/>
+          <w:szCs w:val="28"/>
+        </w:rPr>
+        <w:t>_</w:t>
+      </w:r>
+      <w:r>
+        <w:rPr>
+          <w:sz w:val="28"/>
+          <w:szCs w:val="28"/>
+          <w:lang w:val="en-US"/>
+        </w:rPr>
+        <w:t>call</w:t>
+      </w:r>
+      <w:r>
+        <w:rPr>
+          <w:sz w:val="28"/>
+          <w:szCs w:val="28"/>
+        </w:rPr>
+        <w:t>_</w:t>
+      </w:r>
+      <w:r>
+        <w:rPr>
+          <w:sz w:val="28"/>
+          <w:szCs w:val="28"/>
+          <w:lang w:val="en-US"/>
+        </w:rPr>
+        <w:t>table</w:t>
+      </w:r>
+      <w:r>
+        <w:rPr>
+          <w:sz w:val="28"/>
+          <w:szCs w:val="28"/>
+        </w:rPr>
+        <w:t>;</w:t>
+      </w:r>
+    </w:p>
+    <w:p>
+      <w:pPr>
+        <w:pStyle w:val="a7"/>
+        <w:numPr>
+          <w:ilvl w:val="0"/>
+          <w:numId w:val="9"/>
+        </w:numPr>
+        <w:spacing w:line="360" w:lineRule="auto"/>
+        <w:rPr>
+          <w:sz w:val="28"/>
+          <w:szCs w:val="28"/>
+        </w:rPr>
+      </w:pPr>
+      <w:r>
+        <w:rPr>
+          <w:sz w:val="28"/>
+          <w:szCs w:val="28"/>
+        </w:rPr>
+        <w:t>запуск обработчика с аргументами (</w:t>
+      </w:r>
+      <w:r>
+        <w:rPr>
+          <w:sz w:val="28"/>
+          <w:szCs w:val="28"/>
+          <w:lang w:val="en-US"/>
+        </w:rPr>
+        <w:t>RDI</w:t>
+      </w:r>
+      <w:r>
+        <w:rPr>
+          <w:sz w:val="28"/>
+          <w:szCs w:val="28"/>
+        </w:rPr>
+        <w:t xml:space="preserve">, </w:t>
+      </w:r>
+      <w:r>
+        <w:rPr>
+          <w:sz w:val="28"/>
+          <w:szCs w:val="28"/>
+          <w:lang w:val="en-US"/>
+        </w:rPr>
+        <w:t>RSI</w:t>
+      </w:r>
+      <w:r>
+        <w:rPr>
+          <w:sz w:val="28"/>
+          <w:szCs w:val="28"/>
+        </w:rPr>
+        <w:t xml:space="preserve"> </w:t>
+      </w:r>
+      <w:r>
+        <w:rPr>
+          <w:sz w:val="28"/>
+          <w:szCs w:val="28"/>
+        </w:rPr>
+        <w:t>и так далее)</w:t>
+      </w:r>
+      <w:r>
+        <w:rPr>
+          <w:sz w:val="28"/>
+          <w:szCs w:val="28"/>
+        </w:rPr>
+        <w:t>;</w:t>
+      </w:r>
+    </w:p>
+    <w:p>
+      <w:pPr>
+        <w:pStyle w:val="a7"/>
+        <w:numPr>
+          <w:ilvl w:val="0"/>
+          <w:numId w:val="9"/>
+        </w:numPr>
+        <w:spacing w:line="360" w:lineRule="auto"/>
+        <w:rPr>
+          <w:sz w:val="28"/>
+          <w:szCs w:val="28"/>
+        </w:rPr>
+      </w:pPr>
+      <w:r>
+        <w:rPr>
+          <w:sz w:val="28"/>
+          <w:szCs w:val="28"/>
+        </w:rPr>
+        <w:t xml:space="preserve">запись результата в </w:t>
+      </w:r>
+      <w:r>
+        <w:rPr>
+          <w:sz w:val="28"/>
+          <w:szCs w:val="28"/>
+          <w:lang w:val="en-US"/>
+        </w:rPr>
+        <w:t>RAX;</w:t>
+      </w:r>
+    </w:p>
+    <w:p>
+      <w:pPr>
+        <w:pStyle w:val="a7"/>
+        <w:numPr>
+          <w:ilvl w:val="0"/>
+          <w:numId w:val="9"/>
+        </w:numPr>
+        <w:spacing w:line="360" w:lineRule="auto"/>
+        <w:rPr>
+          <w:sz w:val="28"/>
+          <w:szCs w:val="28"/>
+        </w:rPr>
+      </w:pPr>
       <w:proofErr w:type="spellStart"/>
       <w:r>
         <w:rPr>
           <w:sz w:val="28"/>
           <w:szCs w:val="28"/>
-        </w:rPr>
-        <w:t>bash</w:t>
+          <w:lang w:val="en-US"/>
+        </w:rPr>
+        <w:t>sysret</w:t>
       </w:r>
       <w:proofErr w:type="spellEnd"/>
       <w:r>
@@ -2149,105 +3559,159 @@
           <w:sz w:val="28"/>
           <w:szCs w:val="28"/>
         </w:rPr>
-        <w:t xml:space="preserve">, оболочка запускает программу </w:t>
-      </w:r>
-      <w:proofErr w:type="spellStart"/>
-      <w:r>
-        <w:rPr>
-          <w:sz w:val="28"/>
-          <w:szCs w:val="28"/>
-        </w:rPr>
-        <w:t>cat</w:t>
-      </w:r>
-      <w:proofErr w:type="spellEnd"/>
-      <w:r>
-        <w:rPr>
-          <w:sz w:val="28"/>
-          <w:szCs w:val="28"/>
-        </w:rPr>
-        <w:t xml:space="preserve">. Для того чтобы прочитать содержимое файла и вывести его на экран, программа </w:t>
-      </w:r>
-      <w:proofErr w:type="spellStart"/>
-      <w:r>
-        <w:rPr>
-          <w:sz w:val="28"/>
-          <w:szCs w:val="28"/>
-        </w:rPr>
-        <w:t>cat</w:t>
-      </w:r>
-      <w:proofErr w:type="spellEnd"/>
-      <w:r>
-        <w:rPr>
-          <w:sz w:val="28"/>
-          <w:szCs w:val="28"/>
-        </w:rPr>
-        <w:t xml:space="preserve"> не может напрямую обратиться к диску или терминалу — эти ресурсы находятся под управлением ядра. Вместо этого она обращается к ядру через системные вызовы: </w:t>
-      </w:r>
-      <w:proofErr w:type="spellStart"/>
-      <w:r>
-        <w:rPr>
-          <w:sz w:val="28"/>
-          <w:szCs w:val="28"/>
-        </w:rPr>
-        <w:t>open</w:t>
-      </w:r>
-      <w:proofErr w:type="spellEnd"/>
-      <w:r>
-        <w:rPr>
-          <w:sz w:val="28"/>
-          <w:szCs w:val="28"/>
-        </w:rPr>
-        <w:t xml:space="preserve"> для открытия файла, </w:t>
-      </w:r>
-      <w:proofErr w:type="spellStart"/>
-      <w:r>
-        <w:rPr>
-          <w:sz w:val="28"/>
-          <w:szCs w:val="28"/>
+        <w:t xml:space="preserve"> – ядро восстанавливает контекст процесса и возвращает управление в кольцо 3</w:t>
+      </w:r>
+      <w:r>
+        <w:rPr>
+          <w:sz w:val="28"/>
+          <w:szCs w:val="28"/>
+        </w:rPr>
+        <w:t>;</w:t>
+      </w:r>
+    </w:p>
+    <w:p>
+      <w:pPr>
+        <w:spacing w:line="360" w:lineRule="auto"/>
+        <w:jc w:val="center"/>
+        <w:rPr>
+          <w:sz w:val="28"/>
+          <w:szCs w:val="28"/>
+        </w:rPr>
+      </w:pPr>
+      <w:r>
+        <w:rPr>
+          <w:noProof/>
+        </w:rPr>
+        <w:drawing>
+          <wp:inline distT="0" distB="0" distL="0" distR="0" wp14:anchorId="1E1BBD55" wp14:editId="5938DC40">
+            <wp:extent cx="2715260" cy="5334000"/>
+            <wp:effectExtent l="0" t="0" r="8890" b="0"/>
+            <wp:docPr id="3" name="Рисунок 3" descr="Anatomy of a system call, part 1 [LWN.net]"/>
+            <wp:cNvGraphicFramePr>
+              <a:graphicFrameLocks xmlns:a="http://schemas.openxmlformats.org/drawingml/2006/main" noChangeAspect="1"/>
+            </wp:cNvGraphicFramePr>
+            <a:graphic xmlns:a="http://schemas.openxmlformats.org/drawingml/2006/main">
+              <a:graphicData uri="http://schemas.openxmlformats.org/drawingml/2006/picture">
+                <pic:pic xmlns:pic="http://schemas.openxmlformats.org/drawingml/2006/picture">
+                  <pic:nvPicPr>
+                    <pic:cNvPr id="0" name="Picture 3" descr="Anatomy of a system call, part 1 [LWN.net]"/>
+                    <pic:cNvPicPr>
+                      <a:picLocks noChangeAspect="1" noChangeArrowheads="1"/>
+                    </pic:cNvPicPr>
+                  </pic:nvPicPr>
+                  <pic:blipFill>
+                    <a:blip r:embed="rId9">
+                      <a:extLst>
+                        <a:ext uri="{28A0092B-C50C-407E-A947-70E740481C1C}">
+                          <a14:useLocalDpi xmlns:a14="http://schemas.microsoft.com/office/drawing/2010/main" val="0"/>
+                        </a:ext>
+                      </a:extLst>
+                    </a:blip>
+                    <a:srcRect/>
+                    <a:stretch>
+                      <a:fillRect/>
+                    </a:stretch>
+                  </pic:blipFill>
+                  <pic:spPr bwMode="auto">
+                    <a:xfrm>
+                      <a:off x="0" y="0"/>
+                      <a:ext cx="2715260" cy="5334000"/>
+                    </a:xfrm>
+                    <a:prstGeom prst="rect">
+                      <a:avLst/>
+                    </a:prstGeom>
+                    <a:noFill/>
+                    <a:ln>
+                      <a:noFill/>
+                    </a:ln>
+                  </pic:spPr>
+                </pic:pic>
+              </a:graphicData>
+            </a:graphic>
+          </wp:inline>
+        </w:drawing>
+      </w:r>
+    </w:p>
+    <w:p>
+      <w:pPr>
+        <w:spacing w:line="360" w:lineRule="auto"/>
+        <w:jc w:val="center"/>
+        <w:rPr>
+          <w:sz w:val="28"/>
+          <w:szCs w:val="28"/>
+        </w:rPr>
+      </w:pPr>
+      <w:r>
+        <w:rPr>
+          <w:sz w:val="28"/>
+          <w:szCs w:val="28"/>
+        </w:rPr>
+        <w:t xml:space="preserve">Рисунок 3. Путь системного вызова </w:t>
+      </w:r>
+      <w:r>
+        <w:rPr>
+          <w:sz w:val="28"/>
+          <w:szCs w:val="28"/>
+          <w:lang w:val="en-US"/>
         </w:rPr>
         <w:t>read</w:t>
       </w:r>
-      <w:proofErr w:type="spellEnd"/>
-      <w:r>
-        <w:rPr>
-          <w:sz w:val="28"/>
-          <w:szCs w:val="28"/>
-        </w:rPr>
-        <w:t xml:space="preserve"> для чтения его содержимого и </w:t>
-      </w:r>
-      <w:proofErr w:type="spellStart"/>
-      <w:r>
-        <w:rPr>
-          <w:sz w:val="28"/>
-          <w:szCs w:val="28"/>
-        </w:rPr>
-        <w:t>write</w:t>
-      </w:r>
-      <w:proofErr w:type="spellEnd"/>
-      <w:r>
-        <w:rPr>
-          <w:sz w:val="28"/>
-          <w:szCs w:val="28"/>
-        </w:rPr>
-        <w:t xml:space="preserve"> для вывода данных. Каждый из этих вызовов инициирует переход в режим ядра, после чего ядро выполняет запрошенную операцию, взаимодействуя с файловой системой, драйвером диска и драйвером терминала.</w:t>
-      </w:r>
-    </w:p>
-    <w:p>
-      <w:pPr>
-        <w:spacing w:line="360" w:lineRule="auto"/>
-        <w:ind w:firstLine="708"/>
-        <w:jc w:val="both"/>
-        <w:rPr>
-          <w:sz w:val="28"/>
-          <w:szCs w:val="28"/>
-        </w:rPr>
-      </w:pPr>
-    </w:p>
-    <w:p>
-      <w:pPr>
-        <w:spacing w:line="360" w:lineRule="auto"/>
-        <w:ind w:left="708"/>
-        <w:jc w:val="both"/>
+      <w:r>
+        <w:rPr>
+          <w:sz w:val="28"/>
+          <w:szCs w:val="28"/>
+        </w:rPr>
+        <w:t xml:space="preserve"> </w:t>
+      </w:r>
+      <w:r>
+        <w:rPr>
+          <w:sz w:val="28"/>
+          <w:szCs w:val="28"/>
+        </w:rPr>
+        <w:t xml:space="preserve">от </w:t>
+      </w:r>
+      <w:r>
+        <w:rPr>
+          <w:sz w:val="28"/>
+          <w:szCs w:val="28"/>
+          <w:lang w:val="en-US"/>
+        </w:rPr>
+        <w:t>user</w:t>
+      </w:r>
+      <w:r>
+        <w:rPr>
+          <w:sz w:val="28"/>
+          <w:szCs w:val="28"/>
+        </w:rPr>
+        <w:t xml:space="preserve"> </w:t>
+      </w:r>
+      <w:r>
+        <w:rPr>
+          <w:sz w:val="28"/>
+          <w:szCs w:val="28"/>
+          <w:lang w:val="en-US"/>
+        </w:rPr>
+        <w:t>space</w:t>
+      </w:r>
+      <w:r>
+        <w:rPr>
+          <w:sz w:val="28"/>
+          <w:szCs w:val="28"/>
+        </w:rPr>
+        <w:t xml:space="preserve"> </w:t>
+      </w:r>
+      <w:r>
+        <w:rPr>
+          <w:sz w:val="28"/>
+          <w:szCs w:val="28"/>
+        </w:rPr>
+        <w:t>до обработчика в ядре</w:t>
+      </w:r>
+    </w:p>
+    <w:p>
+      <w:pPr>
+        <w:spacing w:line="360" w:lineRule="auto"/>
+        <w:jc w:val="center"/>
         <w:rPr>
           <w:sz w:val="28"/>
           <w:szCs w:val="28"/>
@@ -2255,7 +3719,7 @@
       </w:pPr>
     </w:p>
     <w:sectPr>
-      <w:footerReference w:type="default" r:id="rId9"/>
+      <w:footerReference w:type="default" r:id="rId10"/>
       <w:pgSz w:w="11906" w:h="16838"/>
       <w:pgMar w:top="1134" w:right="850" w:bottom="1134" w:left="1701" w:header="708" w:footer="708" w:gutter="0"/>
       <w:cols w:space="708"/>
@@ -2470,6 +3934,95 @@
     </w:lvl>
   </w:abstractNum>
   <w:abstractNum w:abstractNumId="1" w15:restartNumberingAfterBreak="0">
+    <w:nsid w:val="03353E68"/>
+    <w:multiLevelType w:val="hybridMultilevel"/>
+    <w:tmpl w:val="E3E6899C"/>
+    <w:lvl w:ilvl="0" w:tplc="0419000F">
+      <w:start w:val="1"/>
+      <w:numFmt w:val="decimal"/>
+      <w:lvlText w:val="%1."/>
+      <w:lvlJc w:val="left"/>
+      <w:pPr>
+        <w:ind w:left="720" w:hanging="360"/>
+      </w:pPr>
+      <w:rPr>
+        <w:rFonts w:hint="default"/>
+      </w:rPr>
+    </w:lvl>
+    <w:lvl w:ilvl="1" w:tplc="04190019" w:tentative="1">
+      <w:start w:val="1"/>
+      <w:numFmt w:val="lowerLetter"/>
+      <w:lvlText w:val="%2."/>
+      <w:lvlJc w:val="left"/>
+      <w:pPr>
+        <w:ind w:left="1440" w:hanging="360"/>
+      </w:pPr>
+    </w:lvl>
+    <w:lvl w:ilvl="2" w:tplc="0419001B" w:tentative="1">
+      <w:start w:val="1"/>
+      <w:numFmt w:val="lowerRoman"/>
+      <w:lvlText w:val="%3."/>
+      <w:lvlJc w:val="right"/>
+      <w:pPr>
+        <w:ind w:left="2160" w:hanging="180"/>
+      </w:pPr>
+    </w:lvl>
+    <w:lvl w:ilvl="3" w:tplc="0419000F" w:tentative="1">
+      <w:start w:val="1"/>
+      <w:numFmt w:val="decimal"/>
+      <w:lvlText w:val="%4."/>
+      <w:lvlJc w:val="left"/>
+      <w:pPr>
+        <w:ind w:left="2880" w:hanging="360"/>
+      </w:pPr>
+    </w:lvl>
+    <w:lvl w:ilvl="4" w:tplc="04190019" w:tentative="1">
+      <w:start w:val="1"/>
+      <w:numFmt w:val="lowerLetter"/>
+      <w:lvlText w:val="%5."/>
+      <w:lvlJc w:val="left"/>
+      <w:pPr>
+        <w:ind w:left="3600" w:hanging="360"/>
+      </w:pPr>
+    </w:lvl>
+    <w:lvl w:ilvl="5" w:tplc="0419001B" w:tentative="1">
+      <w:start w:val="1"/>
+      <w:numFmt w:val="lowerRoman"/>
+      <w:lvlText w:val="%6."/>
+      <w:lvlJc w:val="right"/>
+      <w:pPr>
+        <w:ind w:left="4320" w:hanging="180"/>
+      </w:pPr>
+    </w:lvl>
+    <w:lvl w:ilvl="6" w:tplc="0419000F" w:tentative="1">
+      <w:start w:val="1"/>
+      <w:numFmt w:val="decimal"/>
+      <w:lvlText w:val="%7."/>
+      <w:lvlJc w:val="left"/>
+      <w:pPr>
+        <w:ind w:left="5040" w:hanging="360"/>
+      </w:pPr>
+    </w:lvl>
+    <w:lvl w:ilvl="7" w:tplc="04190019" w:tentative="1">
+      <w:start w:val="1"/>
+      <w:numFmt w:val="lowerLetter"/>
+      <w:lvlText w:val="%8."/>
+      <w:lvlJc w:val="left"/>
+      <w:pPr>
+        <w:ind w:left="5760" w:hanging="360"/>
+      </w:pPr>
+    </w:lvl>
+    <w:lvl w:ilvl="8" w:tplc="0419001B" w:tentative="1">
+      <w:start w:val="1"/>
+      <w:numFmt w:val="lowerRoman"/>
+      <w:lvlText w:val="%9."/>
+      <w:lvlJc w:val="right"/>
+      <w:pPr>
+        <w:ind w:left="6480" w:hanging="180"/>
+      </w:pPr>
+    </w:lvl>
+  </w:abstractNum>
+  <w:abstractNum w:abstractNumId="2" w15:restartNumberingAfterBreak="0">
     <w:nsid w:val="07882522"/>
     <w:multiLevelType w:val="hybridMultilevel"/>
     <w:tmpl w:val="1EA89C2E"/>
@@ -2558,7 +4111,185 @@
       </w:pPr>
     </w:lvl>
   </w:abstractNum>
-  <w:abstractNum w:abstractNumId="2" w15:restartNumberingAfterBreak="0">
+  <w:abstractNum w:abstractNumId="3" w15:restartNumberingAfterBreak="0">
+    <w:nsid w:val="0A366A38"/>
+    <w:multiLevelType w:val="hybridMultilevel"/>
+    <w:tmpl w:val="99EEB9B8"/>
+    <w:lvl w:ilvl="0" w:tplc="0419000F">
+      <w:start w:val="1"/>
+      <w:numFmt w:val="decimal"/>
+      <w:lvlText w:val="%1."/>
+      <w:lvlJc w:val="left"/>
+      <w:pPr>
+        <w:ind w:left="720" w:hanging="360"/>
+      </w:pPr>
+      <w:rPr>
+        <w:rFonts w:hint="default"/>
+      </w:rPr>
+    </w:lvl>
+    <w:lvl w:ilvl="1" w:tplc="04190019" w:tentative="1">
+      <w:start w:val="1"/>
+      <w:numFmt w:val="lowerLetter"/>
+      <w:lvlText w:val="%2."/>
+      <w:lvlJc w:val="left"/>
+      <w:pPr>
+        <w:ind w:left="1440" w:hanging="360"/>
+      </w:pPr>
+    </w:lvl>
+    <w:lvl w:ilvl="2" w:tplc="0419001B" w:tentative="1">
+      <w:start w:val="1"/>
+      <w:numFmt w:val="lowerRoman"/>
+      <w:lvlText w:val="%3."/>
+      <w:lvlJc w:val="right"/>
+      <w:pPr>
+        <w:ind w:left="2160" w:hanging="180"/>
+      </w:pPr>
+    </w:lvl>
+    <w:lvl w:ilvl="3" w:tplc="0419000F" w:tentative="1">
+      <w:start w:val="1"/>
+      <w:numFmt w:val="decimal"/>
+      <w:lvlText w:val="%4."/>
+      <w:lvlJc w:val="left"/>
+      <w:pPr>
+        <w:ind w:left="2880" w:hanging="360"/>
+      </w:pPr>
+    </w:lvl>
+    <w:lvl w:ilvl="4" w:tplc="04190019" w:tentative="1">
+      <w:start w:val="1"/>
+      <w:numFmt w:val="lowerLetter"/>
+      <w:lvlText w:val="%5."/>
+      <w:lvlJc w:val="left"/>
+      <w:pPr>
+        <w:ind w:left="3600" w:hanging="360"/>
+      </w:pPr>
+    </w:lvl>
+    <w:lvl w:ilvl="5" w:tplc="0419001B" w:tentative="1">
+      <w:start w:val="1"/>
+      <w:numFmt w:val="lowerRoman"/>
+      <w:lvlText w:val="%6."/>
+      <w:lvlJc w:val="right"/>
+      <w:pPr>
+        <w:ind w:left="4320" w:hanging="180"/>
+      </w:pPr>
+    </w:lvl>
+    <w:lvl w:ilvl="6" w:tplc="0419000F" w:tentative="1">
+      <w:start w:val="1"/>
+      <w:numFmt w:val="decimal"/>
+      <w:lvlText w:val="%7."/>
+      <w:lvlJc w:val="left"/>
+      <w:pPr>
+        <w:ind w:left="5040" w:hanging="360"/>
+      </w:pPr>
+    </w:lvl>
+    <w:lvl w:ilvl="7" w:tplc="04190019" w:tentative="1">
+      <w:start w:val="1"/>
+      <w:numFmt w:val="lowerLetter"/>
+      <w:lvlText w:val="%8."/>
+      <w:lvlJc w:val="left"/>
+      <w:pPr>
+        <w:ind w:left="5760" w:hanging="360"/>
+      </w:pPr>
+    </w:lvl>
+    <w:lvl w:ilvl="8" w:tplc="0419001B" w:tentative="1">
+      <w:start w:val="1"/>
+      <w:numFmt w:val="lowerRoman"/>
+      <w:lvlText w:val="%9."/>
+      <w:lvlJc w:val="right"/>
+      <w:pPr>
+        <w:ind w:left="6480" w:hanging="180"/>
+      </w:pPr>
+    </w:lvl>
+  </w:abstractNum>
+  <w:abstractNum w:abstractNumId="4" w15:restartNumberingAfterBreak="0">
+    <w:nsid w:val="10455378"/>
+    <w:multiLevelType w:val="hybridMultilevel"/>
+    <w:tmpl w:val="18D29504"/>
+    <w:lvl w:ilvl="0" w:tplc="3FA63022">
+      <w:start w:val="1"/>
+      <w:numFmt w:val="decimal"/>
+      <w:lvlText w:val="%1."/>
+      <w:lvlJc w:val="left"/>
+      <w:pPr>
+        <w:ind w:left="1068" w:hanging="360"/>
+      </w:pPr>
+      <w:rPr>
+        <w:rFonts w:hint="default"/>
+      </w:rPr>
+    </w:lvl>
+    <w:lvl w:ilvl="1" w:tplc="04190019" w:tentative="1">
+      <w:start w:val="1"/>
+      <w:numFmt w:val="lowerLetter"/>
+      <w:lvlText w:val="%2."/>
+      <w:lvlJc w:val="left"/>
+      <w:pPr>
+        <w:ind w:left="1788" w:hanging="360"/>
+      </w:pPr>
+    </w:lvl>
+    <w:lvl w:ilvl="2" w:tplc="0419001B" w:tentative="1">
+      <w:start w:val="1"/>
+      <w:numFmt w:val="lowerRoman"/>
+      <w:lvlText w:val="%3."/>
+      <w:lvlJc w:val="right"/>
+      <w:pPr>
+        <w:ind w:left="2508" w:hanging="180"/>
+      </w:pPr>
+    </w:lvl>
+    <w:lvl w:ilvl="3" w:tplc="0419000F" w:tentative="1">
+      <w:start w:val="1"/>
+      <w:numFmt w:val="decimal"/>
+      <w:lvlText w:val="%4."/>
+      <w:lvlJc w:val="left"/>
+      <w:pPr>
+        <w:ind w:left="3228" w:hanging="360"/>
+      </w:pPr>
+    </w:lvl>
+    <w:lvl w:ilvl="4" w:tplc="04190019" w:tentative="1">
+      <w:start w:val="1"/>
+      <w:numFmt w:val="lowerLetter"/>
+      <w:lvlText w:val="%5."/>
+      <w:lvlJc w:val="left"/>
+      <w:pPr>
+        <w:ind w:left="3948" w:hanging="360"/>
+      </w:pPr>
+    </w:lvl>
+    <w:lvl w:ilvl="5" w:tplc="0419001B" w:tentative="1">
+      <w:start w:val="1"/>
+      <w:numFmt w:val="lowerRoman"/>
+      <w:lvlText w:val="%6."/>
+      <w:lvlJc w:val="right"/>
+      <w:pPr>
+        <w:ind w:left="4668" w:hanging="180"/>
+      </w:pPr>
+    </w:lvl>
+    <w:lvl w:ilvl="6" w:tplc="0419000F" w:tentative="1">
+      <w:start w:val="1"/>
+      <w:numFmt w:val="decimal"/>
+      <w:lvlText w:val="%7."/>
+      <w:lvlJc w:val="left"/>
+      <w:pPr>
+        <w:ind w:left="5388" w:hanging="360"/>
+      </w:pPr>
+    </w:lvl>
+    <w:lvl w:ilvl="7" w:tplc="04190019" w:tentative="1">
+      <w:start w:val="1"/>
+      <w:numFmt w:val="lowerLetter"/>
+      <w:lvlText w:val="%8."/>
+      <w:lvlJc w:val="left"/>
+      <w:pPr>
+        <w:ind w:left="6108" w:hanging="360"/>
+      </w:pPr>
+    </w:lvl>
+    <w:lvl w:ilvl="8" w:tplc="0419001B" w:tentative="1">
+      <w:start w:val="1"/>
+      <w:numFmt w:val="lowerRoman"/>
+      <w:lvlText w:val="%9."/>
+      <w:lvlJc w:val="right"/>
+      <w:pPr>
+        <w:ind w:left="6828" w:hanging="180"/>
+      </w:pPr>
+    </w:lvl>
+  </w:abstractNum>
+  <w:abstractNum w:abstractNumId="5" w15:restartNumberingAfterBreak="0">
     <w:nsid w:val="4E485B12"/>
     <w:multiLevelType w:val="multilevel"/>
     <w:tmpl w:val="90C2E9F4"/>
@@ -2681,7 +4412,7 @@
       </w:rPr>
     </w:lvl>
   </w:abstractNum>
-  <w:abstractNum w:abstractNumId="3" w15:restartNumberingAfterBreak="0">
+  <w:abstractNum w:abstractNumId="6" w15:restartNumberingAfterBreak="0">
     <w:nsid w:val="591A7815"/>
     <w:multiLevelType w:val="hybridMultilevel"/>
     <w:tmpl w:val="FC7A57BA"/>
@@ -2767,6 +4498,184 @@
       <w:lvlJc w:val="right"/>
       <w:pPr>
         <w:ind w:left="6480" w:hanging="180"/>
+      </w:pPr>
+    </w:lvl>
+  </w:abstractNum>
+  <w:abstractNum w:abstractNumId="7" w15:restartNumberingAfterBreak="0">
+    <w:nsid w:val="5EF41053"/>
+    <w:multiLevelType w:val="hybridMultilevel"/>
+    <w:tmpl w:val="202444FE"/>
+    <w:lvl w:ilvl="0" w:tplc="39887698">
+      <w:start w:val="1"/>
+      <w:numFmt w:val="decimal"/>
+      <w:lvlText w:val="%1."/>
+      <w:lvlJc w:val="left"/>
+      <w:pPr>
+        <w:ind w:left="1068" w:hanging="360"/>
+      </w:pPr>
+      <w:rPr>
+        <w:rFonts w:hint="default"/>
+      </w:rPr>
+    </w:lvl>
+    <w:lvl w:ilvl="1" w:tplc="04190019" w:tentative="1">
+      <w:start w:val="1"/>
+      <w:numFmt w:val="lowerLetter"/>
+      <w:lvlText w:val="%2."/>
+      <w:lvlJc w:val="left"/>
+      <w:pPr>
+        <w:ind w:left="1788" w:hanging="360"/>
+      </w:pPr>
+    </w:lvl>
+    <w:lvl w:ilvl="2" w:tplc="0419001B" w:tentative="1">
+      <w:start w:val="1"/>
+      <w:numFmt w:val="lowerRoman"/>
+      <w:lvlText w:val="%3."/>
+      <w:lvlJc w:val="right"/>
+      <w:pPr>
+        <w:ind w:left="2508" w:hanging="180"/>
+      </w:pPr>
+    </w:lvl>
+    <w:lvl w:ilvl="3" w:tplc="0419000F" w:tentative="1">
+      <w:start w:val="1"/>
+      <w:numFmt w:val="decimal"/>
+      <w:lvlText w:val="%4."/>
+      <w:lvlJc w:val="left"/>
+      <w:pPr>
+        <w:ind w:left="3228" w:hanging="360"/>
+      </w:pPr>
+    </w:lvl>
+    <w:lvl w:ilvl="4" w:tplc="04190019" w:tentative="1">
+      <w:start w:val="1"/>
+      <w:numFmt w:val="lowerLetter"/>
+      <w:lvlText w:val="%5."/>
+      <w:lvlJc w:val="left"/>
+      <w:pPr>
+        <w:ind w:left="3948" w:hanging="360"/>
+      </w:pPr>
+    </w:lvl>
+    <w:lvl w:ilvl="5" w:tplc="0419001B" w:tentative="1">
+      <w:start w:val="1"/>
+      <w:numFmt w:val="lowerRoman"/>
+      <w:lvlText w:val="%6."/>
+      <w:lvlJc w:val="right"/>
+      <w:pPr>
+        <w:ind w:left="4668" w:hanging="180"/>
+      </w:pPr>
+    </w:lvl>
+    <w:lvl w:ilvl="6" w:tplc="0419000F" w:tentative="1">
+      <w:start w:val="1"/>
+      <w:numFmt w:val="decimal"/>
+      <w:lvlText w:val="%7."/>
+      <w:lvlJc w:val="left"/>
+      <w:pPr>
+        <w:ind w:left="5388" w:hanging="360"/>
+      </w:pPr>
+    </w:lvl>
+    <w:lvl w:ilvl="7" w:tplc="04190019" w:tentative="1">
+      <w:start w:val="1"/>
+      <w:numFmt w:val="lowerLetter"/>
+      <w:lvlText w:val="%8."/>
+      <w:lvlJc w:val="left"/>
+      <w:pPr>
+        <w:ind w:left="6108" w:hanging="360"/>
+      </w:pPr>
+    </w:lvl>
+    <w:lvl w:ilvl="8" w:tplc="0419001B" w:tentative="1">
+      <w:start w:val="1"/>
+      <w:numFmt w:val="lowerRoman"/>
+      <w:lvlText w:val="%9."/>
+      <w:lvlJc w:val="right"/>
+      <w:pPr>
+        <w:ind w:left="6828" w:hanging="180"/>
+      </w:pPr>
+    </w:lvl>
+  </w:abstractNum>
+  <w:abstractNum w:abstractNumId="8" w15:restartNumberingAfterBreak="0">
+    <w:nsid w:val="7406520A"/>
+    <w:multiLevelType w:val="hybridMultilevel"/>
+    <w:tmpl w:val="1D162F56"/>
+    <w:lvl w:ilvl="0" w:tplc="356002AE">
+      <w:start w:val="1"/>
+      <w:numFmt w:val="decimal"/>
+      <w:lvlText w:val="%1."/>
+      <w:lvlJc w:val="left"/>
+      <w:pPr>
+        <w:ind w:left="1068" w:hanging="360"/>
+      </w:pPr>
+      <w:rPr>
+        <w:rFonts w:hint="default"/>
+      </w:rPr>
+    </w:lvl>
+    <w:lvl w:ilvl="1" w:tplc="04190019" w:tentative="1">
+      <w:start w:val="1"/>
+      <w:numFmt w:val="lowerLetter"/>
+      <w:lvlText w:val="%2."/>
+      <w:lvlJc w:val="left"/>
+      <w:pPr>
+        <w:ind w:left="1788" w:hanging="360"/>
+      </w:pPr>
+    </w:lvl>
+    <w:lvl w:ilvl="2" w:tplc="0419001B" w:tentative="1">
+      <w:start w:val="1"/>
+      <w:numFmt w:val="lowerRoman"/>
+      <w:lvlText w:val="%3."/>
+      <w:lvlJc w:val="right"/>
+      <w:pPr>
+        <w:ind w:left="2508" w:hanging="180"/>
+      </w:pPr>
+    </w:lvl>
+    <w:lvl w:ilvl="3" w:tplc="0419000F" w:tentative="1">
+      <w:start w:val="1"/>
+      <w:numFmt w:val="decimal"/>
+      <w:lvlText w:val="%4."/>
+      <w:lvlJc w:val="left"/>
+      <w:pPr>
+        <w:ind w:left="3228" w:hanging="360"/>
+      </w:pPr>
+    </w:lvl>
+    <w:lvl w:ilvl="4" w:tplc="04190019" w:tentative="1">
+      <w:start w:val="1"/>
+      <w:numFmt w:val="lowerLetter"/>
+      <w:lvlText w:val="%5."/>
+      <w:lvlJc w:val="left"/>
+      <w:pPr>
+        <w:ind w:left="3948" w:hanging="360"/>
+      </w:pPr>
+    </w:lvl>
+    <w:lvl w:ilvl="5" w:tplc="0419001B" w:tentative="1">
+      <w:start w:val="1"/>
+      <w:numFmt w:val="lowerRoman"/>
+      <w:lvlText w:val="%6."/>
+      <w:lvlJc w:val="right"/>
+      <w:pPr>
+        <w:ind w:left="4668" w:hanging="180"/>
+      </w:pPr>
+    </w:lvl>
+    <w:lvl w:ilvl="6" w:tplc="0419000F" w:tentative="1">
+      <w:start w:val="1"/>
+      <w:numFmt w:val="decimal"/>
+      <w:lvlText w:val="%7."/>
+      <w:lvlJc w:val="left"/>
+      <w:pPr>
+        <w:ind w:left="5388" w:hanging="360"/>
+      </w:pPr>
+    </w:lvl>
+    <w:lvl w:ilvl="7" w:tplc="04190019" w:tentative="1">
+      <w:start w:val="1"/>
+      <w:numFmt w:val="lowerLetter"/>
+      <w:lvlText w:val="%8."/>
+      <w:lvlJc w:val="left"/>
+      <w:pPr>
+        <w:ind w:left="6108" w:hanging="360"/>
+      </w:pPr>
+    </w:lvl>
+    <w:lvl w:ilvl="8" w:tplc="0419001B" w:tentative="1">
+      <w:start w:val="1"/>
+      <w:numFmt w:val="lowerRoman"/>
+      <w:lvlText w:val="%9."/>
+      <w:lvlJc w:val="right"/>
+      <w:pPr>
+        <w:ind w:left="6828" w:hanging="180"/>
       </w:pPr>
     </w:lvl>
   </w:abstractNum>
@@ -2774,13 +4683,28 @@
     <w:abstractNumId w:val="0"/>
   </w:num>
   <w:num w:numId="2" w16cid:durableId="765272132">
+    <w:abstractNumId w:val="6"/>
+  </w:num>
+  <w:num w:numId="3" w16cid:durableId="1504511269">
+    <w:abstractNumId w:val="2"/>
+  </w:num>
+  <w:num w:numId="4" w16cid:durableId="565995997">
+    <w:abstractNumId w:val="5"/>
+  </w:num>
+  <w:num w:numId="5" w16cid:durableId="722563768">
     <w:abstractNumId w:val="3"/>
   </w:num>
-  <w:num w:numId="3" w16cid:durableId="1504511269">
+  <w:num w:numId="6" w16cid:durableId="1841433202">
     <w:abstractNumId w:val="1"/>
   </w:num>
-  <w:num w:numId="4" w16cid:durableId="565995997">
-    <w:abstractNumId w:val="2"/>
+  <w:num w:numId="7" w16cid:durableId="691612605">
+    <w:abstractNumId w:val="8"/>
+  </w:num>
+  <w:num w:numId="8" w16cid:durableId="117917631">
+    <w:abstractNumId w:val="7"/>
+  </w:num>
+  <w:num w:numId="9" w16cid:durableId="1823548078">
+    <w:abstractNumId w:val="4"/>
   </w:num>
 </w:numbering>
 </file>

</xml_diff>

<commit_message>
UPDATE: отчет DATE: 2026-09-24 01:51:06
</commit_message>
<xml_diff>
--- a/Учеба 4 семестр/ОСИ/Курсовая работа/Курсовая работа.docx
+++ b/Учеба 4 семестр/ОСИ/Курсовая работа/Курсовая работа.docx
@@ -918,7 +918,21 @@
           <w:sz w:val="28"/>
           <w:szCs w:val="28"/>
         </w:rPr>
-        <w:t xml:space="preserve">1.4. </w:t>
+        <w:t>1.</w:t>
+      </w:r>
+      <w:r>
+        <w:rPr>
+          <w:sz w:val="28"/>
+          <w:szCs w:val="28"/>
+        </w:rPr>
+        <w:t>5</w:t>
+      </w:r>
+      <w:r>
+        <w:rPr>
+          <w:sz w:val="28"/>
+          <w:szCs w:val="28"/>
+        </w:rPr>
+        <w:t xml:space="preserve">. </w:t>
       </w:r>
       <w:r>
         <w:rPr>
@@ -940,6 +954,62 @@
           <w:szCs w:val="28"/>
         </w:rPr>
         <w:t>9</w:t>
+      </w:r>
+    </w:p>
+    <w:p>
+      <w:pPr>
+        <w:tabs>
+          <w:tab w:val="right" w:leader="dot" w:pos="9000"/>
+        </w:tabs>
+        <w:spacing w:line="360" w:lineRule="auto"/>
+        <w:ind w:left="360"/>
+        <w:jc w:val="both"/>
+        <w:rPr>
+          <w:sz w:val="28"/>
+          <w:szCs w:val="28"/>
+        </w:rPr>
+      </w:pPr>
+      <w:r>
+        <w:rPr>
+          <w:sz w:val="28"/>
+          <w:szCs w:val="28"/>
+        </w:rPr>
+        <w:t>1</w:t>
+      </w:r>
+      <w:r>
+        <w:rPr>
+          <w:sz w:val="28"/>
+          <w:szCs w:val="28"/>
+        </w:rPr>
+        <w:t>.6</w:t>
+      </w:r>
+      <w:r>
+        <w:rPr>
+          <w:sz w:val="28"/>
+          <w:szCs w:val="28"/>
+        </w:rPr>
+        <w:t xml:space="preserve">. </w:t>
+      </w:r>
+      <w:r>
+        <w:rPr>
+          <w:sz w:val="28"/>
+          <w:szCs w:val="28"/>
+        </w:rPr>
+        <w:t>Сравнение с устаревшими механизмами</w:t>
+      </w:r>
+      <w:r>
+        <w:rPr>
+          <w:sz w:val="28"/>
+          <w:szCs w:val="28"/>
+        </w:rPr>
+        <w:tab/>
+      </w:r>
+      <w:r>
+        <w:rPr>
+          <w:sz w:val="28"/>
+          <w:szCs w:val="28"/>
+        </w:rPr>
+        <w:t>10</w:t>
       </w:r>
     </w:p>
     <w:p>
@@ -1082,23 +1152,6 @@
     <w:p/>
     <w:p/>
     <w:p/>
-    <w:p/>
-    <w:p/>
-    <w:p/>
-    <w:p/>
-    <w:p/>
-    <w:p/>
-    <w:p/>
-    <w:p/>
-    <w:p/>
-    <w:p/>
-    <w:p/>
-    <w:p/>
-    <w:p/>
-    <w:p/>
-    <w:p/>
-    <w:p/>
-    <w:p/>
     <w:p>
       <w:pPr>
         <w:spacing w:line="360" w:lineRule="auto"/>
@@ -1117,6 +1170,7 @@
           <w:sz w:val="32"/>
           <w:szCs w:val="32"/>
         </w:rPr>
+        <w:lastRenderedPageBreak/>
         <w:t>Введение</w:t>
       </w:r>
     </w:p>
@@ -1160,16 +1214,15 @@
         </w:rPr>
         <w:t xml:space="preserve">В архитектуре x86-64 переход из пользовательского режима в режим ядра реализован с помощью специализированной инструкции </w:t>
       </w:r>
-      <m:oMath>
-        <m:r>
-          <w:rPr>
-            <w:rFonts w:ascii="Cambria Math" w:hAnsi="Cambria Math"/>
-            <w:sz w:val="28"/>
-            <w:szCs w:val="28"/>
-          </w:rPr>
-          <m:t>syscall</m:t>
-        </m:r>
-      </m:oMath>
+      <w:proofErr w:type="spellStart"/>
+      <w:r>
+        <w:rPr>
+          <w:sz w:val="28"/>
+          <w:szCs w:val="28"/>
+        </w:rPr>
+        <w:t>syscall</w:t>
+      </w:r>
+      <w:proofErr w:type="spellEnd"/>
       <w:r>
         <w:rPr>
           <w:sz w:val="28"/>
@@ -1177,16 +1230,22 @@
         </w:rPr>
         <w:t xml:space="preserve">, пришедшей на смену устаревшим механизмам </w:t>
       </w:r>
-      <m:oMath>
-        <m:r>
-          <w:rPr>
-            <w:rFonts w:ascii="Cambria Math" w:hAnsi="Cambria Math"/>
-            <w:sz w:val="28"/>
-            <w:szCs w:val="28"/>
-          </w:rPr>
-          <m:t>int 0x80</m:t>
-        </m:r>
-      </m:oMath>
+      <w:proofErr w:type="spellStart"/>
+      <w:r>
+        <w:rPr>
+          <w:sz w:val="28"/>
+          <w:szCs w:val="28"/>
+        </w:rPr>
+        <w:t>int</w:t>
+      </w:r>
+      <w:proofErr w:type="spellEnd"/>
+      <w:r>
+        <w:rPr>
+          <w:sz w:val="28"/>
+          <w:szCs w:val="28"/>
+        </w:rPr>
+        <w:t xml:space="preserve"> 0x80</w:t>
+      </w:r>
       <w:r>
         <w:rPr>
           <w:sz w:val="28"/>
@@ -1194,16 +1253,15 @@
         </w:rPr>
         <w:t xml:space="preserve"> и </w:t>
       </w:r>
-      <m:oMath>
-        <m:r>
-          <w:rPr>
-            <w:rFonts w:ascii="Cambria Math" w:hAnsi="Cambria Math"/>
-            <w:sz w:val="28"/>
-            <w:szCs w:val="28"/>
-          </w:rPr>
-          <m:t>sysenter</m:t>
-        </m:r>
-      </m:oMath>
+      <w:proofErr w:type="spellStart"/>
+      <w:r>
+        <w:rPr>
+          <w:sz w:val="28"/>
+          <w:szCs w:val="28"/>
+        </w:rPr>
+        <w:t>sysenter</w:t>
+      </w:r>
+      <w:proofErr w:type="spellEnd"/>
       <w:r>
         <w:rPr>
           <w:sz w:val="28"/>
@@ -1246,7 +1304,6 @@
           <w:sz w:val="28"/>
           <w:szCs w:val="28"/>
         </w:rPr>
-        <w:lastRenderedPageBreak/>
         <w:t>Актуальность:</w:t>
       </w:r>
       <w:r>
@@ -1408,6 +1465,7 @@
           <w:sz w:val="28"/>
           <w:szCs w:val="28"/>
         </w:rPr>
+        <w:lastRenderedPageBreak/>
         <w:t>Задачи:</w:t>
       </w:r>
     </w:p>
@@ -1439,16 +1497,15 @@
         </w:rPr>
         <w:t xml:space="preserve">зучить механизм перехода в режим ядра в архитектуре x86-64, включая работу инструкции </w:t>
       </w:r>
-      <m:oMath>
-        <m:r>
-          <w:rPr>
-            <w:rFonts w:ascii="Cambria Math" w:hAnsi="Cambria Math"/>
-            <w:sz w:val="28"/>
-            <w:szCs w:val="28"/>
-          </w:rPr>
-          <m:t>syscall</m:t>
-        </m:r>
-      </m:oMath>
+      <w:proofErr w:type="spellStart"/>
+      <w:r>
+        <w:rPr>
+          <w:sz w:val="28"/>
+          <w:szCs w:val="28"/>
+        </w:rPr>
+        <w:t>syscall</w:t>
+      </w:r>
+      <w:proofErr w:type="spellEnd"/>
       <w:r>
         <w:rPr>
           <w:sz w:val="28"/>
@@ -1686,6 +1743,33 @@
     </w:p>
     <w:p>
       <w:pPr>
+        <w:spacing w:line="360" w:lineRule="auto"/>
+        <w:rPr>
+          <w:sz w:val="28"/>
+          <w:szCs w:val="28"/>
+        </w:rPr>
+      </w:pPr>
+    </w:p>
+    <w:p>
+      <w:pPr>
+        <w:spacing w:line="360" w:lineRule="auto"/>
+        <w:rPr>
+          <w:sz w:val="28"/>
+          <w:szCs w:val="28"/>
+        </w:rPr>
+      </w:pPr>
+    </w:p>
+    <w:p>
+      <w:pPr>
+        <w:spacing w:line="360" w:lineRule="auto"/>
+        <w:rPr>
+          <w:sz w:val="28"/>
+          <w:szCs w:val="28"/>
+        </w:rPr>
+      </w:pPr>
+    </w:p>
+    <w:p>
+      <w:pPr>
         <w:pStyle w:val="a7"/>
         <w:numPr>
           <w:ilvl w:val="0"/>
@@ -1708,6 +1792,7 @@
           <w:sz w:val="32"/>
           <w:szCs w:val="32"/>
         </w:rPr>
+        <w:lastRenderedPageBreak/>
         <w:t>Исследование механизма переключения в режим ядра</w:t>
       </w:r>
     </w:p>
@@ -2089,7 +2174,101 @@
           <w:sz w:val="28"/>
           <w:szCs w:val="28"/>
         </w:rPr>
-        <w:t xml:space="preserve"> -r. Нумерация ядра происходит по следующей X-</w:t>
+        <w:t xml:space="preserve"> -r. Нумерация ядра происходит по следующей X-Y-Z схеме: X - номер версии, Y - мажорный номер версии, Z - патч. </w:t>
+      </w:r>
+      <w:r>
+        <w:rPr>
+          <w:sz w:val="28"/>
+          <w:szCs w:val="28"/>
+        </w:rPr>
+        <w:t>Помимо этого,</w:t>
+      </w:r>
+      <w:r>
+        <w:rPr>
+          <w:sz w:val="28"/>
+          <w:szCs w:val="28"/>
+        </w:rPr>
+        <w:t xml:space="preserve"> ядро может иметь различные ветки разработки, например основную и LTS (</w:t>
+      </w:r>
+      <w:proofErr w:type="spellStart"/>
+      <w:r>
+        <w:rPr>
+          <w:sz w:val="28"/>
+          <w:szCs w:val="28"/>
+        </w:rPr>
+        <w:t>long</w:t>
+      </w:r>
+      <w:proofErr w:type="spellEnd"/>
+      <w:r>
+        <w:rPr>
+          <w:sz w:val="28"/>
+          <w:szCs w:val="28"/>
+        </w:rPr>
+        <w:t xml:space="preserve"> </w:t>
+      </w:r>
+      <w:proofErr w:type="spellStart"/>
+      <w:r>
+        <w:rPr>
+          <w:sz w:val="28"/>
+          <w:szCs w:val="28"/>
+        </w:rPr>
+        <w:t>time</w:t>
+      </w:r>
+      <w:proofErr w:type="spellEnd"/>
+      <w:r>
+        <w:rPr>
+          <w:sz w:val="28"/>
+          <w:szCs w:val="28"/>
+        </w:rPr>
+        <w:t xml:space="preserve"> </w:t>
+      </w:r>
+      <w:proofErr w:type="spellStart"/>
+      <w:r>
+        <w:rPr>
+          <w:sz w:val="28"/>
+          <w:szCs w:val="28"/>
+        </w:rPr>
+        <w:t>support</w:t>
+      </w:r>
+      <w:proofErr w:type="spellEnd"/>
+      <w:r>
+        <w:rPr>
+          <w:sz w:val="28"/>
+          <w:szCs w:val="28"/>
+        </w:rPr>
+        <w:t>)</w:t>
+      </w:r>
+      <w:r>
+        <w:rPr>
+          <w:sz w:val="28"/>
+          <w:szCs w:val="28"/>
+        </w:rPr>
+        <w:t xml:space="preserve">. </w:t>
+      </w:r>
+    </w:p>
+    <w:p>
+      <w:pPr>
+        <w:spacing w:line="360" w:lineRule="auto"/>
+        <w:ind w:firstLine="708"/>
+        <w:jc w:val="both"/>
+        <w:rPr>
+          <w:sz w:val="28"/>
+          <w:szCs w:val="28"/>
+        </w:rPr>
+      </w:pPr>
+      <w:r>
+        <w:rPr>
+          <w:sz w:val="28"/>
+          <w:szCs w:val="28"/>
+        </w:rPr>
+        <w:t>П</w:t>
+      </w:r>
+      <w:r>
+        <w:rPr>
+          <w:sz w:val="28"/>
+          <w:szCs w:val="28"/>
+        </w:rPr>
+        <w:t xml:space="preserve">ользовательским программам регулярно требуется доступ к ресурсам, управляемым ядром: файлам, сетевым соединениям, устройствам. Для этого </w:t>
       </w:r>
       <w:r>
         <w:rPr>
@@ -2097,101 +2276,7 @@
           <w:szCs w:val="28"/>
         </w:rPr>
         <w:lastRenderedPageBreak/>
-        <w:t xml:space="preserve">Y-Z схеме: X - номер версии, Y - мажорный номер версии, Z - патч. </w:t>
-      </w:r>
-      <w:r>
-        <w:rPr>
-          <w:sz w:val="28"/>
-          <w:szCs w:val="28"/>
-        </w:rPr>
-        <w:t>Помимо этого,</w:t>
-      </w:r>
-      <w:r>
-        <w:rPr>
-          <w:sz w:val="28"/>
-          <w:szCs w:val="28"/>
-        </w:rPr>
-        <w:t xml:space="preserve"> ядро может иметь различные ветки разработки, например основную и LTS (</w:t>
-      </w:r>
-      <w:proofErr w:type="spellStart"/>
-      <w:r>
-        <w:rPr>
-          <w:sz w:val="28"/>
-          <w:szCs w:val="28"/>
-        </w:rPr>
-        <w:t>long</w:t>
-      </w:r>
-      <w:proofErr w:type="spellEnd"/>
-      <w:r>
-        <w:rPr>
-          <w:sz w:val="28"/>
-          <w:szCs w:val="28"/>
-        </w:rPr>
-        <w:t xml:space="preserve"> </w:t>
-      </w:r>
-      <w:proofErr w:type="spellStart"/>
-      <w:r>
-        <w:rPr>
-          <w:sz w:val="28"/>
-          <w:szCs w:val="28"/>
-        </w:rPr>
-        <w:t>time</w:t>
-      </w:r>
-      <w:proofErr w:type="spellEnd"/>
-      <w:r>
-        <w:rPr>
-          <w:sz w:val="28"/>
-          <w:szCs w:val="28"/>
-        </w:rPr>
-        <w:t xml:space="preserve"> </w:t>
-      </w:r>
-      <w:proofErr w:type="spellStart"/>
-      <w:r>
-        <w:rPr>
-          <w:sz w:val="28"/>
-          <w:szCs w:val="28"/>
-        </w:rPr>
-        <w:t>support</w:t>
-      </w:r>
-      <w:proofErr w:type="spellEnd"/>
-      <w:r>
-        <w:rPr>
-          <w:sz w:val="28"/>
-          <w:szCs w:val="28"/>
-        </w:rPr>
-        <w:t>)</w:t>
-      </w:r>
-      <w:r>
-        <w:rPr>
-          <w:sz w:val="28"/>
-          <w:szCs w:val="28"/>
-        </w:rPr>
-        <w:t xml:space="preserve">. </w:t>
-      </w:r>
-    </w:p>
-    <w:p>
-      <w:pPr>
-        <w:spacing w:line="360" w:lineRule="auto"/>
-        <w:ind w:firstLine="708"/>
-        <w:jc w:val="both"/>
-        <w:rPr>
-          <w:sz w:val="28"/>
-          <w:szCs w:val="28"/>
-        </w:rPr>
-      </w:pPr>
-      <w:r>
-        <w:rPr>
-          <w:sz w:val="28"/>
-          <w:szCs w:val="28"/>
-        </w:rPr>
-        <w:t>П</w:t>
-      </w:r>
-      <w:r>
-        <w:rPr>
-          <w:sz w:val="28"/>
-          <w:szCs w:val="28"/>
-        </w:rPr>
-        <w:t>ользовательским программам регулярно требуется доступ к ресурсам, управляемым ядром: файлам, сетевым соединениям, устройствам. Для этого механизм системных вызовов</w:t>
+        <w:t>механизм системных вызовов</w:t>
       </w:r>
       <w:r>
         <w:rPr>
@@ -2292,7 +2377,6 @@
           <w:szCs w:val="28"/>
           <w:lang w:val="en-US"/>
         </w:rPr>
-        <w:lastRenderedPageBreak/>
         <w:drawing>
           <wp:inline distT="0" distB="0" distL="0" distR="0" wp14:anchorId="4A562D2F" wp14:editId="2D386938">
             <wp:extent cx="4412098" cy="5882640"/>
@@ -2431,6 +2515,7 @@
           <w:sz w:val="28"/>
           <w:szCs w:val="28"/>
         </w:rPr>
+        <w:lastRenderedPageBreak/>
         <w:t xml:space="preserve">Когда пользователь вводит команду в командной оболочке </w:t>
       </w:r>
       <w:proofErr w:type="spellStart"/>
@@ -2527,15 +2612,7 @@
           <w:sz w:val="28"/>
           <w:szCs w:val="28"/>
         </w:rPr>
-        <w:t xml:space="preserve"> для вывода данных. Каждый из этих вызовов инициирует переход в режим ядра, после чего ядро выполняет </w:t>
-      </w:r>
-      <w:r>
-        <w:rPr>
-          <w:sz w:val="28"/>
-          <w:szCs w:val="28"/>
-        </w:rPr>
-        <w:lastRenderedPageBreak/>
-        <w:t>запрошенную операцию, взаимодействуя с файловой системой, драйвером диска и драйвером терминала.</w:t>
+        <w:t xml:space="preserve"> для вывода данных. Каждый из этих вызовов инициирует переход в режим ядра, после чего ядро выполняет запрошенную операцию, взаимодействуя с файловой системой, драйвером диска и драйвером терминала.</w:t>
       </w:r>
     </w:p>
     <w:p>
@@ -3083,6 +3160,7 @@
           <w:sz w:val="28"/>
           <w:szCs w:val="28"/>
         </w:rPr>
+        <w:lastRenderedPageBreak/>
         <w:t>entry_SYSCALL_64.</w:t>
       </w:r>
       <w:r>
@@ -3184,7 +3262,6 @@
           <w:sz w:val="28"/>
           <w:szCs w:val="28"/>
         </w:rPr>
-        <w:lastRenderedPageBreak/>
         <w:t>Обработка системного вызова внутри ядра</w:t>
       </w:r>
     </w:p>
@@ -3582,6 +3659,7 @@
         <w:rPr>
           <w:noProof/>
         </w:rPr>
+        <w:lastRenderedPageBreak/>
         <w:drawing>
           <wp:inline distT="0" distB="0" distL="0" distR="0" wp14:anchorId="1E1BBD55" wp14:editId="5938DC40">
             <wp:extent cx="2715260" cy="5334000"/>
@@ -3710,6 +3788,11 @@
     </w:p>
     <w:p>
       <w:pPr>
+        <w:pStyle w:val="a7"/>
+        <w:numPr>
+          <w:ilvl w:val="1"/>
+          <w:numId w:val="4"/>
+        </w:numPr>
         <w:spacing w:line="360" w:lineRule="auto"/>
         <w:jc w:val="center"/>
         <w:rPr>
@@ -3717,9 +3800,711 @@
           <w:szCs w:val="28"/>
         </w:rPr>
       </w:pPr>
+      <w:r>
+        <w:rPr>
+          <w:b/>
+          <w:bCs/>
+          <w:sz w:val="28"/>
+          <w:szCs w:val="28"/>
+        </w:rPr>
+        <w:t>Сравнение с устаревшими механизмами</w:t>
+      </w:r>
+    </w:p>
+    <w:p>
+      <w:pPr>
+        <w:spacing w:line="360" w:lineRule="auto"/>
+        <w:ind w:firstLine="708"/>
+        <w:jc w:val="both"/>
+        <w:rPr>
+          <w:sz w:val="28"/>
+          <w:szCs w:val="28"/>
+        </w:rPr>
+      </w:pPr>
+      <w:r>
+        <w:rPr>
+          <w:sz w:val="28"/>
+          <w:szCs w:val="28"/>
+        </w:rPr>
+        <w:t xml:space="preserve">До появления инструкции </w:t>
+      </w:r>
+      <w:proofErr w:type="spellStart"/>
+      <w:r>
+        <w:rPr>
+          <w:sz w:val="28"/>
+          <w:szCs w:val="28"/>
+          <w:lang w:val="en-US"/>
+        </w:rPr>
+        <w:t>syscall</w:t>
+      </w:r>
+      <w:proofErr w:type="spellEnd"/>
+      <w:r>
+        <w:rPr>
+          <w:sz w:val="28"/>
+          <w:szCs w:val="28"/>
+        </w:rPr>
+        <w:t xml:space="preserve"> </w:t>
+      </w:r>
+      <w:r>
+        <w:rPr>
+          <w:sz w:val="28"/>
+          <w:szCs w:val="28"/>
+        </w:rPr>
+        <w:t xml:space="preserve">существовали другие способы перехода в режим ядра. </w:t>
+      </w:r>
+    </w:p>
+    <w:p>
+      <w:pPr>
+        <w:spacing w:line="360" w:lineRule="auto"/>
+        <w:ind w:firstLine="708"/>
+        <w:jc w:val="both"/>
+        <w:rPr>
+          <w:sz w:val="28"/>
+          <w:szCs w:val="28"/>
+        </w:rPr>
+      </w:pPr>
+      <w:r>
+        <w:rPr>
+          <w:sz w:val="28"/>
+          <w:szCs w:val="28"/>
+        </w:rPr>
+        <w:t>В 32-разрядных системах использовалось программное прерывание</w:t>
+      </w:r>
+      <w:r>
+        <w:rPr>
+          <w:sz w:val="28"/>
+          <w:szCs w:val="28"/>
+        </w:rPr>
+        <w:t xml:space="preserve"> </w:t>
+      </w:r>
+      <w:r>
+        <w:rPr>
+          <w:sz w:val="28"/>
+          <w:szCs w:val="28"/>
+        </w:rPr>
+        <w:t>–</w:t>
+      </w:r>
+      <w:r>
+        <w:rPr>
+          <w:sz w:val="28"/>
+          <w:szCs w:val="28"/>
+        </w:rPr>
+        <w:t xml:space="preserve"> </w:t>
+      </w:r>
+      <w:r>
+        <w:rPr>
+          <w:sz w:val="28"/>
+          <w:szCs w:val="28"/>
+          <w:lang w:val="en-US"/>
+        </w:rPr>
+        <w:t>INT</w:t>
+      </w:r>
+      <w:r>
+        <w:rPr>
+          <w:sz w:val="28"/>
+          <w:szCs w:val="28"/>
+        </w:rPr>
+        <w:t>0</w:t>
+      </w:r>
+      <w:r>
+        <w:rPr>
+          <w:sz w:val="28"/>
+          <w:szCs w:val="28"/>
+          <w:lang w:val="en-US"/>
+        </w:rPr>
+        <w:t>x</w:t>
+      </w:r>
+      <w:r>
+        <w:rPr>
+          <w:sz w:val="28"/>
+          <w:szCs w:val="28"/>
+        </w:rPr>
+        <w:t>80</w:t>
+      </w:r>
+      <w:r>
+        <w:rPr>
+          <w:sz w:val="28"/>
+          <w:szCs w:val="28"/>
+        </w:rPr>
+        <w:t xml:space="preserve">: из </w:t>
+      </w:r>
+      <w:r>
+        <w:rPr>
+          <w:sz w:val="28"/>
+          <w:szCs w:val="28"/>
+          <w:lang w:val="en-US"/>
+        </w:rPr>
+        <w:t>user</w:t>
+      </w:r>
+      <w:r>
+        <w:rPr>
+          <w:sz w:val="28"/>
+          <w:szCs w:val="28"/>
+        </w:rPr>
+        <w:t xml:space="preserve"> </w:t>
+      </w:r>
+      <w:r>
+        <w:rPr>
+          <w:sz w:val="28"/>
+          <w:szCs w:val="28"/>
+          <w:lang w:val="en-US"/>
+        </w:rPr>
+        <w:t>space</w:t>
+      </w:r>
+      <w:r>
+        <w:rPr>
+          <w:sz w:val="28"/>
+          <w:szCs w:val="28"/>
+        </w:rPr>
+        <w:t xml:space="preserve"> </w:t>
+      </w:r>
+      <w:r>
+        <w:rPr>
+          <w:sz w:val="28"/>
+          <w:szCs w:val="28"/>
+        </w:rPr>
+        <w:t xml:space="preserve">вызывалось прерывание, процессор обращался к таблице дескрипторов прерываний и передавал управление обработчику. Недостаток этого метода в том, что для обработки прерывания требуется значительное число тактов процессора, то есть – низкая производительность. </w:t>
+      </w:r>
+    </w:p>
+    <w:p>
+      <w:pPr>
+        <w:spacing w:line="360" w:lineRule="auto"/>
+        <w:ind w:firstLine="708"/>
+        <w:jc w:val="both"/>
+        <w:rPr>
+          <w:sz w:val="28"/>
+          <w:szCs w:val="28"/>
+        </w:rPr>
+      </w:pPr>
+      <w:r>
+        <w:rPr>
+          <w:sz w:val="28"/>
+          <w:szCs w:val="28"/>
+        </w:rPr>
+        <w:t xml:space="preserve">Инструкция </w:t>
+      </w:r>
+      <w:proofErr w:type="spellStart"/>
+      <w:r>
+        <w:rPr>
+          <w:sz w:val="28"/>
+          <w:szCs w:val="28"/>
+          <w:lang w:val="en-US"/>
+        </w:rPr>
+        <w:t>sysenter</w:t>
+      </w:r>
+      <w:proofErr w:type="spellEnd"/>
+      <w:r>
+        <w:rPr>
+          <w:sz w:val="28"/>
+          <w:szCs w:val="28"/>
+        </w:rPr>
+        <w:t xml:space="preserve"> – </w:t>
+      </w:r>
+      <w:r>
+        <w:rPr>
+          <w:sz w:val="28"/>
+          <w:szCs w:val="28"/>
+        </w:rPr>
+        <w:t xml:space="preserve">механизм, предложенный как более быстрая альтернатива предыдущему методу, однако механизм имел ограничения и различия в реализации у разных производителей процессоров. </w:t>
+      </w:r>
+    </w:p>
+    <w:p>
+      <w:pPr>
+        <w:spacing w:line="360" w:lineRule="auto"/>
+        <w:ind w:firstLine="708"/>
+        <w:jc w:val="both"/>
+        <w:rPr>
+          <w:sz w:val="28"/>
+          <w:szCs w:val="28"/>
+        </w:rPr>
+      </w:pPr>
+      <w:r>
+        <w:rPr>
+          <w:sz w:val="28"/>
+          <w:szCs w:val="28"/>
+        </w:rPr>
+        <w:lastRenderedPageBreak/>
+        <w:t xml:space="preserve">Инструкция </w:t>
+      </w:r>
+      <w:proofErr w:type="spellStart"/>
+      <w:r>
+        <w:rPr>
+          <w:sz w:val="28"/>
+          <w:szCs w:val="28"/>
+        </w:rPr>
+        <w:t>syscall</w:t>
+      </w:r>
+      <w:proofErr w:type="spellEnd"/>
+      <w:r>
+        <w:rPr>
+          <w:sz w:val="28"/>
+          <w:szCs w:val="28"/>
+        </w:rPr>
+        <w:t>, разработанная компанией AMD для архитектуры x86-64, стала стандартом для 64-разрядных систем. Она обеспечивает наиболее быстрый переход в режим ядра за счёт использования регистров модели (MSR</w:t>
+      </w:r>
+      <w:r>
+        <w:rPr>
+          <w:sz w:val="28"/>
+          <w:szCs w:val="28"/>
+        </w:rPr>
+        <w:t xml:space="preserve"> – </w:t>
+      </w:r>
+      <w:r>
+        <w:rPr>
+          <w:sz w:val="28"/>
+          <w:szCs w:val="28"/>
+          <w:lang w:val="en-US"/>
+        </w:rPr>
+        <w:t>model</w:t>
+      </w:r>
+      <w:r>
+        <w:rPr>
+          <w:sz w:val="28"/>
+          <w:szCs w:val="28"/>
+        </w:rPr>
+        <w:t xml:space="preserve"> </w:t>
+      </w:r>
+      <w:r>
+        <w:rPr>
+          <w:sz w:val="28"/>
+          <w:szCs w:val="28"/>
+          <w:lang w:val="en-US"/>
+        </w:rPr>
+        <w:t>specific</w:t>
+      </w:r>
+      <w:r>
+        <w:rPr>
+          <w:sz w:val="28"/>
+          <w:szCs w:val="28"/>
+        </w:rPr>
+        <w:t xml:space="preserve"> </w:t>
+      </w:r>
+      <w:r>
+        <w:rPr>
+          <w:sz w:val="28"/>
+          <w:szCs w:val="28"/>
+          <w:lang w:val="en-US"/>
+        </w:rPr>
+        <w:t>register</w:t>
+      </w:r>
+      <w:r>
+        <w:rPr>
+          <w:sz w:val="28"/>
+          <w:szCs w:val="28"/>
+        </w:rPr>
+        <w:t xml:space="preserve">) вместо обращения к таблицам в памяти. В современных 64-разрядных версиях Linux именно </w:t>
+      </w:r>
+      <w:proofErr w:type="spellStart"/>
+      <w:r>
+        <w:rPr>
+          <w:sz w:val="28"/>
+          <w:szCs w:val="28"/>
+        </w:rPr>
+        <w:t>syscall</w:t>
+      </w:r>
+      <w:proofErr w:type="spellEnd"/>
+      <w:r>
+        <w:rPr>
+          <w:sz w:val="28"/>
+          <w:szCs w:val="28"/>
+        </w:rPr>
+        <w:t xml:space="preserve"> является основным механизмом, тогда как </w:t>
+      </w:r>
+      <w:proofErr w:type="spellStart"/>
+      <w:r>
+        <w:rPr>
+          <w:sz w:val="28"/>
+          <w:szCs w:val="28"/>
+        </w:rPr>
+        <w:t>int</w:t>
+      </w:r>
+      <w:proofErr w:type="spellEnd"/>
+      <w:r>
+        <w:rPr>
+          <w:sz w:val="28"/>
+          <w:szCs w:val="28"/>
+        </w:rPr>
+        <w:t xml:space="preserve"> 0x80 сохраняется преимущественно для обратной совместимости с 32-разрядными приложениями.</w:t>
+      </w:r>
+      <w:r>
+        <w:rPr>
+          <w:sz w:val="28"/>
+          <w:szCs w:val="28"/>
+        </w:rPr>
+        <w:t xml:space="preserve"> </w:t>
+      </w:r>
+    </w:p>
+    <w:p>
+      <w:pPr>
+        <w:spacing w:line="360" w:lineRule="auto"/>
+        <w:jc w:val="both"/>
+        <w:rPr>
+          <w:sz w:val="28"/>
+          <w:szCs w:val="28"/>
+        </w:rPr>
+      </w:pPr>
+    </w:p>
+    <w:p>
+      <w:pPr>
+        <w:spacing w:line="360" w:lineRule="auto"/>
+        <w:jc w:val="both"/>
+        <w:rPr>
+          <w:sz w:val="28"/>
+          <w:szCs w:val="28"/>
+        </w:rPr>
+      </w:pPr>
+    </w:p>
+    <w:p>
+      <w:pPr>
+        <w:spacing w:line="360" w:lineRule="auto"/>
+        <w:jc w:val="both"/>
+        <w:rPr>
+          <w:sz w:val="28"/>
+          <w:szCs w:val="28"/>
+        </w:rPr>
+      </w:pPr>
+    </w:p>
+    <w:p>
+      <w:pPr>
+        <w:spacing w:line="360" w:lineRule="auto"/>
+        <w:jc w:val="both"/>
+        <w:rPr>
+          <w:sz w:val="28"/>
+          <w:szCs w:val="28"/>
+        </w:rPr>
+      </w:pPr>
+    </w:p>
+    <w:p>
+      <w:pPr>
+        <w:spacing w:line="360" w:lineRule="auto"/>
+        <w:jc w:val="both"/>
+        <w:rPr>
+          <w:sz w:val="28"/>
+          <w:szCs w:val="28"/>
+        </w:rPr>
+      </w:pPr>
+    </w:p>
+    <w:p>
+      <w:pPr>
+        <w:spacing w:line="360" w:lineRule="auto"/>
+        <w:jc w:val="both"/>
+        <w:rPr>
+          <w:sz w:val="28"/>
+          <w:szCs w:val="28"/>
+        </w:rPr>
+      </w:pPr>
+    </w:p>
+    <w:p>
+      <w:pPr>
+        <w:spacing w:line="360" w:lineRule="auto"/>
+        <w:jc w:val="both"/>
+        <w:rPr>
+          <w:sz w:val="28"/>
+          <w:szCs w:val="28"/>
+        </w:rPr>
+      </w:pPr>
+    </w:p>
+    <w:p>
+      <w:pPr>
+        <w:spacing w:line="360" w:lineRule="auto"/>
+        <w:jc w:val="both"/>
+        <w:rPr>
+          <w:sz w:val="28"/>
+          <w:szCs w:val="28"/>
+        </w:rPr>
+      </w:pPr>
+    </w:p>
+    <w:p>
+      <w:pPr>
+        <w:spacing w:line="360" w:lineRule="auto"/>
+        <w:jc w:val="both"/>
+        <w:rPr>
+          <w:sz w:val="28"/>
+          <w:szCs w:val="28"/>
+        </w:rPr>
+      </w:pPr>
+    </w:p>
+    <w:p>
+      <w:pPr>
+        <w:spacing w:line="360" w:lineRule="auto"/>
+        <w:jc w:val="both"/>
+        <w:rPr>
+          <w:sz w:val="28"/>
+          <w:szCs w:val="28"/>
+        </w:rPr>
+      </w:pPr>
+    </w:p>
+    <w:p>
+      <w:pPr>
+        <w:spacing w:line="360" w:lineRule="auto"/>
+        <w:jc w:val="both"/>
+        <w:rPr>
+          <w:sz w:val="28"/>
+          <w:szCs w:val="28"/>
+        </w:rPr>
+      </w:pPr>
+    </w:p>
+    <w:p>
+      <w:pPr>
+        <w:spacing w:line="360" w:lineRule="auto"/>
+        <w:jc w:val="both"/>
+        <w:rPr>
+          <w:sz w:val="28"/>
+          <w:szCs w:val="28"/>
+        </w:rPr>
+      </w:pPr>
+    </w:p>
+    <w:p>
+      <w:pPr>
+        <w:spacing w:line="360" w:lineRule="auto"/>
+        <w:jc w:val="both"/>
+        <w:rPr>
+          <w:sz w:val="28"/>
+          <w:szCs w:val="28"/>
+        </w:rPr>
+      </w:pPr>
+    </w:p>
+    <w:p>
+      <w:pPr>
+        <w:spacing w:line="360" w:lineRule="auto"/>
+        <w:jc w:val="both"/>
+        <w:rPr>
+          <w:sz w:val="28"/>
+          <w:szCs w:val="28"/>
+        </w:rPr>
+      </w:pPr>
+    </w:p>
+    <w:p>
+      <w:pPr>
+        <w:spacing w:line="360" w:lineRule="auto"/>
+        <w:jc w:val="both"/>
+        <w:rPr>
+          <w:sz w:val="28"/>
+          <w:szCs w:val="28"/>
+        </w:rPr>
+      </w:pPr>
+    </w:p>
+    <w:p>
+      <w:pPr>
+        <w:spacing w:line="360" w:lineRule="auto"/>
+        <w:jc w:val="both"/>
+        <w:rPr>
+          <w:sz w:val="28"/>
+          <w:szCs w:val="28"/>
+        </w:rPr>
+      </w:pPr>
+    </w:p>
+    <w:p>
+      <w:pPr>
+        <w:spacing w:line="360" w:lineRule="auto"/>
+        <w:jc w:val="both"/>
+        <w:rPr>
+          <w:sz w:val="28"/>
+          <w:szCs w:val="28"/>
+        </w:rPr>
+      </w:pPr>
+    </w:p>
+    <w:p>
+      <w:pPr>
+        <w:spacing w:line="360" w:lineRule="auto"/>
+        <w:jc w:val="both"/>
+        <w:rPr>
+          <w:sz w:val="28"/>
+          <w:szCs w:val="28"/>
+        </w:rPr>
+      </w:pPr>
+    </w:p>
+    <w:p>
+      <w:pPr>
+        <w:spacing w:line="360" w:lineRule="auto"/>
+        <w:jc w:val="both"/>
+        <w:rPr>
+          <w:sz w:val="28"/>
+          <w:szCs w:val="28"/>
+        </w:rPr>
+      </w:pPr>
+    </w:p>
+    <w:p>
+      <w:pPr>
+        <w:spacing w:line="360" w:lineRule="auto"/>
+        <w:jc w:val="both"/>
+        <w:rPr>
+          <w:sz w:val="28"/>
+          <w:szCs w:val="28"/>
+        </w:rPr>
+      </w:pPr>
+    </w:p>
+    <w:p>
+      <w:pPr>
+        <w:spacing w:line="360" w:lineRule="auto"/>
+        <w:jc w:val="both"/>
+        <w:rPr>
+          <w:sz w:val="28"/>
+          <w:szCs w:val="28"/>
+        </w:rPr>
+      </w:pPr>
+    </w:p>
+    <w:p>
+      <w:pPr>
+        <w:spacing w:line="360" w:lineRule="auto"/>
+        <w:jc w:val="both"/>
+        <w:rPr>
+          <w:sz w:val="28"/>
+          <w:szCs w:val="28"/>
+        </w:rPr>
+      </w:pPr>
+    </w:p>
+    <w:p>
+      <w:pPr>
+        <w:spacing w:line="360" w:lineRule="auto"/>
+        <w:jc w:val="both"/>
+        <w:rPr>
+          <w:sz w:val="28"/>
+          <w:szCs w:val="28"/>
+        </w:rPr>
+      </w:pPr>
+    </w:p>
+    <w:p>
+      <w:pPr>
+        <w:spacing w:line="360" w:lineRule="auto"/>
+        <w:jc w:val="center"/>
+        <w:rPr>
+          <w:b/>
+          <w:bCs/>
+          <w:sz w:val="32"/>
+          <w:szCs w:val="32"/>
+        </w:rPr>
+      </w:pPr>
+      <w:r>
+        <w:rPr>
+          <w:b/>
+          <w:bCs/>
+          <w:sz w:val="32"/>
+          <w:szCs w:val="32"/>
+        </w:rPr>
+        <w:lastRenderedPageBreak/>
+        <w:t>Список литературы</w:t>
+      </w:r>
+    </w:p>
+    <w:p>
+      <w:pPr>
+        <w:spacing w:line="360" w:lineRule="auto"/>
+        <w:jc w:val="center"/>
+        <w:rPr>
+          <w:b/>
+          <w:bCs/>
+          <w:sz w:val="32"/>
+          <w:szCs w:val="32"/>
+        </w:rPr>
+      </w:pPr>
+    </w:p>
+    <w:p>
+      <w:pPr>
+        <w:spacing w:line="360" w:lineRule="auto"/>
+        <w:jc w:val="both"/>
+        <w:rPr>
+          <w:b/>
+          <w:bCs/>
+          <w:sz w:val="28"/>
+          <w:szCs w:val="28"/>
+          <w:lang w:val="en-US"/>
+        </w:rPr>
+      </w:pPr>
+      <w:r>
+        <w:rPr>
+          <w:b/>
+          <w:bCs/>
+          <w:sz w:val="28"/>
+          <w:szCs w:val="28"/>
+          <w:lang w:val="en-US"/>
+        </w:rPr>
+        <w:t>[1]</w:t>
+      </w:r>
+      <w:r>
+        <w:rPr>
+          <w:rFonts w:ascii="Georgia" w:hAnsi="Georgia"/>
+          <w:color w:val="101418"/>
+          <w:kern w:val="36"/>
+          <w:sz w:val="43"/>
+          <w:szCs w:val="43"/>
+          <w:lang w:val="en"/>
+        </w:rPr>
+        <w:t xml:space="preserve"> </w:t>
+      </w:r>
+      <w:r>
+        <w:rPr>
+          <w:b/>
+          <w:bCs/>
+          <w:sz w:val="28"/>
+          <w:szCs w:val="28"/>
+          <w:lang w:val="en"/>
+        </w:rPr>
+        <w:t>Protection ring</w:t>
+      </w:r>
+      <w:r>
+        <w:rPr>
+          <w:b/>
+          <w:bCs/>
+          <w:sz w:val="28"/>
+          <w:szCs w:val="28"/>
+          <w:lang w:val="en"/>
+        </w:rPr>
+        <w:t xml:space="preserve"> </w:t>
+      </w:r>
+      <w:r>
+        <w:rPr>
+          <w:b/>
+          <w:bCs/>
+          <w:sz w:val="28"/>
+          <w:szCs w:val="28"/>
+          <w:lang w:val="en-US"/>
+        </w:rPr>
+        <w:t>— URL</w:t>
+      </w:r>
+      <w:r>
+        <w:rPr>
+          <w:sz w:val="28"/>
+          <w:szCs w:val="28"/>
+          <w:lang w:val="en-US"/>
+        </w:rPr>
+        <w:t xml:space="preserve">: </w:t>
+      </w:r>
+      <w:hyperlink r:id="rId10" w:tgtFrame="_blank" w:history="1">
+        <w:r>
+          <w:rPr>
+            <w:rStyle w:val="af1"/>
+            <w:sz w:val="28"/>
+            <w:szCs w:val="28"/>
+            <w:lang w:val="en-US"/>
+          </w:rPr>
+          <w:t>https://en.wikipedia.org/wiki/Protection_ring</w:t>
+        </w:r>
+      </w:hyperlink>
+    </w:p>
+    <w:p>
+      <w:pPr>
+        <w:spacing w:line="360" w:lineRule="auto"/>
+        <w:jc w:val="both"/>
+        <w:rPr>
+          <w:sz w:val="28"/>
+          <w:szCs w:val="28"/>
+          <w:lang w:val="en-US"/>
+        </w:rPr>
+      </w:pPr>
+    </w:p>
+    <w:p>
+      <w:pPr>
+        <w:spacing w:line="360" w:lineRule="auto"/>
+        <w:rPr>
+          <w:b/>
+          <w:bCs/>
+          <w:sz w:val="32"/>
+          <w:szCs w:val="32"/>
+          <w:lang w:val="en-US"/>
+        </w:rPr>
+      </w:pPr>
     </w:p>
     <w:sectPr>
-      <w:footerReference w:type="default" r:id="rId10"/>
+      <w:footerReference w:type="default" r:id="rId11"/>
       <w:pgSz w:w="11906" w:h="16838"/>
       <w:pgMar w:top="1134" w:right="850" w:bottom="1134" w:left="1701" w:header="708" w:footer="708" w:gutter="0"/>
       <w:cols w:space="708"/>
@@ -5705,6 +6490,29 @@
       <w:szCs w:val="24"/>
     </w:rPr>
   </w:style>
+  <w:style w:type="character" w:styleId="af1">
+    <w:name w:val="Hyperlink"/>
+    <w:basedOn w:val="a0"/>
+    <w:uiPriority w:val="99"/>
+    <w:unhideWhenUsed/>
+    <w:rsid w:val="00BA389C"/>
+    <w:rPr>
+      <w:color w:val="467886" w:themeColor="hyperlink"/>
+      <w:u w:val="single"/>
+    </w:rPr>
+  </w:style>
+  <w:style w:type="character" w:styleId="af2">
+    <w:name w:val="Unresolved Mention"/>
+    <w:basedOn w:val="a0"/>
+    <w:uiPriority w:val="99"/>
+    <w:semiHidden/>
+    <w:unhideWhenUsed/>
+    <w:rsid w:val="00BA389C"/>
+    <w:rPr>
+      <w:color w:val="605E5C"/>
+      <w:shd w:val="clear" w:color="auto" w:fill="E1DFDD"/>
+    </w:rPr>
+  </w:style>
 </w:styles>
 </file>
 

</xml_diff>

<commit_message>
UPDATE: отчет DATE: 2026-09-24 01:54:04
</commit_message>
<xml_diff>
--- a/Учеба 4 семестр/ОСИ/Курсовая работа/Курсовая работа.docx
+++ b/Учеба 4 семестр/ОСИ/Курсовая работа/Курсовая работа.docx
@@ -2276,6 +2276,13 @@
           <w:szCs w:val="28"/>
         </w:rPr>
         <w:lastRenderedPageBreak/>
+        <w:t xml:space="preserve">существует </w:t>
+      </w:r>
+      <w:r>
+        <w:rPr>
+          <w:sz w:val="28"/>
+          <w:szCs w:val="28"/>
+        </w:rPr>
         <w:t>механизм системных вызовов</w:t>
       </w:r>
       <w:r>
@@ -3188,51 +3195,6 @@
     <w:p>
       <w:pPr>
         <w:spacing w:line="360" w:lineRule="auto"/>
-        <w:ind w:firstLine="708"/>
-        <w:jc w:val="both"/>
-        <w:rPr>
-          <w:sz w:val="28"/>
-          <w:szCs w:val="28"/>
-        </w:rPr>
-      </w:pPr>
-    </w:p>
-    <w:p>
-      <w:pPr>
-        <w:spacing w:line="360" w:lineRule="auto"/>
-        <w:ind w:firstLine="708"/>
-        <w:jc w:val="both"/>
-        <w:rPr>
-          <w:sz w:val="28"/>
-          <w:szCs w:val="28"/>
-        </w:rPr>
-      </w:pPr>
-    </w:p>
-    <w:p>
-      <w:pPr>
-        <w:spacing w:line="360" w:lineRule="auto"/>
-        <w:ind w:firstLine="708"/>
-        <w:jc w:val="both"/>
-        <w:rPr>
-          <w:sz w:val="28"/>
-          <w:szCs w:val="28"/>
-        </w:rPr>
-      </w:pPr>
-    </w:p>
-    <w:p>
-      <w:pPr>
-        <w:spacing w:line="360" w:lineRule="auto"/>
-        <w:ind w:firstLine="708"/>
-        <w:jc w:val="both"/>
-        <w:rPr>
-          <w:sz w:val="28"/>
-          <w:szCs w:val="28"/>
-        </w:rPr>
-      </w:pPr>
-    </w:p>
-    <w:p>
-      <w:pPr>
-        <w:spacing w:line="360" w:lineRule="auto"/>
-        <w:ind w:firstLine="708"/>
         <w:jc w:val="both"/>
         <w:rPr>
           <w:sz w:val="28"/>
@@ -3659,11 +3621,10 @@
         <w:rPr>
           <w:noProof/>
         </w:rPr>
-        <w:lastRenderedPageBreak/>
         <w:drawing>
-          <wp:inline distT="0" distB="0" distL="0" distR="0" wp14:anchorId="1E1BBD55" wp14:editId="5938DC40">
-            <wp:extent cx="2715260" cy="5334000"/>
-            <wp:effectExtent l="0" t="0" r="8890" b="0"/>
+          <wp:inline distT="0" distB="0" distL="0" distR="0" wp14:anchorId="1E1BBD55" wp14:editId="5E7A1C00">
+            <wp:extent cx="2091397" cy="4108450"/>
+            <wp:effectExtent l="0" t="0" r="4445" b="6350"/>
             <wp:docPr id="3" name="Рисунок 3" descr="Anatomy of a system call, part 1 [LWN.net]"/>
             <wp:cNvGraphicFramePr>
               <a:graphicFrameLocks xmlns:a="http://schemas.openxmlformats.org/drawingml/2006/main" noChangeAspect="1"/>
@@ -3693,7 +3654,7 @@
                   <pic:spPr bwMode="auto">
                     <a:xfrm>
                       <a:off x="0" y="0"/>
-                      <a:ext cx="2715260" cy="5334000"/>
+                      <a:ext cx="2097545" cy="4120527"/>
                     </a:xfrm>
                     <a:prstGeom prst="rect">
                       <a:avLst/>
@@ -3788,6 +3749,16 @@
     </w:p>
     <w:p>
       <w:pPr>
+        <w:spacing w:line="360" w:lineRule="auto"/>
+        <w:jc w:val="center"/>
+        <w:rPr>
+          <w:sz w:val="28"/>
+          <w:szCs w:val="28"/>
+        </w:rPr>
+      </w:pPr>
+    </w:p>
+    <w:p>
+      <w:pPr>
         <w:pStyle w:val="a7"/>
         <w:numPr>
           <w:ilvl w:val="1"/>
@@ -3807,6 +3778,7 @@
           <w:sz w:val="28"/>
           <w:szCs w:val="28"/>
         </w:rPr>
+        <w:lastRenderedPageBreak/>
         <w:t>Сравнение с устаревшими механизмами</w:t>
       </w:r>
     </w:p>
@@ -4022,7 +3994,6 @@
           <w:sz w:val="28"/>
           <w:szCs w:val="28"/>
         </w:rPr>
-        <w:lastRenderedPageBreak/>
         <w:t xml:space="preserve">Инструкция </w:t>
       </w:r>
       <w:proofErr w:type="spellStart"/>
@@ -4132,106 +4103,6 @@
         </w:rPr>
         <w:t xml:space="preserve"> </w:t>
       </w:r>
-    </w:p>
-    <w:p>
-      <w:pPr>
-        <w:spacing w:line="360" w:lineRule="auto"/>
-        <w:jc w:val="both"/>
-        <w:rPr>
-          <w:sz w:val="28"/>
-          <w:szCs w:val="28"/>
-        </w:rPr>
-      </w:pPr>
-    </w:p>
-    <w:p>
-      <w:pPr>
-        <w:spacing w:line="360" w:lineRule="auto"/>
-        <w:jc w:val="both"/>
-        <w:rPr>
-          <w:sz w:val="28"/>
-          <w:szCs w:val="28"/>
-        </w:rPr>
-      </w:pPr>
-    </w:p>
-    <w:p>
-      <w:pPr>
-        <w:spacing w:line="360" w:lineRule="auto"/>
-        <w:jc w:val="both"/>
-        <w:rPr>
-          <w:sz w:val="28"/>
-          <w:szCs w:val="28"/>
-        </w:rPr>
-      </w:pPr>
-    </w:p>
-    <w:p>
-      <w:pPr>
-        <w:spacing w:line="360" w:lineRule="auto"/>
-        <w:jc w:val="both"/>
-        <w:rPr>
-          <w:sz w:val="28"/>
-          <w:szCs w:val="28"/>
-        </w:rPr>
-      </w:pPr>
-    </w:p>
-    <w:p>
-      <w:pPr>
-        <w:spacing w:line="360" w:lineRule="auto"/>
-        <w:jc w:val="both"/>
-        <w:rPr>
-          <w:sz w:val="28"/>
-          <w:szCs w:val="28"/>
-        </w:rPr>
-      </w:pPr>
-    </w:p>
-    <w:p>
-      <w:pPr>
-        <w:spacing w:line="360" w:lineRule="auto"/>
-        <w:jc w:val="both"/>
-        <w:rPr>
-          <w:sz w:val="28"/>
-          <w:szCs w:val="28"/>
-        </w:rPr>
-      </w:pPr>
-    </w:p>
-    <w:p>
-      <w:pPr>
-        <w:spacing w:line="360" w:lineRule="auto"/>
-        <w:jc w:val="both"/>
-        <w:rPr>
-          <w:sz w:val="28"/>
-          <w:szCs w:val="28"/>
-        </w:rPr>
-      </w:pPr>
-    </w:p>
-    <w:p>
-      <w:pPr>
-        <w:spacing w:line="360" w:lineRule="auto"/>
-        <w:jc w:val="both"/>
-        <w:rPr>
-          <w:sz w:val="28"/>
-          <w:szCs w:val="28"/>
-        </w:rPr>
-      </w:pPr>
-    </w:p>
-    <w:p>
-      <w:pPr>
-        <w:spacing w:line="360" w:lineRule="auto"/>
-        <w:jc w:val="both"/>
-        <w:rPr>
-          <w:sz w:val="28"/>
-          <w:szCs w:val="28"/>
-        </w:rPr>
-      </w:pPr>
-    </w:p>
-    <w:p>
-      <w:pPr>
-        <w:spacing w:line="360" w:lineRule="auto"/>
-        <w:jc w:val="both"/>
-        <w:rPr>
-          <w:sz w:val="28"/>
-          <w:szCs w:val="28"/>
-        </w:rPr>
-      </w:pPr>
     </w:p>
     <w:p>
       <w:pPr>
@@ -4381,7 +4252,6 @@
           <w:sz w:val="32"/>
           <w:szCs w:val="32"/>
         </w:rPr>
-        <w:lastRenderedPageBreak/>
         <w:t>Список литературы</w:t>
       </w:r>
     </w:p>

</xml_diff>

<commit_message>
UPDATE: отчет DATE: 2026-09-24 02:21:41
</commit_message>
<xml_diff>
--- a/Учеба 4 семестр/ОСИ/Курсовая работа/Курсовая работа.docx
+++ b/Учеба 4 семестр/ОСИ/Курсовая работа/Курсовая работа.docx
@@ -293,16 +293,8 @@
           <w:szCs w:val="28"/>
         </w:rPr>
         <w:tab/>
-      </w:r>
-      <w:proofErr w:type="spellStart"/>
-      <w:r>
-        <w:rPr>
-          <w:sz w:val="28"/>
-          <w:szCs w:val="28"/>
-        </w:rPr>
         <w:t>И.А.Эков</w:t>
       </w:r>
-      <w:proofErr w:type="spellEnd"/>
     </w:p>
     <w:p>
       <w:pPr>
@@ -345,16 +337,8 @@
           <w:szCs w:val="28"/>
         </w:rPr>
         <w:tab/>
-      </w:r>
-      <w:proofErr w:type="spellStart"/>
-      <w:r>
-        <w:rPr>
-          <w:sz w:val="28"/>
-          <w:szCs w:val="28"/>
-        </w:rPr>
         <w:t>Р.А.Ажермачев</w:t>
       </w:r>
-      <w:proofErr w:type="spellEnd"/>
     </w:p>
     <w:p>
       <w:pPr>
@@ -398,7 +382,6 @@
         </w:rPr>
         <w:tab/>
       </w:r>
-      <w:proofErr w:type="spellStart"/>
       <w:r>
         <w:rPr>
           <w:sz w:val="28"/>
@@ -406,7 +389,6 @@
         </w:rPr>
         <w:t>Т.Р.Рамазанов</w:t>
       </w:r>
-      <w:proofErr w:type="spellEnd"/>
     </w:p>
     <w:p>
       <w:pPr>
@@ -450,7 +432,6 @@
         </w:rPr>
         <w:tab/>
       </w:r>
-      <w:proofErr w:type="spellStart"/>
       <w:r>
         <w:rPr>
           <w:sz w:val="28"/>
@@ -458,7 +439,6 @@
         </w:rPr>
         <w:t>В.В.Иванов</w:t>
       </w:r>
-      <w:proofErr w:type="spellEnd"/>
     </w:p>
     <w:p>
       <w:pPr>
@@ -537,7 +517,6 @@
         </w:rPr>
         <w:tab/>
       </w:r>
-      <w:proofErr w:type="spellStart"/>
       <w:r>
         <w:rPr>
           <w:sz w:val="28"/>
@@ -545,7 +524,6 @@
         </w:rPr>
         <w:t>Г.Д.Гавва</w:t>
       </w:r>
-      <w:proofErr w:type="spellEnd"/>
     </w:p>
     <w:p>
       <w:pPr>
@@ -874,7 +852,6 @@
         </w:rPr>
         <w:t xml:space="preserve">Инструкция </w:t>
       </w:r>
-      <w:proofErr w:type="spellStart"/>
       <w:r>
         <w:rPr>
           <w:sz w:val="28"/>
@@ -883,7 +860,6 @@
         </w:rPr>
         <w:t>syscall</w:t>
       </w:r>
-      <w:proofErr w:type="spellEnd"/>
       <w:r>
         <w:rPr>
           <w:sz w:val="28"/>
@@ -1214,7 +1190,6 @@
         </w:rPr>
         <w:t xml:space="preserve">В архитектуре x86-64 переход из пользовательского режима в режим ядра реализован с помощью специализированной инструкции </w:t>
       </w:r>
-      <w:proofErr w:type="spellStart"/>
       <w:r>
         <w:rPr>
           <w:sz w:val="28"/>
@@ -1222,7 +1197,6 @@
         </w:rPr>
         <w:t>syscall</w:t>
       </w:r>
-      <w:proofErr w:type="spellEnd"/>
       <w:r>
         <w:rPr>
           <w:sz w:val="28"/>
@@ -1230,21 +1204,12 @@
         </w:rPr>
         <w:t xml:space="preserve">, пришедшей на смену устаревшим механизмам </w:t>
       </w:r>
-      <w:proofErr w:type="spellStart"/>
-      <w:r>
-        <w:rPr>
-          <w:sz w:val="28"/>
-          <w:szCs w:val="28"/>
-        </w:rPr>
-        <w:t>int</w:t>
-      </w:r>
-      <w:proofErr w:type="spellEnd"/>
-      <w:r>
-        <w:rPr>
-          <w:sz w:val="28"/>
-          <w:szCs w:val="28"/>
-        </w:rPr>
-        <w:t xml:space="preserve"> 0x80</w:t>
+      <w:r>
+        <w:rPr>
+          <w:sz w:val="28"/>
+          <w:szCs w:val="28"/>
+        </w:rPr>
+        <w:t>int 0x80</w:t>
       </w:r>
       <w:r>
         <w:rPr>
@@ -1253,7 +1218,6 @@
         </w:rPr>
         <w:t xml:space="preserve"> и </w:t>
       </w:r>
-      <w:proofErr w:type="spellStart"/>
       <w:r>
         <w:rPr>
           <w:sz w:val="28"/>
@@ -1261,7 +1225,6 @@
         </w:rPr>
         <w:t>sysenter</w:t>
       </w:r>
-      <w:proofErr w:type="spellEnd"/>
       <w:r>
         <w:rPr>
           <w:sz w:val="28"/>
@@ -1497,7 +1460,6 @@
         </w:rPr>
         <w:t xml:space="preserve">зучить механизм перехода в режим ядра в архитектуре x86-64, включая работу инструкции </w:t>
       </w:r>
-      <w:proofErr w:type="spellStart"/>
       <w:r>
         <w:rPr>
           <w:sz w:val="28"/>
@@ -1505,7 +1467,6 @@
         </w:rPr>
         <w:t>syscall</w:t>
       </w:r>
-      <w:proofErr w:type="spellEnd"/>
       <w:r>
         <w:rPr>
           <w:sz w:val="28"/>
@@ -2158,23 +2119,7 @@
           <w:sz w:val="28"/>
           <w:szCs w:val="28"/>
         </w:rPr>
-        <w:t xml:space="preserve">: </w:t>
-      </w:r>
-      <w:proofErr w:type="spellStart"/>
-      <w:r>
-        <w:rPr>
-          <w:sz w:val="28"/>
-          <w:szCs w:val="28"/>
-        </w:rPr>
-        <w:t>uname</w:t>
-      </w:r>
-      <w:proofErr w:type="spellEnd"/>
-      <w:r>
-        <w:rPr>
-          <w:sz w:val="28"/>
-          <w:szCs w:val="28"/>
-        </w:rPr>
-        <w:t xml:space="preserve"> -r. Нумерация ядра происходит по следующей X-Y-Z схеме: X - номер версии, Y - мажорный номер версии, Z - патч. </w:t>
+        <w:t xml:space="preserve">: uname -r. Нумерация ядра происходит по следующей X-Y-Z схеме: X - номер версии, Y - мажорный номер версии, Z - патч. </w:t>
       </w:r>
       <w:r>
         <w:rPr>
@@ -2188,55 +2133,7 @@
           <w:sz w:val="28"/>
           <w:szCs w:val="28"/>
         </w:rPr>
-        <w:t xml:space="preserve"> ядро может иметь различные ветки разработки, например основную и LTS (</w:t>
-      </w:r>
-      <w:proofErr w:type="spellStart"/>
-      <w:r>
-        <w:rPr>
-          <w:sz w:val="28"/>
-          <w:szCs w:val="28"/>
-        </w:rPr>
-        <w:t>long</w:t>
-      </w:r>
-      <w:proofErr w:type="spellEnd"/>
-      <w:r>
-        <w:rPr>
-          <w:sz w:val="28"/>
-          <w:szCs w:val="28"/>
-        </w:rPr>
-        <w:t xml:space="preserve"> </w:t>
-      </w:r>
-      <w:proofErr w:type="spellStart"/>
-      <w:r>
-        <w:rPr>
-          <w:sz w:val="28"/>
-          <w:szCs w:val="28"/>
-        </w:rPr>
-        <w:t>time</w:t>
-      </w:r>
-      <w:proofErr w:type="spellEnd"/>
-      <w:r>
-        <w:rPr>
-          <w:sz w:val="28"/>
-          <w:szCs w:val="28"/>
-        </w:rPr>
-        <w:t xml:space="preserve"> </w:t>
-      </w:r>
-      <w:proofErr w:type="spellStart"/>
-      <w:r>
-        <w:rPr>
-          <w:sz w:val="28"/>
-          <w:szCs w:val="28"/>
-        </w:rPr>
-        <w:t>support</w:t>
-      </w:r>
-      <w:proofErr w:type="spellEnd"/>
-      <w:r>
-        <w:rPr>
-          <w:sz w:val="28"/>
-          <w:szCs w:val="28"/>
-        </w:rPr>
-        <w:t>)</w:t>
+        <w:t xml:space="preserve"> ядро может иметь различные ветки разработки, например основную и LTS (long time support)</w:t>
       </w:r>
       <w:r>
         <w:rPr>
@@ -2460,17 +2357,8 @@
           <w:sz w:val="28"/>
           <w:szCs w:val="28"/>
         </w:rPr>
-        <w:t xml:space="preserve">оследовательность обращений, порождаемых командой чтения файла утилитой </w:t>
-      </w:r>
-      <w:proofErr w:type="spellStart"/>
-      <w:r>
-        <w:rPr>
-          <w:sz w:val="28"/>
-          <w:szCs w:val="28"/>
-        </w:rPr>
-        <w:t>cat</w:t>
-      </w:r>
-      <w:proofErr w:type="spellEnd"/>
+        <w:t>оследовательность обращений, порождаемых командой чтения файла утилитой cat</w:t>
+      </w:r>
       <w:r>
         <w:rPr>
           <w:sz w:val="28"/>
@@ -2523,103 +2411,7 @@
           <w:szCs w:val="28"/>
         </w:rPr>
         <w:lastRenderedPageBreak/>
-        <w:t xml:space="preserve">Когда пользователь вводит команду в командной оболочке </w:t>
-      </w:r>
-      <w:proofErr w:type="spellStart"/>
-      <w:r>
-        <w:rPr>
-          <w:sz w:val="28"/>
-          <w:szCs w:val="28"/>
-        </w:rPr>
-        <w:t>bash</w:t>
-      </w:r>
-      <w:proofErr w:type="spellEnd"/>
-      <w:r>
-        <w:rPr>
-          <w:sz w:val="28"/>
-          <w:szCs w:val="28"/>
-        </w:rPr>
-        <w:t xml:space="preserve">, оболочка запускает программу </w:t>
-      </w:r>
-      <w:proofErr w:type="spellStart"/>
-      <w:r>
-        <w:rPr>
-          <w:sz w:val="28"/>
-          <w:szCs w:val="28"/>
-        </w:rPr>
-        <w:t>cat</w:t>
-      </w:r>
-      <w:proofErr w:type="spellEnd"/>
-      <w:r>
-        <w:rPr>
-          <w:sz w:val="28"/>
-          <w:szCs w:val="28"/>
-        </w:rPr>
-        <w:t xml:space="preserve">. Для того чтобы прочитать содержимое файла и вывести его на экран, программа </w:t>
-      </w:r>
-      <w:proofErr w:type="spellStart"/>
-      <w:r>
-        <w:rPr>
-          <w:sz w:val="28"/>
-          <w:szCs w:val="28"/>
-        </w:rPr>
-        <w:t>cat</w:t>
-      </w:r>
-      <w:proofErr w:type="spellEnd"/>
-      <w:r>
-        <w:rPr>
-          <w:sz w:val="28"/>
-          <w:szCs w:val="28"/>
-        </w:rPr>
-        <w:t xml:space="preserve"> не может напрямую обратиться к диску или терминалу — эти ресурсы находятся под управлением ядра. Вместо этого она обращается к ядру через системные вызовы: </w:t>
-      </w:r>
-      <w:proofErr w:type="spellStart"/>
-      <w:r>
-        <w:rPr>
-          <w:sz w:val="28"/>
-          <w:szCs w:val="28"/>
-        </w:rPr>
-        <w:t>open</w:t>
-      </w:r>
-      <w:proofErr w:type="spellEnd"/>
-      <w:r>
-        <w:rPr>
-          <w:sz w:val="28"/>
-          <w:szCs w:val="28"/>
-        </w:rPr>
-        <w:t xml:space="preserve"> для открытия файла, </w:t>
-      </w:r>
-      <w:proofErr w:type="spellStart"/>
-      <w:r>
-        <w:rPr>
-          <w:sz w:val="28"/>
-          <w:szCs w:val="28"/>
-        </w:rPr>
-        <w:t>read</w:t>
-      </w:r>
-      <w:proofErr w:type="spellEnd"/>
-      <w:r>
-        <w:rPr>
-          <w:sz w:val="28"/>
-          <w:szCs w:val="28"/>
-        </w:rPr>
-        <w:t xml:space="preserve"> для чтения его содержимого и </w:t>
-      </w:r>
-      <w:proofErr w:type="spellStart"/>
-      <w:r>
-        <w:rPr>
-          <w:sz w:val="28"/>
-          <w:szCs w:val="28"/>
-        </w:rPr>
-        <w:t>write</w:t>
-      </w:r>
-      <w:proofErr w:type="spellEnd"/>
-      <w:r>
-        <w:rPr>
-          <w:sz w:val="28"/>
-          <w:szCs w:val="28"/>
-        </w:rPr>
-        <w:t xml:space="preserve"> для вывода данных. Каждый из этих вызовов инициирует переход в режим ядра, после чего ядро выполняет запрошенную операцию, взаимодействуя с файловой системой, драйвером диска и драйвером терминала.</w:t>
+        <w:t>Когда пользователь вводит команду в командной оболочке bash, оболочка запускает программу cat. Для того чтобы прочитать содержимое файла и вывести его на экран, программа cat не может напрямую обратиться к диску или терминалу — эти ресурсы находятся под управлением ядра. Вместо этого она обращается к ядру через системные вызовы: open для открытия файла, read для чтения его содержимого и write для вывода данных. Каждый из этих вызовов инициирует переход в режим ядра, после чего ядро выполняет запрошенную операцию, взаимодействуя с файловой системой, драйвером диска и драйвером терминала.</w:t>
       </w:r>
     </w:p>
     <w:p>
@@ -2895,7 +2687,6 @@
         </w:rPr>
         <w:t xml:space="preserve">Инструкция </w:t>
       </w:r>
-      <w:proofErr w:type="spellStart"/>
       <w:r>
         <w:rPr>
           <w:b/>
@@ -2906,7 +2697,6 @@
         </w:rPr>
         <w:t>syscall</w:t>
       </w:r>
-      <w:proofErr w:type="spellEnd"/>
       <w:r>
         <w:rPr>
           <w:b/>
@@ -2943,7 +2733,6 @@
         </w:rPr>
         <w:t xml:space="preserve">В современных системах переход в режим ядра осуществляется с помощью вызова инструкции </w:t>
       </w:r>
-      <w:proofErr w:type="spellStart"/>
       <w:r>
         <w:rPr>
           <w:sz w:val="28"/>
@@ -2952,7 +2741,6 @@
         </w:rPr>
         <w:t>syscall</w:t>
       </w:r>
-      <w:proofErr w:type="spellEnd"/>
       <w:r>
         <w:rPr>
           <w:sz w:val="28"/>
@@ -3231,6 +3019,7 @@
       <w:pPr>
         <w:spacing w:line="360" w:lineRule="auto"/>
         <w:ind w:firstLine="708"/>
+        <w:jc w:val="both"/>
         <w:rPr>
           <w:sz w:val="28"/>
           <w:szCs w:val="28"/>
@@ -3280,6 +3069,7 @@
           <w:numId w:val="9"/>
         </w:numPr>
         <w:spacing w:line="360" w:lineRule="auto"/>
+        <w:jc w:val="both"/>
         <w:rPr>
           <w:sz w:val="28"/>
           <w:szCs w:val="28"/>
@@ -3353,6 +3143,7 @@
           <w:numId w:val="9"/>
         </w:numPr>
         <w:spacing w:line="360" w:lineRule="auto"/>
+        <w:jc w:val="both"/>
         <w:rPr>
           <w:sz w:val="28"/>
           <w:szCs w:val="28"/>
@@ -3382,6 +3173,7 @@
           <w:numId w:val="9"/>
         </w:numPr>
         <w:spacing w:line="360" w:lineRule="auto"/>
+        <w:jc w:val="both"/>
         <w:rPr>
           <w:sz w:val="28"/>
           <w:szCs w:val="28"/>
@@ -3418,6 +3210,7 @@
           <w:numId w:val="9"/>
         </w:numPr>
         <w:spacing w:line="360" w:lineRule="auto"/>
+        <w:jc w:val="both"/>
         <w:rPr>
           <w:sz w:val="28"/>
           <w:szCs w:val="28"/>
@@ -3484,6 +3277,7 @@
           <w:numId w:val="9"/>
         </w:numPr>
         <w:spacing w:line="360" w:lineRule="auto"/>
+        <w:jc w:val="both"/>
         <w:rPr>
           <w:sz w:val="28"/>
           <w:szCs w:val="28"/>
@@ -3549,6 +3343,7 @@
           <w:numId w:val="9"/>
         </w:numPr>
         <w:spacing w:line="360" w:lineRule="auto"/>
+        <w:jc w:val="both"/>
         <w:rPr>
           <w:sz w:val="28"/>
           <w:szCs w:val="28"/>
@@ -3578,12 +3373,12 @@
           <w:numId w:val="9"/>
         </w:numPr>
         <w:spacing w:line="360" w:lineRule="auto"/>
-        <w:rPr>
-          <w:sz w:val="28"/>
-          <w:szCs w:val="28"/>
-        </w:rPr>
-      </w:pPr>
-      <w:proofErr w:type="spellStart"/>
+        <w:jc w:val="both"/>
+        <w:rPr>
+          <w:sz w:val="28"/>
+          <w:szCs w:val="28"/>
+        </w:rPr>
+      </w:pPr>
       <w:r>
         <w:rPr>
           <w:sz w:val="28"/>
@@ -3592,7 +3387,6 @@
         </w:rPr>
         <w:t>sysret</w:t>
       </w:r>
-      <w:proofErr w:type="spellEnd"/>
       <w:r>
         <w:rPr>
           <w:sz w:val="28"/>
@@ -3799,7 +3593,6 @@
         </w:rPr>
         <w:t xml:space="preserve">До появления инструкции </w:t>
       </w:r>
-      <w:proofErr w:type="spellStart"/>
       <w:r>
         <w:rPr>
           <w:sz w:val="28"/>
@@ -3808,7 +3601,6 @@
         </w:rPr>
         <w:t>syscall</w:t>
       </w:r>
-      <w:proofErr w:type="spellEnd"/>
       <w:r>
         <w:rPr>
           <w:sz w:val="28"/>
@@ -3954,7 +3746,6 @@
         </w:rPr>
         <w:t xml:space="preserve">Инструкция </w:t>
       </w:r>
-      <w:proofErr w:type="spellStart"/>
       <w:r>
         <w:rPr>
           <w:sz w:val="28"/>
@@ -3963,7 +3754,6 @@
         </w:rPr>
         <w:t>sysenter</w:t>
       </w:r>
-      <w:proofErr w:type="spellEnd"/>
       <w:r>
         <w:rPr>
           <w:sz w:val="28"/>
@@ -3994,115 +3784,1117 @@
           <w:sz w:val="28"/>
           <w:szCs w:val="28"/>
         </w:rPr>
-        <w:t xml:space="preserve">Инструкция </w:t>
-      </w:r>
-      <w:proofErr w:type="spellStart"/>
-      <w:r>
-        <w:rPr>
-          <w:sz w:val="28"/>
-          <w:szCs w:val="28"/>
+        <w:t>Инструкция syscall, разработанная компанией AMD для архитектуры x86-64, стала стандартом для 64-разрядных систем. Она обеспечивает наиболее быстрый переход в режим ядра за счёт использования регистров модели (MSR</w:t>
+      </w:r>
+      <w:r>
+        <w:rPr>
+          <w:sz w:val="28"/>
+          <w:szCs w:val="28"/>
+        </w:rPr>
+        <w:t xml:space="preserve"> – </w:t>
+      </w:r>
+      <w:r>
+        <w:rPr>
+          <w:sz w:val="28"/>
+          <w:szCs w:val="28"/>
+          <w:lang w:val="en-US"/>
+        </w:rPr>
+        <w:t>model</w:t>
+      </w:r>
+      <w:r>
+        <w:rPr>
+          <w:sz w:val="28"/>
+          <w:szCs w:val="28"/>
+        </w:rPr>
+        <w:t xml:space="preserve"> </w:t>
+      </w:r>
+      <w:r>
+        <w:rPr>
+          <w:sz w:val="28"/>
+          <w:szCs w:val="28"/>
+          <w:lang w:val="en-US"/>
+        </w:rPr>
+        <w:t>specific</w:t>
+      </w:r>
+      <w:r>
+        <w:rPr>
+          <w:sz w:val="28"/>
+          <w:szCs w:val="28"/>
+        </w:rPr>
+        <w:t xml:space="preserve"> </w:t>
+      </w:r>
+      <w:r>
+        <w:rPr>
+          <w:sz w:val="28"/>
+          <w:szCs w:val="28"/>
+          <w:lang w:val="en-US"/>
+        </w:rPr>
+        <w:t>register</w:t>
+      </w:r>
+      <w:r>
+        <w:rPr>
+          <w:sz w:val="28"/>
+          <w:szCs w:val="28"/>
+        </w:rPr>
+        <w:t>) вместо обращения к таблицам в памяти. В современных 64-разрядных версиях Linux именно syscall является основным механизмом, тогда как int 0x80 сохраняется преимущественно для обратной совместимости с 32-разрядными приложениями.</w:t>
+      </w:r>
+      <w:r>
+        <w:rPr>
+          <w:sz w:val="28"/>
+          <w:szCs w:val="28"/>
+        </w:rPr>
+        <w:t xml:space="preserve"> </w:t>
+      </w:r>
+    </w:p>
+    <w:p>
+      <w:pPr>
+        <w:spacing w:line="360" w:lineRule="auto"/>
+        <w:jc w:val="both"/>
+        <w:rPr>
+          <w:sz w:val="28"/>
+          <w:szCs w:val="28"/>
+        </w:rPr>
+      </w:pPr>
+    </w:p>
+    <w:p>
+      <w:pPr>
+        <w:pStyle w:val="a7"/>
+        <w:numPr>
+          <w:ilvl w:val="1"/>
+          <w:numId w:val="4"/>
+        </w:numPr>
+        <w:spacing w:line="360" w:lineRule="auto"/>
+        <w:jc w:val="center"/>
+        <w:rPr>
+          <w:b/>
+          <w:bCs/>
+          <w:sz w:val="28"/>
+          <w:szCs w:val="28"/>
+        </w:rPr>
+      </w:pPr>
+      <w:r>
+        <w:rPr>
+          <w:b/>
+          <w:bCs/>
+          <w:sz w:val="28"/>
+          <w:szCs w:val="28"/>
+        </w:rPr>
+        <w:t>Практическая демонстрация системных вызовов</w:t>
+      </w:r>
+    </w:p>
+    <w:p>
+      <w:pPr>
+        <w:spacing w:line="360" w:lineRule="auto"/>
+        <w:ind w:firstLine="708"/>
+        <w:jc w:val="both"/>
+        <w:rPr>
+          <w:sz w:val="28"/>
+          <w:szCs w:val="28"/>
+        </w:rPr>
+      </w:pPr>
+      <w:r>
+        <w:rPr>
+          <w:sz w:val="28"/>
+          <w:szCs w:val="28"/>
+        </w:rPr>
+        <w:t>Для подтверждения рассмотренного выше механизма системные вызовы были продемонстрированы на практике в операционной системе Ubuntu.</w:t>
+      </w:r>
+      <w:r>
+        <w:rPr>
+          <w:sz w:val="28"/>
+          <w:szCs w:val="28"/>
+        </w:rPr>
+        <w:t xml:space="preserve"> </w:t>
+      </w:r>
+      <w:r>
+        <w:rPr>
+          <w:sz w:val="28"/>
+          <w:szCs w:val="28"/>
+        </w:rPr>
+        <w:t>Целью демонстрации является наблюдение реальных обращений программ к ядру</w:t>
+      </w:r>
+      <w:r>
+        <w:rPr>
+          <w:sz w:val="28"/>
+          <w:szCs w:val="28"/>
+        </w:rPr>
+        <w:t xml:space="preserve">. </w:t>
+      </w:r>
+    </w:p>
+    <w:p>
+      <w:pPr>
+        <w:spacing w:line="360" w:lineRule="auto"/>
+        <w:ind w:firstLine="708"/>
+        <w:jc w:val="both"/>
+        <w:rPr>
+          <w:sz w:val="28"/>
+          <w:szCs w:val="28"/>
+        </w:rPr>
+      </w:pPr>
+      <w:r>
+        <w:rPr>
+          <w:sz w:val="28"/>
+          <w:szCs w:val="28"/>
+        </w:rPr>
+        <w:t>Утилита strace позволяет отследить все системные вызовы, выполняемые процессом</w:t>
+      </w:r>
+      <w:r>
+        <w:rPr>
+          <w:sz w:val="28"/>
+          <w:szCs w:val="28"/>
+        </w:rPr>
+        <w:t xml:space="preserve">. Были созданы две программы на языке </w:t>
+      </w:r>
+      <w:r>
+        <w:rPr>
+          <w:sz w:val="28"/>
+          <w:szCs w:val="28"/>
+          <w:lang w:val="en-US"/>
+        </w:rPr>
+        <w:t>C</w:t>
+      </w:r>
+      <w:r>
+        <w:rPr>
+          <w:sz w:val="28"/>
+          <w:szCs w:val="28"/>
+        </w:rPr>
+        <w:t xml:space="preserve"> [</w:t>
+      </w:r>
+      <w:r>
+        <w:rPr>
+          <w:sz w:val="28"/>
+          <w:szCs w:val="28"/>
+        </w:rPr>
+        <w:t>Рисунок 4</w:t>
+      </w:r>
+      <w:r>
+        <w:rPr>
+          <w:sz w:val="28"/>
+          <w:szCs w:val="28"/>
+        </w:rPr>
+        <w:t xml:space="preserve">] </w:t>
+      </w:r>
+      <w:r>
+        <w:rPr>
+          <w:sz w:val="28"/>
+          <w:szCs w:val="28"/>
+        </w:rPr>
+        <w:t>и ассемблере</w:t>
+      </w:r>
+      <w:r>
+        <w:rPr>
+          <w:sz w:val="28"/>
+          <w:szCs w:val="28"/>
+        </w:rPr>
+        <w:t xml:space="preserve"> [</w:t>
+      </w:r>
+      <w:r>
+        <w:rPr>
+          <w:sz w:val="28"/>
+          <w:szCs w:val="28"/>
+        </w:rPr>
+        <w:t xml:space="preserve">Рисунок </w:t>
+      </w:r>
+      <w:r>
+        <w:rPr>
+          <w:sz w:val="28"/>
+          <w:szCs w:val="28"/>
+        </w:rPr>
+        <w:t>6]</w:t>
+      </w:r>
+      <w:r>
+        <w:rPr>
+          <w:sz w:val="28"/>
+          <w:szCs w:val="28"/>
+        </w:rPr>
+        <w:t xml:space="preserve"> соответственно, которые демонстрируют обращения программ к ядру, а также достоверность теоретических данных. На </w:t>
+      </w:r>
+      <w:r>
+        <w:rPr>
+          <w:sz w:val="28"/>
+          <w:szCs w:val="28"/>
+        </w:rPr>
+        <w:t>[</w:t>
+      </w:r>
+      <w:r>
+        <w:rPr>
+          <w:sz w:val="28"/>
+          <w:szCs w:val="28"/>
+        </w:rPr>
+        <w:t>Рисунок 5</w:t>
+      </w:r>
+      <w:r>
+        <w:rPr>
+          <w:sz w:val="28"/>
+          <w:szCs w:val="28"/>
+        </w:rPr>
+        <w:t>]</w:t>
+      </w:r>
+      <w:r>
+        <w:rPr>
+          <w:sz w:val="28"/>
+          <w:szCs w:val="28"/>
+        </w:rPr>
+        <w:t xml:space="preserve"> показан полный жизненный цикл программы, с помощью утилиты </w:t>
+      </w:r>
+      <w:r>
+        <w:rPr>
+          <w:sz w:val="28"/>
+          <w:szCs w:val="28"/>
+          <w:lang w:val="en-US"/>
+        </w:rPr>
+        <w:t>strace</w:t>
+      </w:r>
+      <w:r>
+        <w:rPr>
+          <w:sz w:val="28"/>
+          <w:szCs w:val="28"/>
+        </w:rPr>
+        <w:t xml:space="preserve">. </w:t>
+      </w:r>
+      <w:r>
+        <w:rPr>
+          <w:sz w:val="28"/>
+          <w:szCs w:val="28"/>
+        </w:rPr>
+        <w:t xml:space="preserve">Вызов </w:t>
+      </w:r>
+      <w:r>
+        <w:rPr>
+          <w:sz w:val="28"/>
+          <w:szCs w:val="28"/>
+          <w:lang w:val="en-US"/>
+        </w:rPr>
+        <w:t>execve</w:t>
+      </w:r>
+      <w:r>
+        <w:rPr>
+          <w:sz w:val="28"/>
+          <w:szCs w:val="28"/>
+        </w:rPr>
+        <w:t xml:space="preserve"> запускает исполняемый файл, а последующие вызовы </w:t>
+      </w:r>
+      <w:r>
+        <w:rPr>
+          <w:sz w:val="28"/>
+          <w:szCs w:val="28"/>
+          <w:lang w:val="en-US"/>
+        </w:rPr>
+        <w:lastRenderedPageBreak/>
+        <w:t>openat</w:t>
+      </w:r>
+      <w:r>
+        <w:rPr>
+          <w:sz w:val="28"/>
+          <w:szCs w:val="28"/>
+        </w:rPr>
+        <w:t xml:space="preserve">, </w:t>
+      </w:r>
+      <w:r>
+        <w:rPr>
+          <w:sz w:val="28"/>
+          <w:szCs w:val="28"/>
+          <w:lang w:val="en-US"/>
+        </w:rPr>
+        <w:t>mmap</w:t>
+      </w:r>
+      <w:r>
+        <w:rPr>
+          <w:sz w:val="28"/>
+          <w:szCs w:val="28"/>
+        </w:rPr>
+        <w:t xml:space="preserve">, </w:t>
+      </w:r>
+      <w:r>
+        <w:rPr>
+          <w:sz w:val="28"/>
+          <w:szCs w:val="28"/>
+          <w:lang w:val="en-US"/>
+        </w:rPr>
+        <w:t>mprotect</w:t>
+      </w:r>
+      <w:r>
+        <w:rPr>
+          <w:sz w:val="28"/>
+          <w:szCs w:val="28"/>
+        </w:rPr>
+        <w:t xml:space="preserve"> </w:t>
+      </w:r>
+      <w:r>
+        <w:rPr>
+          <w:sz w:val="28"/>
+          <w:szCs w:val="28"/>
+        </w:rPr>
+        <w:t>–</w:t>
+      </w:r>
+      <w:r>
+        <w:rPr>
+          <w:sz w:val="28"/>
+          <w:szCs w:val="28"/>
+        </w:rPr>
+        <w:t xml:space="preserve"> </w:t>
+      </w:r>
+      <w:r>
+        <w:rPr>
+          <w:sz w:val="28"/>
+          <w:szCs w:val="28"/>
+        </w:rPr>
+        <w:t xml:space="preserve">выполняют загрузку библиотек в память. Это подтверждает, что даже простая программа обращается к ядру еще до выполнения. </w:t>
+      </w:r>
+      <w:r>
+        <w:rPr>
+          <w:sz w:val="28"/>
+          <w:szCs w:val="28"/>
+        </w:rPr>
+        <w:t>Ключевым является системный вызов write</w:t>
+      </w:r>
+      <w:r>
+        <w:rPr>
+          <w:sz w:val="28"/>
+          <w:szCs w:val="28"/>
+        </w:rPr>
+        <w:t xml:space="preserve">. </w:t>
+      </w:r>
+      <w:r>
+        <w:rPr>
+          <w:sz w:val="28"/>
+          <w:szCs w:val="28"/>
+        </w:rPr>
+        <w:t>Здесь первый аргумент 1 — файловый дескриптор стандартного вывода, второй аргумент — адрес выводимой строки, третий аргумент 33 — её длина в байтах. Возвращаемое значение = 33 означает, что ядро успешно записало 33 байта.</w:t>
+      </w:r>
+      <w:r>
+        <w:rPr>
+          <w:sz w:val="28"/>
+          <w:szCs w:val="28"/>
+        </w:rPr>
+        <w:t xml:space="preserve"> На </w:t>
+      </w:r>
+      <w:r>
+        <w:rPr>
+          <w:sz w:val="28"/>
+          <w:szCs w:val="28"/>
+        </w:rPr>
+        <w:t>[</w:t>
+      </w:r>
+      <w:r>
+        <w:rPr>
+          <w:sz w:val="28"/>
+          <w:szCs w:val="28"/>
+        </w:rPr>
+        <w:t>Рисунке 7</w:t>
+      </w:r>
+      <w:r>
+        <w:rPr>
+          <w:sz w:val="28"/>
+          <w:szCs w:val="28"/>
+        </w:rPr>
+        <w:t xml:space="preserve">] </w:t>
+      </w:r>
+      <w:r>
+        <w:rPr>
+          <w:sz w:val="28"/>
+          <w:szCs w:val="28"/>
+        </w:rPr>
+        <w:t>показан ожидаемый результат работы программы. Он подтверждает соглашение о передаче параметров, описанное выше.</w:t>
+      </w:r>
+    </w:p>
+    <w:p>
+      <w:pPr>
+        <w:spacing w:line="360" w:lineRule="auto"/>
+        <w:ind w:firstLine="708"/>
+        <w:rPr>
+          <w:sz w:val="28"/>
+          <w:szCs w:val="28"/>
+        </w:rPr>
+      </w:pPr>
+    </w:p>
+    <w:p>
+      <w:pPr>
+        <w:spacing w:line="360" w:lineRule="auto"/>
+        <w:ind w:firstLine="708"/>
+        <w:rPr>
+          <w:sz w:val="28"/>
+          <w:szCs w:val="28"/>
+        </w:rPr>
+      </w:pPr>
+    </w:p>
+    <w:p>
+      <w:pPr>
+        <w:spacing w:line="360" w:lineRule="auto"/>
+        <w:ind w:firstLine="708"/>
+        <w:jc w:val="center"/>
+        <w:rPr>
+          <w:sz w:val="28"/>
+          <w:szCs w:val="28"/>
+        </w:rPr>
+      </w:pPr>
+      <w:r>
+        <w:rPr>
+          <w:noProof/>
+          <w:sz w:val="28"/>
+          <w:szCs w:val="28"/>
+        </w:rPr>
+        <w:drawing>
+          <wp:inline distT="0" distB="0" distL="0" distR="0" wp14:anchorId="2143E2DF" wp14:editId="3948B5F8">
+            <wp:extent cx="5475510" cy="2927350"/>
+            <wp:effectExtent l="0" t="0" r="0" b="6350"/>
+            <wp:docPr id="7" name="Рисунок 7"/>
+            <wp:cNvGraphicFramePr>
+              <a:graphicFrameLocks xmlns:a="http://schemas.openxmlformats.org/drawingml/2006/main" noChangeAspect="1"/>
+            </wp:cNvGraphicFramePr>
+            <a:graphic xmlns:a="http://schemas.openxmlformats.org/drawingml/2006/main">
+              <a:graphicData uri="http://schemas.openxmlformats.org/drawingml/2006/picture">
+                <pic:pic xmlns:pic="http://schemas.openxmlformats.org/drawingml/2006/picture">
+                  <pic:nvPicPr>
+                    <pic:cNvPr id="0" name="Picture 2"/>
+                    <pic:cNvPicPr>
+                      <a:picLocks noChangeAspect="1" noChangeArrowheads="1"/>
+                    </pic:cNvPicPr>
+                  </pic:nvPicPr>
+                  <pic:blipFill>
+                    <a:blip r:embed="rId10">
+                      <a:extLst>
+                        <a:ext uri="{28A0092B-C50C-407E-A947-70E740481C1C}">
+                          <a14:useLocalDpi xmlns:a14="http://schemas.microsoft.com/office/drawing/2010/main" val="0"/>
+                        </a:ext>
+                      </a:extLst>
+                    </a:blip>
+                    <a:srcRect/>
+                    <a:stretch>
+                      <a:fillRect/>
+                    </a:stretch>
+                  </pic:blipFill>
+                  <pic:spPr bwMode="auto">
+                    <a:xfrm>
+                      <a:off x="0" y="0"/>
+                      <a:ext cx="5481406" cy="2930502"/>
+                    </a:xfrm>
+                    <a:prstGeom prst="rect">
+                      <a:avLst/>
+                    </a:prstGeom>
+                    <a:noFill/>
+                  </pic:spPr>
+                </pic:pic>
+              </a:graphicData>
+            </a:graphic>
+          </wp:inline>
+        </w:drawing>
+      </w:r>
+    </w:p>
+    <w:p>
+      <w:pPr>
+        <w:spacing w:line="360" w:lineRule="auto"/>
+        <w:ind w:firstLine="708"/>
+        <w:jc w:val="center"/>
+        <w:rPr>
+          <w:sz w:val="28"/>
+          <w:szCs w:val="28"/>
+        </w:rPr>
+      </w:pPr>
+      <w:r>
+        <w:rPr>
+          <w:sz w:val="28"/>
+          <w:szCs w:val="28"/>
+        </w:rPr>
+        <w:t xml:space="preserve">Рисунок 4. Программа, в которой происходит системный вызов с параметром вызова </w:t>
+      </w:r>
+      <w:r>
+        <w:rPr>
+          <w:sz w:val="28"/>
+          <w:szCs w:val="28"/>
+          <w:lang w:val="en-US"/>
+        </w:rPr>
+        <w:t>write</w:t>
+      </w:r>
+    </w:p>
+    <w:p>
+      <w:pPr>
+        <w:spacing w:line="360" w:lineRule="auto"/>
+        <w:ind w:firstLine="708"/>
+        <w:jc w:val="center"/>
+        <w:rPr>
+          <w:sz w:val="28"/>
+          <w:szCs w:val="28"/>
+        </w:rPr>
+      </w:pPr>
+    </w:p>
+    <w:p>
+      <w:pPr>
+        <w:spacing w:line="360" w:lineRule="auto"/>
+        <w:ind w:firstLine="708"/>
+        <w:jc w:val="center"/>
+        <w:rPr>
+          <w:sz w:val="28"/>
+          <w:szCs w:val="28"/>
+        </w:rPr>
+      </w:pPr>
+      <w:r>
+        <w:rPr>
+          <w:noProof/>
+          <w:sz w:val="28"/>
+          <w:szCs w:val="28"/>
+        </w:rPr>
+        <w:lastRenderedPageBreak/>
+        <w:drawing>
+          <wp:inline distT="0" distB="0" distL="0" distR="0" wp14:anchorId="403F60DB" wp14:editId="4F7D9F0A">
+            <wp:extent cx="5574142" cy="2971081"/>
+            <wp:effectExtent l="0" t="0" r="7620" b="1270"/>
+            <wp:docPr id="9" name="Рисунок 9"/>
+            <wp:cNvGraphicFramePr>
+              <a:graphicFrameLocks xmlns:a="http://schemas.openxmlformats.org/drawingml/2006/main" noChangeAspect="1"/>
+            </wp:cNvGraphicFramePr>
+            <a:graphic xmlns:a="http://schemas.openxmlformats.org/drawingml/2006/main">
+              <a:graphicData uri="http://schemas.openxmlformats.org/drawingml/2006/picture">
+                <pic:pic xmlns:pic="http://schemas.openxmlformats.org/drawingml/2006/picture">
+                  <pic:nvPicPr>
+                    <pic:cNvPr id="0" name="Picture 3"/>
+                    <pic:cNvPicPr>
+                      <a:picLocks noChangeAspect="1" noChangeArrowheads="1"/>
+                    </pic:cNvPicPr>
+                  </pic:nvPicPr>
+                  <pic:blipFill>
+                    <a:blip r:embed="rId11">
+                      <a:extLst>
+                        <a:ext uri="{28A0092B-C50C-407E-A947-70E740481C1C}">
+                          <a14:useLocalDpi xmlns:a14="http://schemas.microsoft.com/office/drawing/2010/main" val="0"/>
+                        </a:ext>
+                      </a:extLst>
+                    </a:blip>
+                    <a:srcRect/>
+                    <a:stretch>
+                      <a:fillRect/>
+                    </a:stretch>
+                  </pic:blipFill>
+                  <pic:spPr bwMode="auto">
+                    <a:xfrm>
+                      <a:off x="0" y="0"/>
+                      <a:ext cx="5615849" cy="2993311"/>
+                    </a:xfrm>
+                    <a:prstGeom prst="rect">
+                      <a:avLst/>
+                    </a:prstGeom>
+                    <a:noFill/>
+                  </pic:spPr>
+                </pic:pic>
+              </a:graphicData>
+            </a:graphic>
+          </wp:inline>
+        </w:drawing>
+      </w:r>
+    </w:p>
+    <w:p>
+      <w:pPr>
+        <w:spacing w:line="360" w:lineRule="auto"/>
+        <w:ind w:firstLine="708"/>
+        <w:jc w:val="center"/>
+        <w:rPr>
+          <w:sz w:val="28"/>
+          <w:szCs w:val="28"/>
+        </w:rPr>
+      </w:pPr>
+      <w:r>
+        <w:rPr>
+          <w:sz w:val="28"/>
+          <w:szCs w:val="28"/>
+        </w:rPr>
+        <w:t>Рисунок 5. Жизненный цикл программы</w:t>
+      </w:r>
+    </w:p>
+    <w:p>
+      <w:pPr>
+        <w:spacing w:line="360" w:lineRule="auto"/>
+        <w:ind w:firstLine="708"/>
+        <w:rPr>
+          <w:sz w:val="28"/>
+          <w:szCs w:val="28"/>
+        </w:rPr>
+      </w:pPr>
+    </w:p>
+    <w:p>
+      <w:pPr>
+        <w:spacing w:line="360" w:lineRule="auto"/>
+        <w:jc w:val="center"/>
+        <w:rPr>
+          <w:sz w:val="28"/>
+          <w:szCs w:val="28"/>
+        </w:rPr>
+      </w:pPr>
+      <w:r>
+        <w:rPr>
+          <w:noProof/>
+          <w:sz w:val="28"/>
+          <w:szCs w:val="28"/>
+        </w:rPr>
+        <w:drawing>
+          <wp:inline distT="0" distB="0" distL="0" distR="0" wp14:anchorId="6938AB65" wp14:editId="42F0B59B">
+            <wp:extent cx="5972175" cy="4476750"/>
+            <wp:effectExtent l="0" t="0" r="9525" b="0"/>
+            <wp:docPr id="11" name="Рисунок 11"/>
+            <wp:cNvGraphicFramePr>
+              <a:graphicFrameLocks xmlns:a="http://schemas.openxmlformats.org/drawingml/2006/main" noChangeAspect="1"/>
+            </wp:cNvGraphicFramePr>
+            <a:graphic xmlns:a="http://schemas.openxmlformats.org/drawingml/2006/main">
+              <a:graphicData uri="http://schemas.openxmlformats.org/drawingml/2006/picture">
+                <pic:pic xmlns:pic="http://schemas.openxmlformats.org/drawingml/2006/picture">
+                  <pic:nvPicPr>
+                    <pic:cNvPr id="0" name="Picture 4"/>
+                    <pic:cNvPicPr>
+                      <a:picLocks noChangeAspect="1" noChangeArrowheads="1"/>
+                    </pic:cNvPicPr>
+                  </pic:nvPicPr>
+                  <pic:blipFill>
+                    <a:blip r:embed="rId12">
+                      <a:extLst>
+                        <a:ext uri="{28A0092B-C50C-407E-A947-70E740481C1C}">
+                          <a14:useLocalDpi xmlns:a14="http://schemas.microsoft.com/office/drawing/2010/main" val="0"/>
+                        </a:ext>
+                      </a:extLst>
+                    </a:blip>
+                    <a:srcRect/>
+                    <a:stretch>
+                      <a:fillRect/>
+                    </a:stretch>
+                  </pic:blipFill>
+                  <pic:spPr bwMode="auto">
+                    <a:xfrm>
+                      <a:off x="0" y="0"/>
+                      <a:ext cx="5972175" cy="4476750"/>
+                    </a:xfrm>
+                    <a:prstGeom prst="rect">
+                      <a:avLst/>
+                    </a:prstGeom>
+                    <a:noFill/>
+                  </pic:spPr>
+                </pic:pic>
+              </a:graphicData>
+            </a:graphic>
+          </wp:inline>
+        </w:drawing>
+      </w:r>
+    </w:p>
+    <w:p>
+      <w:pPr>
+        <w:spacing w:line="360" w:lineRule="auto"/>
+        <w:jc w:val="center"/>
+        <w:rPr>
+          <w:sz w:val="28"/>
+          <w:szCs w:val="28"/>
+          <w:lang w:val="en-US"/>
+        </w:rPr>
+      </w:pPr>
+      <w:r>
+        <w:rPr>
+          <w:sz w:val="28"/>
+          <w:szCs w:val="28"/>
+        </w:rPr>
+        <w:t xml:space="preserve">Рисунок 6. Демонстрация регистров и их назначения в </w:t>
+      </w:r>
+      <w:r>
+        <w:rPr>
+          <w:sz w:val="28"/>
+          <w:szCs w:val="28"/>
+          <w:lang w:val="en-US"/>
         </w:rPr>
         <w:t>syscall</w:t>
       </w:r>
-      <w:proofErr w:type="spellEnd"/>
-      <w:r>
-        <w:rPr>
-          <w:sz w:val="28"/>
-          <w:szCs w:val="28"/>
-        </w:rPr>
-        <w:t>, разработанная компанией AMD для архитектуры x86-64, стала стандартом для 64-разрядных систем. Она обеспечивает наиболее быстрый переход в режим ядра за счёт использования регистров модели (MSR</w:t>
-      </w:r>
-      <w:r>
-        <w:rPr>
-          <w:sz w:val="28"/>
-          <w:szCs w:val="28"/>
-        </w:rPr>
-        <w:t xml:space="preserve"> – </w:t>
-      </w:r>
-      <w:r>
+    </w:p>
+    <w:p>
+      <w:pPr>
+        <w:spacing w:line="360" w:lineRule="auto"/>
+        <w:jc w:val="center"/>
         <w:rPr>
           <w:sz w:val="28"/>
           <w:szCs w:val="28"/>
           <w:lang w:val="en-US"/>
         </w:rPr>
-        <w:t>model</w:t>
-      </w:r>
-      <w:r>
-        <w:rPr>
-          <w:sz w:val="28"/>
-          <w:szCs w:val="28"/>
-        </w:rPr>
-        <w:t xml:space="preserve"> </w:t>
-      </w:r>
-      <w:r>
-        <w:rPr>
-          <w:sz w:val="28"/>
-          <w:szCs w:val="28"/>
-          <w:lang w:val="en-US"/>
-        </w:rPr>
-        <w:t>specific</w:t>
-      </w:r>
-      <w:r>
-        <w:rPr>
-          <w:sz w:val="28"/>
-          <w:szCs w:val="28"/>
-        </w:rPr>
-        <w:t xml:space="preserve"> </w:t>
-      </w:r>
-      <w:r>
-        <w:rPr>
-          <w:sz w:val="28"/>
-          <w:szCs w:val="28"/>
-          <w:lang w:val="en-US"/>
-        </w:rPr>
-        <w:t>register</w:t>
-      </w:r>
-      <w:r>
-        <w:rPr>
-          <w:sz w:val="28"/>
-          <w:szCs w:val="28"/>
-        </w:rPr>
-        <w:t xml:space="preserve">) вместо обращения к таблицам в памяти. В современных 64-разрядных версиях Linux именно </w:t>
-      </w:r>
-      <w:proofErr w:type="spellStart"/>
-      <w:r>
-        <w:rPr>
-          <w:sz w:val="28"/>
-          <w:szCs w:val="28"/>
-        </w:rPr>
-        <w:t>syscall</w:t>
-      </w:r>
-      <w:proofErr w:type="spellEnd"/>
-      <w:r>
-        <w:rPr>
-          <w:sz w:val="28"/>
-          <w:szCs w:val="28"/>
-        </w:rPr>
-        <w:t xml:space="preserve"> является основным механизмом, тогда как </w:t>
-      </w:r>
-      <w:proofErr w:type="spellStart"/>
-      <w:r>
-        <w:rPr>
-          <w:sz w:val="28"/>
-          <w:szCs w:val="28"/>
-        </w:rPr>
-        <w:t>int</w:t>
-      </w:r>
-      <w:proofErr w:type="spellEnd"/>
-      <w:r>
-        <w:rPr>
-          <w:sz w:val="28"/>
-          <w:szCs w:val="28"/>
-        </w:rPr>
-        <w:t xml:space="preserve"> 0x80 сохраняется преимущественно для обратной совместимости с 32-разрядными приложениями.</w:t>
-      </w:r>
-      <w:r>
-        <w:rPr>
-          <w:sz w:val="28"/>
-          <w:szCs w:val="28"/>
-        </w:rPr>
-        <w:t xml:space="preserve"> </w:t>
-      </w:r>
+      </w:pPr>
+      <w:r>
+        <w:rPr>
+          <w:noProof/>
+          <w:sz w:val="28"/>
+          <w:szCs w:val="28"/>
+        </w:rPr>
+        <w:lastRenderedPageBreak/>
+        <w:drawing>
+          <wp:inline distT="0" distB="0" distL="0" distR="0" wp14:anchorId="0CFD4F1F" wp14:editId="7223CCEE">
+            <wp:extent cx="5638800" cy="876300"/>
+            <wp:effectExtent l="0" t="0" r="0" b="0"/>
+            <wp:docPr id="13" name="Рисунок 13"/>
+            <wp:cNvGraphicFramePr>
+              <a:graphicFrameLocks xmlns:a="http://schemas.openxmlformats.org/drawingml/2006/main" noChangeAspect="1"/>
+            </wp:cNvGraphicFramePr>
+            <a:graphic xmlns:a="http://schemas.openxmlformats.org/drawingml/2006/main">
+              <a:graphicData uri="http://schemas.openxmlformats.org/drawingml/2006/picture">
+                <pic:pic xmlns:pic="http://schemas.openxmlformats.org/drawingml/2006/picture">
+                  <pic:nvPicPr>
+                    <pic:cNvPr id="0" name="Picture 5"/>
+                    <pic:cNvPicPr>
+                      <a:picLocks noChangeAspect="1" noChangeArrowheads="1"/>
+                    </pic:cNvPicPr>
+                  </pic:nvPicPr>
+                  <pic:blipFill>
+                    <a:blip r:embed="rId13">
+                      <a:extLst>
+                        <a:ext uri="{28A0092B-C50C-407E-A947-70E740481C1C}">
+                          <a14:useLocalDpi xmlns:a14="http://schemas.microsoft.com/office/drawing/2010/main" val="0"/>
+                        </a:ext>
+                      </a:extLst>
+                    </a:blip>
+                    <a:srcRect/>
+                    <a:stretch>
+                      <a:fillRect/>
+                    </a:stretch>
+                  </pic:blipFill>
+                  <pic:spPr bwMode="auto">
+                    <a:xfrm>
+                      <a:off x="0" y="0"/>
+                      <a:ext cx="5638800" cy="876300"/>
+                    </a:xfrm>
+                    <a:prstGeom prst="rect">
+                      <a:avLst/>
+                    </a:prstGeom>
+                    <a:noFill/>
+                  </pic:spPr>
+                </pic:pic>
+              </a:graphicData>
+            </a:graphic>
+          </wp:inline>
+        </w:drawing>
+      </w:r>
+    </w:p>
+    <w:p>
+      <w:pPr>
+        <w:spacing w:line="360" w:lineRule="auto"/>
+        <w:jc w:val="center"/>
+        <w:rPr>
+          <w:sz w:val="28"/>
+          <w:szCs w:val="28"/>
+        </w:rPr>
+      </w:pPr>
+      <w:r>
+        <w:rPr>
+          <w:sz w:val="28"/>
+          <w:szCs w:val="28"/>
+        </w:rPr>
+        <w:t>Рисунок 7. Программа завершилась успехом</w:t>
+      </w:r>
+    </w:p>
+    <w:p>
+      <w:pPr>
+        <w:spacing w:line="360" w:lineRule="auto"/>
+        <w:jc w:val="both"/>
+        <w:rPr>
+          <w:sz w:val="28"/>
+          <w:szCs w:val="28"/>
+        </w:rPr>
+      </w:pPr>
+    </w:p>
+    <w:p>
+      <w:pPr>
+        <w:spacing w:line="360" w:lineRule="auto"/>
+        <w:jc w:val="both"/>
+        <w:rPr>
+          <w:sz w:val="28"/>
+          <w:szCs w:val="28"/>
+        </w:rPr>
+      </w:pPr>
+    </w:p>
+    <w:p>
+      <w:pPr>
+        <w:spacing w:line="360" w:lineRule="auto"/>
+        <w:jc w:val="both"/>
+        <w:rPr>
+          <w:sz w:val="28"/>
+          <w:szCs w:val="28"/>
+        </w:rPr>
+      </w:pPr>
+    </w:p>
+    <w:p>
+      <w:pPr>
+        <w:spacing w:line="360" w:lineRule="auto"/>
+        <w:jc w:val="both"/>
+        <w:rPr>
+          <w:sz w:val="28"/>
+          <w:szCs w:val="28"/>
+        </w:rPr>
+      </w:pPr>
+    </w:p>
+    <w:p>
+      <w:pPr>
+        <w:spacing w:line="360" w:lineRule="auto"/>
+        <w:jc w:val="both"/>
+        <w:rPr>
+          <w:sz w:val="28"/>
+          <w:szCs w:val="28"/>
+        </w:rPr>
+      </w:pPr>
+    </w:p>
+    <w:p>
+      <w:pPr>
+        <w:spacing w:line="360" w:lineRule="auto"/>
+        <w:jc w:val="both"/>
+        <w:rPr>
+          <w:sz w:val="28"/>
+          <w:szCs w:val="28"/>
+        </w:rPr>
+      </w:pPr>
+    </w:p>
+    <w:p>
+      <w:pPr>
+        <w:spacing w:line="360" w:lineRule="auto"/>
+        <w:jc w:val="both"/>
+        <w:rPr>
+          <w:sz w:val="28"/>
+          <w:szCs w:val="28"/>
+        </w:rPr>
+      </w:pPr>
+    </w:p>
+    <w:p>
+      <w:pPr>
+        <w:spacing w:line="360" w:lineRule="auto"/>
+        <w:jc w:val="both"/>
+        <w:rPr>
+          <w:sz w:val="28"/>
+          <w:szCs w:val="28"/>
+        </w:rPr>
+      </w:pPr>
+    </w:p>
+    <w:p>
+      <w:pPr>
+        <w:spacing w:line="360" w:lineRule="auto"/>
+        <w:jc w:val="both"/>
+        <w:rPr>
+          <w:sz w:val="28"/>
+          <w:szCs w:val="28"/>
+        </w:rPr>
+      </w:pPr>
+    </w:p>
+    <w:p>
+      <w:pPr>
+        <w:spacing w:line="360" w:lineRule="auto"/>
+        <w:jc w:val="both"/>
+        <w:rPr>
+          <w:sz w:val="28"/>
+          <w:szCs w:val="28"/>
+        </w:rPr>
+      </w:pPr>
+    </w:p>
+    <w:p>
+      <w:pPr>
+        <w:pStyle w:val="a7"/>
+        <w:numPr>
+          <w:ilvl w:val="0"/>
+          <w:numId w:val="4"/>
+        </w:numPr>
+        <w:spacing w:line="360" w:lineRule="auto"/>
+        <w:jc w:val="center"/>
+        <w:rPr>
+          <w:b/>
+          <w:bCs/>
+          <w:sz w:val="32"/>
+          <w:szCs w:val="32"/>
+        </w:rPr>
+      </w:pPr>
+      <w:r>
+        <w:rPr>
+          <w:b/>
+          <w:bCs/>
+          <w:sz w:val="32"/>
+          <w:szCs w:val="32"/>
+        </w:rPr>
+        <w:t>Р</w:t>
+      </w:r>
+      <w:r>
+        <w:rPr>
+          <w:b/>
+          <w:bCs/>
+          <w:sz w:val="32"/>
+          <w:szCs w:val="32"/>
+        </w:rPr>
+        <w:t>азработка собственного системного вызова для Linux</w:t>
+      </w:r>
+    </w:p>
+    <w:p>
+      <w:pPr>
+        <w:spacing w:line="360" w:lineRule="auto"/>
+        <w:ind w:left="360"/>
+        <w:jc w:val="center"/>
+        <w:rPr>
+          <w:b/>
+          <w:bCs/>
+          <w:sz w:val="28"/>
+          <w:szCs w:val="28"/>
+        </w:rPr>
+      </w:pPr>
+      <w:r>
+        <w:rPr>
+          <w:b/>
+          <w:bCs/>
+          <w:sz w:val="28"/>
+          <w:szCs w:val="28"/>
+        </w:rPr>
+        <w:t xml:space="preserve">2.1. </w:t>
+      </w:r>
+    </w:p>
+    <w:p>
+      <w:pPr>
+        <w:spacing w:line="360" w:lineRule="auto"/>
+        <w:jc w:val="both"/>
+        <w:rPr>
+          <w:sz w:val="28"/>
+          <w:szCs w:val="28"/>
+        </w:rPr>
+      </w:pPr>
+    </w:p>
+    <w:p>
+      <w:pPr>
+        <w:spacing w:line="360" w:lineRule="auto"/>
+        <w:jc w:val="both"/>
+        <w:rPr>
+          <w:sz w:val="28"/>
+          <w:szCs w:val="28"/>
+        </w:rPr>
+      </w:pPr>
+    </w:p>
+    <w:p>
+      <w:pPr>
+        <w:spacing w:line="360" w:lineRule="auto"/>
+        <w:jc w:val="both"/>
+        <w:rPr>
+          <w:sz w:val="28"/>
+          <w:szCs w:val="28"/>
+        </w:rPr>
+      </w:pPr>
+    </w:p>
+    <w:p>
+      <w:pPr>
+        <w:spacing w:line="360" w:lineRule="auto"/>
+        <w:jc w:val="both"/>
+        <w:rPr>
+          <w:sz w:val="28"/>
+          <w:szCs w:val="28"/>
+        </w:rPr>
+      </w:pPr>
+    </w:p>
+    <w:p>
+      <w:pPr>
+        <w:spacing w:line="360" w:lineRule="auto"/>
+        <w:jc w:val="both"/>
+        <w:rPr>
+          <w:sz w:val="28"/>
+          <w:szCs w:val="28"/>
+        </w:rPr>
+      </w:pPr>
+    </w:p>
+    <w:p>
+      <w:pPr>
+        <w:spacing w:line="360" w:lineRule="auto"/>
+        <w:jc w:val="both"/>
+        <w:rPr>
+          <w:sz w:val="28"/>
+          <w:szCs w:val="28"/>
+        </w:rPr>
+      </w:pPr>
+    </w:p>
+    <w:p>
+      <w:pPr>
+        <w:spacing w:line="360" w:lineRule="auto"/>
+        <w:jc w:val="both"/>
+        <w:rPr>
+          <w:sz w:val="28"/>
+          <w:szCs w:val="28"/>
+        </w:rPr>
+      </w:pPr>
+    </w:p>
+    <w:p>
+      <w:pPr>
+        <w:spacing w:line="360" w:lineRule="auto"/>
+        <w:jc w:val="both"/>
+        <w:rPr>
+          <w:sz w:val="28"/>
+          <w:szCs w:val="28"/>
+        </w:rPr>
+      </w:pPr>
+    </w:p>
+    <w:p>
+      <w:pPr>
+        <w:spacing w:line="360" w:lineRule="auto"/>
+        <w:jc w:val="both"/>
+        <w:rPr>
+          <w:sz w:val="28"/>
+          <w:szCs w:val="28"/>
+        </w:rPr>
+      </w:pPr>
+    </w:p>
+    <w:p>
+      <w:pPr>
+        <w:spacing w:line="360" w:lineRule="auto"/>
+        <w:jc w:val="both"/>
+        <w:rPr>
+          <w:sz w:val="28"/>
+          <w:szCs w:val="28"/>
+        </w:rPr>
+      </w:pPr>
+    </w:p>
+    <w:p>
+      <w:pPr>
+        <w:spacing w:line="360" w:lineRule="auto"/>
+        <w:jc w:val="both"/>
+        <w:rPr>
+          <w:sz w:val="28"/>
+          <w:szCs w:val="28"/>
+        </w:rPr>
+      </w:pPr>
+    </w:p>
+    <w:p>
+      <w:pPr>
+        <w:spacing w:line="360" w:lineRule="auto"/>
+        <w:jc w:val="both"/>
+        <w:rPr>
+          <w:sz w:val="28"/>
+          <w:szCs w:val="28"/>
+        </w:rPr>
+      </w:pPr>
+    </w:p>
+    <w:p>
+      <w:pPr>
+        <w:spacing w:line="360" w:lineRule="auto"/>
+        <w:jc w:val="both"/>
+        <w:rPr>
+          <w:sz w:val="28"/>
+          <w:szCs w:val="28"/>
+        </w:rPr>
+      </w:pPr>
+    </w:p>
+    <w:p>
+      <w:pPr>
+        <w:spacing w:line="360" w:lineRule="auto"/>
+        <w:jc w:val="both"/>
+        <w:rPr>
+          <w:sz w:val="28"/>
+          <w:szCs w:val="28"/>
+        </w:rPr>
+      </w:pPr>
+    </w:p>
+    <w:p>
+      <w:pPr>
+        <w:spacing w:line="360" w:lineRule="auto"/>
+        <w:jc w:val="both"/>
+        <w:rPr>
+          <w:sz w:val="28"/>
+          <w:szCs w:val="28"/>
+        </w:rPr>
+      </w:pPr>
+    </w:p>
+    <w:p>
+      <w:pPr>
+        <w:spacing w:line="360" w:lineRule="auto"/>
+        <w:jc w:val="both"/>
+        <w:rPr>
+          <w:sz w:val="28"/>
+          <w:szCs w:val="28"/>
+        </w:rPr>
+      </w:pPr>
     </w:p>
     <w:p>
       <w:pPr>
@@ -4338,7 +5130,7 @@
         </w:rPr>
         <w:t xml:space="preserve">: </w:t>
       </w:r>
-      <w:hyperlink r:id="rId10" w:tgtFrame="_blank" w:history="1">
+      <w:hyperlink r:id="rId14" w:tgtFrame="_blank" w:history="1">
         <w:r>
           <w:rPr>
             <w:rStyle w:val="af1"/>
@@ -4374,7 +5166,7 @@
       </w:pPr>
     </w:p>
     <w:sectPr>
-      <w:footerReference w:type="default" r:id="rId11"/>
+      <w:footerReference w:type="default" r:id="rId15"/>
       <w:pgSz w:w="11906" w:h="16838"/>
       <w:pgMar w:top="1134" w:right="850" w:bottom="1134" w:left="1701" w:header="708" w:footer="708" w:gutter="0"/>
       <w:cols w:space="708"/>

</xml_diff>

<commit_message>
vault backup: 2026-09-24 18:36:06
</commit_message>
<xml_diff>
--- a/Учеба 4 семестр/ОСИ/Курсовая работа/Курсовая работа.docx
+++ b/Учеба 4 семестр/ОСИ/Курсовая работа/Курсовая работа.docx
@@ -5476,17 +5476,7 @@
           <w:szCs w:val="19"/>
           <w:lang w:val="en-US"/>
         </w:rPr>
-        <w:t>sys_task_</w:t>
-      </w:r>
-      <w:proofErr w:type="gramStart"/>
-      <w:r>
-        <w:rPr>
-          <w:rFonts w:ascii="Courier New" w:hAnsi="Courier New" w:cs="Courier New"/>
-          <w:sz w:val="19"/>
-          <w:szCs w:val="19"/>
-          <w:lang w:val="en-US"/>
-        </w:rPr>
-        <w:t>stats</w:t>
+        <w:t>sys_task_stats</w:t>
       </w:r>
       <w:proofErr w:type="spellEnd"/>
       <w:r>
@@ -5499,7 +5489,6 @@
         <w:t>(</w:t>
       </w:r>
       <w:proofErr w:type="spellStart"/>
-      <w:proofErr w:type="gramEnd"/>
       <w:r>
         <w:rPr>
           <w:rFonts w:ascii="Courier New" w:hAnsi="Courier New" w:cs="Courier New"/>
@@ -5741,7 +5730,6 @@
         <w:t xml:space="preserve"> сверху значением </w:t>
       </w:r>
       <w:proofErr w:type="spellStart"/>
-      <w:proofErr w:type="gramStart"/>
       <w:r>
         <w:rPr>
           <w:sz w:val="28"/>
@@ -5758,7 +5746,6 @@
         <w:t>(</w:t>
       </w:r>
       <w:proofErr w:type="spellStart"/>
-      <w:proofErr w:type="gramEnd"/>
       <w:r>
         <w:rPr>
           <w:sz w:val="28"/>
@@ -5968,25 +5955,14 @@
         <w:t xml:space="preserve">449    common    </w:t>
       </w:r>
       <w:proofErr w:type="spellStart"/>
-      <w:proofErr w:type="gramStart"/>
-      <w:r>
-        <w:rPr>
-          <w:rFonts w:ascii="Courier New" w:hAnsi="Courier New" w:cs="Courier New"/>
-          <w:sz w:val="19"/>
-          <w:szCs w:val="19"/>
-          <w:lang w:val="en-US"/>
-        </w:rPr>
-        <w:t>task</w:t>
-      </w:r>
-      <w:proofErr w:type="gramEnd"/>
-      <w:r>
-        <w:rPr>
-          <w:rFonts w:ascii="Courier New" w:hAnsi="Courier New" w:cs="Courier New"/>
-          <w:sz w:val="19"/>
-          <w:szCs w:val="19"/>
-          <w:lang w:val="en-US"/>
-        </w:rPr>
-        <w:t>_stats</w:t>
+      <w:r>
+        <w:rPr>
+          <w:rFonts w:ascii="Courier New" w:hAnsi="Courier New" w:cs="Courier New"/>
+          <w:sz w:val="19"/>
+          <w:szCs w:val="19"/>
+          <w:lang w:val="en-US"/>
+        </w:rPr>
+        <w:t>task_stats</w:t>
       </w:r>
       <w:proofErr w:type="spellEnd"/>
       <w:r>
@@ -6123,17 +6099,7 @@
           <w:szCs w:val="19"/>
           <w:lang w:val="en-US"/>
         </w:rPr>
-        <w:t>sys_task_</w:t>
-      </w:r>
-      <w:proofErr w:type="gramStart"/>
-      <w:r>
-        <w:rPr>
-          <w:rFonts w:ascii="Courier New" w:hAnsi="Courier New" w:cs="Courier New"/>
-          <w:sz w:val="19"/>
-          <w:szCs w:val="19"/>
-          <w:lang w:val="en-US"/>
-        </w:rPr>
-        <w:t>stats</w:t>
+        <w:t>sys_task_stats</w:t>
       </w:r>
       <w:proofErr w:type="spellEnd"/>
       <w:r>
@@ -6146,7 +6112,6 @@
         <w:t>(</w:t>
       </w:r>
       <w:proofErr w:type="spellStart"/>
-      <w:proofErr w:type="gramEnd"/>
       <w:r>
         <w:rPr>
           <w:rFonts w:ascii="Courier New" w:hAnsi="Courier New" w:cs="Courier New"/>
@@ -7697,17 +7662,36 @@
       <w:pPr>
         <w:spacing w:line="360" w:lineRule="auto"/>
         <w:ind w:firstLine="708"/>
-        <w:jc w:val="both"/>
-        <w:rPr>
-          <w:sz w:val="28"/>
-          <w:szCs w:val="28"/>
-        </w:rPr>
-      </w:pPr>
-      <w:r>
-        <w:rPr>
-          <w:sz w:val="28"/>
-          <w:szCs w:val="28"/>
-        </w:rPr>
+        <w:jc w:val="center"/>
+        <w:rPr>
+          <w:sz w:val="28"/>
+          <w:szCs w:val="28"/>
+        </w:rPr>
+      </w:pPr>
+      <w:r>
+        <w:rPr>
+          <w:sz w:val="28"/>
+          <w:szCs w:val="28"/>
+        </w:rPr>
+        <w:t xml:space="preserve">Листинг 3. Реализация </w:t>
+      </w:r>
+    </w:p>
+    <w:p>
+      <w:pPr>
+        <w:spacing w:line="360" w:lineRule="auto"/>
+        <w:ind w:firstLine="708"/>
+        <w:jc w:val="both"/>
+        <w:rPr>
+          <w:sz w:val="28"/>
+          <w:szCs w:val="28"/>
+        </w:rPr>
+      </w:pPr>
+      <w:r>
+        <w:rPr>
+          <w:sz w:val="28"/>
+          <w:szCs w:val="28"/>
+        </w:rPr>
+        <w:lastRenderedPageBreak/>
         <w:t xml:space="preserve">Для тестирования была написана отдельная пользовательская программа. Поскольку в </w:t>
       </w:r>
       <w:proofErr w:type="spellStart"/>
@@ -7724,18 +7708,9 @@
           <w:sz w:val="28"/>
           <w:szCs w:val="28"/>
         </w:rPr>
-        <w:t xml:space="preserve"> отсутствует готовая обёртка для нового, </w:t>
-      </w:r>
-      <w:r>
-        <w:rPr>
-          <w:sz w:val="28"/>
-          <w:szCs w:val="28"/>
-        </w:rPr>
-        <w:lastRenderedPageBreak/>
-        <w:t xml:space="preserve">нестандартного номера вызова, обращение к ядру выполняется напрямую через функцию </w:t>
-      </w:r>
-      <w:proofErr w:type="spellStart"/>
-      <w:proofErr w:type="gramStart"/>
+        <w:t xml:space="preserve"> отсутствует готовая обёртка для нового, нестандартного номера вызова, обращение к ядру выполняется напрямую через функцию </w:t>
+      </w:r>
+      <w:proofErr w:type="spellStart"/>
       <w:r>
         <w:rPr>
           <w:sz w:val="28"/>
@@ -7749,15 +7724,7 @@
           <w:sz w:val="28"/>
           <w:szCs w:val="28"/>
         </w:rPr>
-        <w:t>(</w:t>
-      </w:r>
-      <w:proofErr w:type="gramEnd"/>
-      <w:r>
-        <w:rPr>
-          <w:sz w:val="28"/>
-          <w:szCs w:val="28"/>
-        </w:rPr>
-        <w:t>) с явным указанием номера:</w:t>
+        <w:t>() с явным указанием номера:</w:t>
       </w:r>
     </w:p>
     <w:p>
@@ -9001,13 +8968,19 @@
       <w:pPr>
         <w:spacing w:line="360" w:lineRule="auto"/>
         <w:ind w:firstLine="708"/>
-        <w:jc w:val="both"/>
-        <w:rPr>
-          <w:sz w:val="28"/>
-          <w:szCs w:val="28"/>
-          <w:lang w:val="en-US"/>
-        </w:rPr>
-      </w:pPr>
+        <w:jc w:val="center"/>
+        <w:rPr>
+          <w:sz w:val="28"/>
+          <w:szCs w:val="28"/>
+        </w:rPr>
+      </w:pPr>
+      <w:r>
+        <w:rPr>
+          <w:sz w:val="28"/>
+          <w:szCs w:val="28"/>
+        </w:rPr>
+        <w:t xml:space="preserve">Листинг 4. Программа для тестирования </w:t>
+      </w:r>
     </w:p>
     <w:p>
       <w:pPr>
@@ -9017,7 +8990,6 @@
         <w:rPr>
           <w:sz w:val="28"/>
           <w:szCs w:val="28"/>
-          <w:lang w:val="en-US"/>
         </w:rPr>
       </w:pPr>
     </w:p>
@@ -9025,321 +8997,598 @@
       <w:pPr>
         <w:spacing w:line="360" w:lineRule="auto"/>
         <w:ind w:left="360"/>
-        <w:jc w:val="both"/>
+        <w:jc w:val="center"/>
         <w:rPr>
           <w:b/>
           <w:bCs/>
           <w:sz w:val="28"/>
           <w:szCs w:val="28"/>
-          <w:lang w:val="en-US"/>
-        </w:rPr>
-      </w:pPr>
-    </w:p>
-    <w:p>
-      <w:pPr>
-        <w:spacing w:line="360" w:lineRule="auto"/>
-        <w:jc w:val="both"/>
-        <w:rPr>
-          <w:sz w:val="28"/>
-          <w:szCs w:val="28"/>
-          <w:lang w:val="en-US"/>
-        </w:rPr>
-      </w:pPr>
-    </w:p>
-    <w:p>
-      <w:pPr>
-        <w:spacing w:line="360" w:lineRule="auto"/>
-        <w:jc w:val="both"/>
-        <w:rPr>
-          <w:sz w:val="28"/>
-          <w:szCs w:val="28"/>
-          <w:lang w:val="en-US"/>
-        </w:rPr>
-      </w:pPr>
-    </w:p>
-    <w:p>
-      <w:pPr>
-        <w:spacing w:line="360" w:lineRule="auto"/>
-        <w:jc w:val="both"/>
-        <w:rPr>
-          <w:sz w:val="28"/>
-          <w:szCs w:val="28"/>
-          <w:lang w:val="en-US"/>
-        </w:rPr>
-      </w:pPr>
-    </w:p>
-    <w:p>
-      <w:pPr>
-        <w:spacing w:line="360" w:lineRule="auto"/>
-        <w:jc w:val="both"/>
-        <w:rPr>
-          <w:sz w:val="28"/>
-          <w:szCs w:val="28"/>
-          <w:lang w:val="en-US"/>
-        </w:rPr>
-      </w:pPr>
-    </w:p>
-    <w:p>
-      <w:pPr>
-        <w:spacing w:line="360" w:lineRule="auto"/>
-        <w:jc w:val="both"/>
-        <w:rPr>
-          <w:sz w:val="28"/>
-          <w:szCs w:val="28"/>
-          <w:lang w:val="en-US"/>
-        </w:rPr>
-      </w:pPr>
-    </w:p>
-    <w:p>
-      <w:pPr>
-        <w:spacing w:line="360" w:lineRule="auto"/>
-        <w:jc w:val="both"/>
-        <w:rPr>
-          <w:sz w:val="28"/>
-          <w:szCs w:val="28"/>
-          <w:lang w:val="en-US"/>
-        </w:rPr>
-      </w:pPr>
-    </w:p>
-    <w:p>
-      <w:pPr>
-        <w:spacing w:line="360" w:lineRule="auto"/>
-        <w:jc w:val="both"/>
-        <w:rPr>
-          <w:sz w:val="28"/>
-          <w:szCs w:val="28"/>
-          <w:lang w:val="en-US"/>
-        </w:rPr>
-      </w:pPr>
-    </w:p>
-    <w:p>
-      <w:pPr>
-        <w:spacing w:line="360" w:lineRule="auto"/>
-        <w:jc w:val="both"/>
-        <w:rPr>
-          <w:sz w:val="28"/>
-          <w:szCs w:val="28"/>
-          <w:lang w:val="en-US"/>
-        </w:rPr>
-      </w:pPr>
-    </w:p>
-    <w:p>
-      <w:pPr>
-        <w:spacing w:line="360" w:lineRule="auto"/>
-        <w:jc w:val="both"/>
-        <w:rPr>
-          <w:sz w:val="28"/>
-          <w:szCs w:val="28"/>
-          <w:lang w:val="en-US"/>
-        </w:rPr>
-      </w:pPr>
-    </w:p>
-    <w:p>
-      <w:pPr>
-        <w:spacing w:line="360" w:lineRule="auto"/>
-        <w:jc w:val="both"/>
-        <w:rPr>
-          <w:sz w:val="28"/>
-          <w:szCs w:val="28"/>
-          <w:lang w:val="en-US"/>
-        </w:rPr>
-      </w:pPr>
-    </w:p>
-    <w:p>
-      <w:pPr>
-        <w:spacing w:line="360" w:lineRule="auto"/>
-        <w:jc w:val="both"/>
-        <w:rPr>
-          <w:sz w:val="28"/>
-          <w:szCs w:val="28"/>
-          <w:lang w:val="en-US"/>
-        </w:rPr>
-      </w:pPr>
-    </w:p>
-    <w:p>
-      <w:pPr>
-        <w:spacing w:line="360" w:lineRule="auto"/>
-        <w:jc w:val="both"/>
-        <w:rPr>
-          <w:sz w:val="28"/>
-          <w:szCs w:val="28"/>
-          <w:lang w:val="en-US"/>
-        </w:rPr>
-      </w:pPr>
-    </w:p>
-    <w:p>
-      <w:pPr>
-        <w:spacing w:line="360" w:lineRule="auto"/>
-        <w:jc w:val="both"/>
-        <w:rPr>
-          <w:sz w:val="28"/>
-          <w:szCs w:val="28"/>
-          <w:lang w:val="en-US"/>
-        </w:rPr>
-      </w:pPr>
-    </w:p>
-    <w:p>
-      <w:pPr>
-        <w:spacing w:line="360" w:lineRule="auto"/>
-        <w:jc w:val="both"/>
-        <w:rPr>
-          <w:sz w:val="28"/>
-          <w:szCs w:val="28"/>
-          <w:lang w:val="en-US"/>
-        </w:rPr>
-      </w:pPr>
-    </w:p>
-    <w:p>
-      <w:pPr>
-        <w:spacing w:line="360" w:lineRule="auto"/>
-        <w:jc w:val="both"/>
-        <w:rPr>
-          <w:sz w:val="28"/>
-          <w:szCs w:val="28"/>
-          <w:lang w:val="en-US"/>
-        </w:rPr>
-      </w:pPr>
-    </w:p>
-    <w:p>
-      <w:pPr>
-        <w:spacing w:line="360" w:lineRule="auto"/>
-        <w:jc w:val="both"/>
-        <w:rPr>
-          <w:sz w:val="28"/>
-          <w:szCs w:val="28"/>
-          <w:lang w:val="en-US"/>
-        </w:rPr>
-      </w:pPr>
-    </w:p>
-    <w:p>
-      <w:pPr>
-        <w:spacing w:line="360" w:lineRule="auto"/>
-        <w:jc w:val="both"/>
-        <w:rPr>
-          <w:sz w:val="28"/>
-          <w:szCs w:val="28"/>
-          <w:lang w:val="en-US"/>
-        </w:rPr>
-      </w:pPr>
-    </w:p>
-    <w:p>
-      <w:pPr>
-        <w:spacing w:line="360" w:lineRule="auto"/>
-        <w:jc w:val="both"/>
-        <w:rPr>
-          <w:sz w:val="28"/>
-          <w:szCs w:val="28"/>
-          <w:lang w:val="en-US"/>
-        </w:rPr>
-      </w:pPr>
-    </w:p>
-    <w:p>
-      <w:pPr>
-        <w:spacing w:line="360" w:lineRule="auto"/>
-        <w:jc w:val="both"/>
-        <w:rPr>
-          <w:sz w:val="28"/>
-          <w:szCs w:val="28"/>
-          <w:lang w:val="en-US"/>
-        </w:rPr>
-      </w:pPr>
-    </w:p>
-    <w:p>
-      <w:pPr>
-        <w:spacing w:line="360" w:lineRule="auto"/>
-        <w:jc w:val="both"/>
-        <w:rPr>
-          <w:sz w:val="28"/>
-          <w:szCs w:val="28"/>
-          <w:lang w:val="en-US"/>
-        </w:rPr>
-      </w:pPr>
-    </w:p>
-    <w:p>
-      <w:pPr>
-        <w:spacing w:line="360" w:lineRule="auto"/>
-        <w:jc w:val="both"/>
-        <w:rPr>
-          <w:sz w:val="28"/>
-          <w:szCs w:val="28"/>
-          <w:lang w:val="en-US"/>
-        </w:rPr>
-      </w:pPr>
-    </w:p>
-    <w:p>
-      <w:pPr>
-        <w:spacing w:line="360" w:lineRule="auto"/>
-        <w:jc w:val="both"/>
-        <w:rPr>
-          <w:sz w:val="28"/>
-          <w:szCs w:val="28"/>
-          <w:lang w:val="en-US"/>
-        </w:rPr>
-      </w:pPr>
-    </w:p>
-    <w:p>
-      <w:pPr>
-        <w:spacing w:line="360" w:lineRule="auto"/>
-        <w:jc w:val="both"/>
-        <w:rPr>
-          <w:sz w:val="28"/>
-          <w:szCs w:val="28"/>
-          <w:lang w:val="en-US"/>
-        </w:rPr>
-      </w:pPr>
-    </w:p>
-    <w:p>
-      <w:pPr>
-        <w:spacing w:line="360" w:lineRule="auto"/>
-        <w:jc w:val="both"/>
-        <w:rPr>
-          <w:sz w:val="28"/>
-          <w:szCs w:val="28"/>
-          <w:lang w:val="en-US"/>
-        </w:rPr>
-      </w:pPr>
-    </w:p>
-    <w:p>
-      <w:pPr>
-        <w:spacing w:line="360" w:lineRule="auto"/>
-        <w:jc w:val="both"/>
-        <w:rPr>
-          <w:sz w:val="28"/>
-          <w:szCs w:val="28"/>
-          <w:lang w:val="en-US"/>
-        </w:rPr>
-      </w:pPr>
-    </w:p>
-    <w:p>
-      <w:pPr>
-        <w:spacing w:line="360" w:lineRule="auto"/>
-        <w:jc w:val="both"/>
-        <w:rPr>
-          <w:sz w:val="28"/>
-          <w:szCs w:val="28"/>
-          <w:lang w:val="en-US"/>
-        </w:rPr>
-      </w:pPr>
-    </w:p>
-    <w:p>
-      <w:pPr>
-        <w:spacing w:line="360" w:lineRule="auto"/>
-        <w:jc w:val="both"/>
-        <w:rPr>
-          <w:sz w:val="28"/>
-          <w:szCs w:val="28"/>
-          <w:lang w:val="en-US"/>
-        </w:rPr>
-      </w:pPr>
-    </w:p>
-    <w:p>
-      <w:pPr>
-        <w:spacing w:line="360" w:lineRule="auto"/>
-        <w:jc w:val="both"/>
-        <w:rPr>
-          <w:sz w:val="28"/>
-          <w:szCs w:val="28"/>
-          <w:lang w:val="en-US"/>
+        </w:rPr>
+      </w:pPr>
+      <w:r>
+        <w:rPr>
+          <w:b/>
+          <w:bCs/>
+          <w:sz w:val="28"/>
+          <w:szCs w:val="28"/>
+        </w:rPr>
+        <w:t>2.4. Сборка и тестирование</w:t>
+      </w:r>
+    </w:p>
+    <w:p>
+      <w:pPr>
+        <w:spacing w:line="360" w:lineRule="auto"/>
+        <w:ind w:firstLine="708"/>
+        <w:jc w:val="both"/>
+        <w:rPr>
+          <w:sz w:val="28"/>
+          <w:szCs w:val="28"/>
+        </w:rPr>
+      </w:pPr>
+      <w:r>
+        <w:rPr>
+          <w:sz w:val="28"/>
+          <w:szCs w:val="28"/>
+        </w:rPr>
+        <w:t>После внесения перечисленных изменений ядро было пересобрано (</w:t>
+      </w:r>
+      <w:proofErr w:type="spellStart"/>
+      <w:r>
+        <w:rPr>
+          <w:sz w:val="28"/>
+          <w:szCs w:val="28"/>
+        </w:rPr>
+        <w:t>make</w:t>
+      </w:r>
+      <w:proofErr w:type="spellEnd"/>
+      <w:r>
+        <w:rPr>
+          <w:sz w:val="28"/>
+          <w:szCs w:val="28"/>
+        </w:rPr>
+        <w:t xml:space="preserve"> -j$(</w:t>
+      </w:r>
+      <w:proofErr w:type="spellStart"/>
+      <w:r>
+        <w:rPr>
+          <w:sz w:val="28"/>
+          <w:szCs w:val="28"/>
+        </w:rPr>
+        <w:t>nproc</w:t>
+      </w:r>
+      <w:proofErr w:type="spellEnd"/>
+      <w:r>
+        <w:rPr>
+          <w:sz w:val="28"/>
+          <w:szCs w:val="28"/>
+        </w:rPr>
+        <w:t>)) и установлено (</w:t>
+      </w:r>
+      <w:proofErr w:type="spellStart"/>
+      <w:r>
+        <w:rPr>
+          <w:sz w:val="28"/>
+          <w:szCs w:val="28"/>
+        </w:rPr>
+        <w:t>make</w:t>
+      </w:r>
+      <w:proofErr w:type="spellEnd"/>
+      <w:r>
+        <w:rPr>
+          <w:sz w:val="28"/>
+          <w:szCs w:val="28"/>
+        </w:rPr>
+        <w:t xml:space="preserve"> </w:t>
+      </w:r>
+      <w:proofErr w:type="spellStart"/>
+      <w:r>
+        <w:rPr>
+          <w:sz w:val="28"/>
+          <w:szCs w:val="28"/>
+        </w:rPr>
+        <w:t>modules_install</w:t>
+      </w:r>
+      <w:proofErr w:type="spellEnd"/>
+      <w:r>
+        <w:rPr>
+          <w:sz w:val="28"/>
+          <w:szCs w:val="28"/>
+        </w:rPr>
+        <w:t xml:space="preserve">, </w:t>
+      </w:r>
+      <w:proofErr w:type="spellStart"/>
+      <w:r>
+        <w:rPr>
+          <w:sz w:val="28"/>
+          <w:szCs w:val="28"/>
+        </w:rPr>
+        <w:t>make</w:t>
+      </w:r>
+      <w:proofErr w:type="spellEnd"/>
+      <w:r>
+        <w:rPr>
+          <w:sz w:val="28"/>
+          <w:szCs w:val="28"/>
+        </w:rPr>
+        <w:t xml:space="preserve"> </w:t>
+      </w:r>
+      <w:proofErr w:type="spellStart"/>
+      <w:r>
+        <w:rPr>
+          <w:sz w:val="28"/>
+          <w:szCs w:val="28"/>
+        </w:rPr>
+        <w:t>install</w:t>
+      </w:r>
+      <w:proofErr w:type="spellEnd"/>
+      <w:r>
+        <w:rPr>
+          <w:sz w:val="28"/>
+          <w:szCs w:val="28"/>
+        </w:rPr>
+        <w:t xml:space="preserve">, </w:t>
+      </w:r>
+      <w:proofErr w:type="spellStart"/>
+      <w:r>
+        <w:rPr>
+          <w:sz w:val="28"/>
+          <w:szCs w:val="28"/>
+        </w:rPr>
+        <w:t>update-grub</w:t>
+      </w:r>
+      <w:proofErr w:type="spellEnd"/>
+      <w:r>
+        <w:rPr>
+          <w:sz w:val="28"/>
+          <w:szCs w:val="28"/>
+        </w:rPr>
+        <w:t>) в той же виртуальной машине, что использовалась для сборки ядра версии 5.15.5 в разделе 3 — после перезагрузки версия ядра осталась той же (5.15.5), изменилось только его содержимое.</w:t>
+      </w:r>
+    </w:p>
+    <w:p>
+      <w:pPr>
+        <w:spacing w:line="360" w:lineRule="auto"/>
+        <w:ind w:firstLine="708"/>
+        <w:jc w:val="both"/>
+        <w:rPr>
+          <w:sz w:val="28"/>
+          <w:szCs w:val="28"/>
+        </w:rPr>
+      </w:pPr>
+      <w:r>
+        <w:rPr>
+          <w:sz w:val="28"/>
+          <w:szCs w:val="28"/>
+        </w:rPr>
+        <w:lastRenderedPageBreak/>
+        <w:t>Тестовая программа была вызвана с PID текущего процесса. Результат показан на [Рисунке 9]: возвращённые значения (состояние, приоритет, число потоков, счётчики переключений контекста) соответствуют ожидаемым для обычного процесса в оболочке и совпадают по смыслу с данными из /</w:t>
+      </w:r>
+      <w:proofErr w:type="spellStart"/>
+      <w:r>
+        <w:rPr>
+          <w:sz w:val="28"/>
+          <w:szCs w:val="28"/>
+        </w:rPr>
+        <w:t>proc</w:t>
+      </w:r>
+      <w:proofErr w:type="spellEnd"/>
+      <w:r>
+        <w:rPr>
+          <w:sz w:val="28"/>
+          <w:szCs w:val="28"/>
+        </w:rPr>
+        <w:t>/[</w:t>
+      </w:r>
+      <w:proofErr w:type="spellStart"/>
+      <w:r>
+        <w:rPr>
+          <w:sz w:val="28"/>
+          <w:szCs w:val="28"/>
+        </w:rPr>
+        <w:t>pid</w:t>
+      </w:r>
+      <w:proofErr w:type="spellEnd"/>
+      <w:r>
+        <w:rPr>
+          <w:sz w:val="28"/>
+          <w:szCs w:val="28"/>
+        </w:rPr>
+        <w:t>]/</w:t>
+      </w:r>
+      <w:proofErr w:type="spellStart"/>
+      <w:r>
+        <w:rPr>
+          <w:sz w:val="28"/>
+          <w:szCs w:val="28"/>
+        </w:rPr>
+        <w:t>stat</w:t>
+      </w:r>
+      <w:proofErr w:type="spellEnd"/>
+      <w:r>
+        <w:rPr>
+          <w:sz w:val="28"/>
+          <w:szCs w:val="28"/>
+        </w:rPr>
+        <w:t>, что подтверждает корректность реализации.</w:t>
+      </w:r>
+    </w:p>
+    <w:p>
+      <w:pPr>
+        <w:spacing w:line="360" w:lineRule="auto"/>
+        <w:jc w:val="both"/>
+        <w:rPr>
+          <w:sz w:val="28"/>
+          <w:szCs w:val="28"/>
+        </w:rPr>
+      </w:pPr>
+      <w:r>
+        <w:rPr>
+          <w:noProof/>
+        </w:rPr>
+        <w:drawing>
+          <wp:inline distT="0" distB="0" distL="114300" distR="114300" wp14:anchorId="2614D29D" wp14:editId="07E0868A">
+            <wp:extent cx="5848350" cy="314325"/>
+            <wp:effectExtent l="0" t="0" r="0" b="9525"/>
+            <wp:docPr id="12" name="Picture 6"/>
+            <wp:cNvGraphicFramePr>
+              <a:graphicFrameLocks xmlns:a="http://schemas.openxmlformats.org/drawingml/2006/main" noChangeAspect="1"/>
+            </wp:cNvGraphicFramePr>
+            <a:graphic xmlns:a="http://schemas.openxmlformats.org/drawingml/2006/main">
+              <a:graphicData uri="http://schemas.openxmlformats.org/drawingml/2006/picture">
+                <pic:pic xmlns:pic="http://schemas.openxmlformats.org/drawingml/2006/picture">
+                  <pic:nvPicPr>
+                    <pic:cNvPr id="12" name="Picture 6"/>
+                    <pic:cNvPicPr>
+                      <a:picLocks noChangeAspect="1"/>
+                    </pic:cNvPicPr>
+                  </pic:nvPicPr>
+                  <pic:blipFill>
+                    <a:blip r:embed="rId15"/>
+                    <a:stretch>
+                      <a:fillRect/>
+                    </a:stretch>
+                  </pic:blipFill>
+                  <pic:spPr>
+                    <a:xfrm>
+                      <a:off x="0" y="0"/>
+                      <a:ext cx="5848350" cy="314325"/>
+                    </a:xfrm>
+                    <a:prstGeom prst="rect">
+                      <a:avLst/>
+                    </a:prstGeom>
+                    <a:noFill/>
+                    <a:ln>
+                      <a:noFill/>
+                    </a:ln>
+                  </pic:spPr>
+                </pic:pic>
+              </a:graphicData>
+            </a:graphic>
+          </wp:inline>
+        </w:drawing>
+      </w:r>
+    </w:p>
+    <w:p>
+      <w:pPr>
+        <w:spacing w:line="360" w:lineRule="auto"/>
+        <w:jc w:val="center"/>
+        <w:rPr>
+          <w:sz w:val="28"/>
+          <w:szCs w:val="28"/>
+        </w:rPr>
+      </w:pPr>
+      <w:r>
+        <w:rPr>
+          <w:sz w:val="28"/>
+          <w:szCs w:val="28"/>
+        </w:rPr>
+        <w:t xml:space="preserve">Рисунок 9. Результат работы </w:t>
+      </w:r>
+      <w:proofErr w:type="spellStart"/>
+      <w:r>
+        <w:rPr>
+          <w:sz w:val="28"/>
+          <w:szCs w:val="28"/>
+        </w:rPr>
+        <w:t>sys_task_stats</w:t>
+      </w:r>
+      <w:proofErr w:type="spellEnd"/>
+      <w:r>
+        <w:rPr>
+          <w:sz w:val="28"/>
+          <w:szCs w:val="28"/>
+        </w:rPr>
+        <w:t xml:space="preserve"> для существующего процесса</w:t>
+      </w:r>
+    </w:p>
+    <w:p>
+      <w:pPr>
+        <w:spacing w:line="360" w:lineRule="auto"/>
+        <w:ind w:firstLine="708"/>
+        <w:jc w:val="both"/>
+        <w:rPr>
+          <w:sz w:val="28"/>
+          <w:szCs w:val="28"/>
+        </w:rPr>
+      </w:pPr>
+      <w:r>
+        <w:rPr>
+          <w:sz w:val="28"/>
+          <w:szCs w:val="28"/>
+        </w:rPr>
+        <w:t xml:space="preserve">Отдельно была проверена обработка ошибки: вызов с заведомо несуществующим PID корректно возвращает -ESRCH («No </w:t>
+      </w:r>
+      <w:proofErr w:type="spellStart"/>
+      <w:r>
+        <w:rPr>
+          <w:sz w:val="28"/>
+          <w:szCs w:val="28"/>
+        </w:rPr>
+        <w:t>such</w:t>
+      </w:r>
+      <w:proofErr w:type="spellEnd"/>
+      <w:r>
+        <w:rPr>
+          <w:sz w:val="28"/>
+          <w:szCs w:val="28"/>
+        </w:rPr>
+        <w:t xml:space="preserve"> </w:t>
+      </w:r>
+      <w:proofErr w:type="spellStart"/>
+      <w:r>
+        <w:rPr>
+          <w:sz w:val="28"/>
+          <w:szCs w:val="28"/>
+        </w:rPr>
+        <w:t>process</w:t>
+      </w:r>
+      <w:proofErr w:type="spellEnd"/>
+      <w:r>
+        <w:rPr>
+          <w:sz w:val="28"/>
+          <w:szCs w:val="28"/>
+        </w:rPr>
+        <w:t>») вместо аварийного завершения или неопределённого поведения [Рисунок 10].</w:t>
+      </w:r>
+    </w:p>
+    <w:p>
+      <w:pPr>
+        <w:spacing w:line="360" w:lineRule="auto"/>
+        <w:jc w:val="center"/>
+        <w:rPr>
+          <w:sz w:val="28"/>
+          <w:szCs w:val="28"/>
+        </w:rPr>
+      </w:pPr>
+      <w:r>
+        <w:rPr>
+          <w:noProof/>
+        </w:rPr>
+        <w:drawing>
+          <wp:inline distT="0" distB="0" distL="114300" distR="114300" wp14:anchorId="4B9603C5" wp14:editId="551B79C7">
+            <wp:extent cx="2990850" cy="495300"/>
+            <wp:effectExtent l="0" t="0" r="0" b="0"/>
+            <wp:docPr id="17" name="Picture 7"/>
+            <wp:cNvGraphicFramePr>
+              <a:graphicFrameLocks xmlns:a="http://schemas.openxmlformats.org/drawingml/2006/main" noChangeAspect="1"/>
+            </wp:cNvGraphicFramePr>
+            <a:graphic xmlns:a="http://schemas.openxmlformats.org/drawingml/2006/main">
+              <a:graphicData uri="http://schemas.openxmlformats.org/drawingml/2006/picture">
+                <pic:pic xmlns:pic="http://schemas.openxmlformats.org/drawingml/2006/picture">
+                  <pic:nvPicPr>
+                    <pic:cNvPr id="14" name="Picture 7"/>
+                    <pic:cNvPicPr>
+                      <a:picLocks noChangeAspect="1"/>
+                    </pic:cNvPicPr>
+                  </pic:nvPicPr>
+                  <pic:blipFill>
+                    <a:blip r:embed="rId16"/>
+                    <a:stretch>
+                      <a:fillRect/>
+                    </a:stretch>
+                  </pic:blipFill>
+                  <pic:spPr>
+                    <a:xfrm>
+                      <a:off x="0" y="0"/>
+                      <a:ext cx="2990850" cy="495300"/>
+                    </a:xfrm>
+                    <a:prstGeom prst="rect">
+                      <a:avLst/>
+                    </a:prstGeom>
+                    <a:noFill/>
+                    <a:ln>
+                      <a:noFill/>
+                    </a:ln>
+                  </pic:spPr>
+                </pic:pic>
+              </a:graphicData>
+            </a:graphic>
+          </wp:inline>
+        </w:drawing>
+      </w:r>
+    </w:p>
+    <w:p>
+      <w:pPr>
+        <w:spacing w:line="360" w:lineRule="auto"/>
+        <w:jc w:val="center"/>
+        <w:rPr>
+          <w:sz w:val="28"/>
+          <w:szCs w:val="28"/>
+        </w:rPr>
+      </w:pPr>
+      <w:r>
+        <w:rPr>
+          <w:sz w:val="28"/>
+          <w:szCs w:val="28"/>
+        </w:rPr>
+        <w:t>Рисунок 10. Обработка запроса несуществующего процесса</w:t>
+      </w:r>
+    </w:p>
+    <w:p>
+      <w:pPr>
+        <w:spacing w:line="360" w:lineRule="auto"/>
+        <w:ind w:firstLine="708"/>
+        <w:jc w:val="both"/>
+        <w:rPr>
+          <w:sz w:val="28"/>
+          <w:szCs w:val="28"/>
+        </w:rPr>
+      </w:pPr>
+      <w:r>
+        <w:rPr>
+          <w:sz w:val="28"/>
+          <w:szCs w:val="28"/>
+        </w:rPr>
+        <w:t xml:space="preserve">Таким образом, системный вызов </w:t>
+      </w:r>
+      <w:proofErr w:type="spellStart"/>
+      <w:r>
+        <w:rPr>
+          <w:sz w:val="28"/>
+          <w:szCs w:val="28"/>
+        </w:rPr>
+        <w:t>sys_task_stats</w:t>
+      </w:r>
+      <w:proofErr w:type="spellEnd"/>
+      <w:r>
+        <w:rPr>
+          <w:sz w:val="28"/>
+          <w:szCs w:val="28"/>
+        </w:rPr>
+        <w:t xml:space="preserve"> реализован и протестирован: он корректно возвращает запрошенные данные для существующего процесса и корректно обрабатывает базовую ошибочную ситуацию. </w:t>
+      </w:r>
+    </w:p>
+    <w:p>
+      <w:pPr>
+        <w:spacing w:line="360" w:lineRule="auto"/>
+        <w:ind w:firstLine="708"/>
+        <w:jc w:val="both"/>
+        <w:rPr>
+          <w:sz w:val="28"/>
+          <w:szCs w:val="28"/>
+        </w:rPr>
+      </w:pPr>
+    </w:p>
+    <w:p>
+      <w:pPr>
+        <w:spacing w:line="360" w:lineRule="auto"/>
+        <w:ind w:left="360"/>
+        <w:jc w:val="both"/>
+        <w:rPr>
+          <w:b/>
+          <w:bCs/>
+          <w:sz w:val="28"/>
+          <w:szCs w:val="28"/>
+        </w:rPr>
+      </w:pPr>
+    </w:p>
+    <w:p>
+      <w:pPr>
+        <w:spacing w:line="360" w:lineRule="auto"/>
+        <w:jc w:val="both"/>
+        <w:rPr>
+          <w:sz w:val="28"/>
+          <w:szCs w:val="28"/>
+        </w:rPr>
+      </w:pPr>
+    </w:p>
+    <w:p>
+      <w:pPr>
+        <w:spacing w:line="360" w:lineRule="auto"/>
+        <w:jc w:val="both"/>
+        <w:rPr>
+          <w:sz w:val="28"/>
+          <w:szCs w:val="28"/>
+        </w:rPr>
+      </w:pPr>
+    </w:p>
+    <w:p>
+      <w:pPr>
+        <w:spacing w:line="360" w:lineRule="auto"/>
+        <w:jc w:val="both"/>
+        <w:rPr>
+          <w:sz w:val="28"/>
+          <w:szCs w:val="28"/>
+        </w:rPr>
+      </w:pPr>
+    </w:p>
+    <w:p>
+      <w:pPr>
+        <w:spacing w:line="360" w:lineRule="auto"/>
+        <w:jc w:val="both"/>
+        <w:rPr>
+          <w:sz w:val="28"/>
+          <w:szCs w:val="28"/>
+        </w:rPr>
+      </w:pPr>
+    </w:p>
+    <w:p>
+      <w:pPr>
+        <w:spacing w:line="360" w:lineRule="auto"/>
+        <w:jc w:val="both"/>
+        <w:rPr>
+          <w:sz w:val="28"/>
+          <w:szCs w:val="28"/>
+        </w:rPr>
+      </w:pPr>
+    </w:p>
+    <w:p>
+      <w:pPr>
+        <w:spacing w:line="360" w:lineRule="auto"/>
+        <w:jc w:val="both"/>
+        <w:rPr>
+          <w:sz w:val="28"/>
+          <w:szCs w:val="28"/>
+        </w:rPr>
+      </w:pPr>
+    </w:p>
+    <w:p>
+      <w:pPr>
+        <w:spacing w:line="360" w:lineRule="auto"/>
+        <w:jc w:val="both"/>
+        <w:rPr>
+          <w:sz w:val="28"/>
+          <w:szCs w:val="28"/>
+        </w:rPr>
+      </w:pPr>
+    </w:p>
+    <w:p>
+      <w:pPr>
+        <w:spacing w:line="360" w:lineRule="auto"/>
+        <w:jc w:val="both"/>
+        <w:rPr>
+          <w:sz w:val="28"/>
+          <w:szCs w:val="28"/>
+        </w:rPr>
+      </w:pPr>
+    </w:p>
+    <w:p>
+      <w:pPr>
+        <w:spacing w:line="360" w:lineRule="auto"/>
+        <w:jc w:val="both"/>
+        <w:rPr>
+          <w:sz w:val="28"/>
+          <w:szCs w:val="28"/>
+        </w:rPr>
+      </w:pPr>
+    </w:p>
+    <w:p>
+      <w:pPr>
+        <w:spacing w:line="360" w:lineRule="auto"/>
+        <w:jc w:val="both"/>
+        <w:rPr>
+          <w:sz w:val="28"/>
+          <w:szCs w:val="28"/>
+        </w:rPr>
+      </w:pPr>
+    </w:p>
+    <w:p>
+      <w:pPr>
+        <w:spacing w:line="360" w:lineRule="auto"/>
+        <w:jc w:val="both"/>
+        <w:rPr>
+          <w:sz w:val="28"/>
+          <w:szCs w:val="28"/>
         </w:rPr>
       </w:pPr>
     </w:p>
@@ -9366,6 +9615,7 @@
           <w:sz w:val="32"/>
           <w:szCs w:val="32"/>
         </w:rPr>
+        <w:lastRenderedPageBreak/>
         <w:t>А</w:t>
       </w:r>
       <w:r>
@@ -9534,7 +9784,6 @@
           <w:sz w:val="28"/>
           <w:szCs w:val="28"/>
         </w:rPr>
-        <w:lastRenderedPageBreak/>
         <w:t>некорректная проверка указателей — передача ядру недействительного адреса памяти;</w:t>
       </w:r>
     </w:p>
@@ -9751,6 +10000,7 @@
           <w:sz w:val="28"/>
           <w:szCs w:val="28"/>
         </w:rPr>
+        <w:lastRenderedPageBreak/>
         <w:t>Демонстрация уязвимости CVE</w:t>
       </w:r>
     </w:p>
@@ -9961,31 +10211,21 @@
           <w:sz w:val="28"/>
           <w:szCs w:val="28"/>
         </w:rPr>
-        <w:t xml:space="preserve"> не инициализировалось и могло сохранять устаревшее значение от предыдущего </w:t>
-      </w:r>
-      <w:proofErr w:type="gramStart"/>
-      <w:r>
-        <w:rPr>
-          <w:sz w:val="28"/>
-          <w:szCs w:val="28"/>
-        </w:rPr>
-        <w:lastRenderedPageBreak/>
-        <w:t>использования</w:t>
-      </w:r>
-      <w:r>
-        <w:rPr>
-          <w:sz w:val="28"/>
-          <w:szCs w:val="28"/>
-        </w:rPr>
-        <w:t>[</w:t>
-      </w:r>
-      <w:proofErr w:type="gramEnd"/>
-      <w:r>
-        <w:rPr>
-          <w:sz w:val="28"/>
-          <w:szCs w:val="28"/>
-        </w:rPr>
-        <w:t>2</w:t>
+        <w:t xml:space="preserve"> не инициализировалось и могло сохранять устаревшее значение от предыдущего использования</w:t>
+      </w:r>
+      <w:r>
+        <w:rPr>
+          <w:sz w:val="28"/>
+          <w:szCs w:val="28"/>
+        </w:rPr>
+        <w:t xml:space="preserve"> </w:t>
+      </w:r>
+      <w:r>
+        <w:rPr>
+          <w:sz w:val="28"/>
+          <w:szCs w:val="28"/>
+        </w:rPr>
+        <w:t>[2</w:t>
       </w:r>
       <w:r>
         <w:rPr>
@@ -10033,7 +10273,7 @@
                     <pic:cNvPicPr/>
                   </pic:nvPicPr>
                   <pic:blipFill>
-                    <a:blip r:embed="rId15"/>
+                    <a:blip r:embed="rId17"/>
                     <a:stretch>
                       <a:fillRect/>
                     </a:stretch>
@@ -10068,7 +10308,21 @@
           <w:sz w:val="28"/>
           <w:szCs w:val="28"/>
         </w:rPr>
-        <w:t xml:space="preserve">Листинг 1. Структура </w:t>
+        <w:t xml:space="preserve">Листинг </w:t>
+      </w:r>
+      <w:r>
+        <w:rPr>
+          <w:sz w:val="28"/>
+          <w:szCs w:val="28"/>
+        </w:rPr>
+        <w:t>5</w:t>
+      </w:r>
+      <w:r>
+        <w:rPr>
+          <w:sz w:val="28"/>
+          <w:szCs w:val="28"/>
+        </w:rPr>
+        <w:t xml:space="preserve">. Структура </w:t>
       </w:r>
       <w:proofErr w:type="spellStart"/>
       <w:r>
@@ -10342,6 +10596,7 @@
           <w:sz w:val="28"/>
           <w:szCs w:val="28"/>
         </w:rPr>
+        <w:lastRenderedPageBreak/>
         <w:t xml:space="preserve">На шаге 3 был недочет. Когда функция нашла свободный слот, отсутствовала проверка на </w:t>
       </w:r>
       <w:proofErr w:type="spellStart"/>
@@ -10353,7 +10608,6 @@
         <w:t>buf</w:t>
       </w:r>
       <w:proofErr w:type="spellEnd"/>
-      <w:proofErr w:type="gramStart"/>
       <w:r>
         <w:rPr>
           <w:sz w:val="28"/>
@@ -10370,7 +10624,6 @@
         <w:t>flags</w:t>
       </w:r>
       <w:proofErr w:type="spellEnd"/>
-      <w:proofErr w:type="gramEnd"/>
       <w:r>
         <w:rPr>
           <w:sz w:val="28"/>
@@ -10522,7 +10775,6 @@
         </w:rPr>
         <w:t xml:space="preserve">– вызывается при системном вызове </w:t>
       </w:r>
-      <w:proofErr w:type="gramStart"/>
       <w:r>
         <w:rPr>
           <w:sz w:val="28"/>
@@ -10536,15 +10788,7 @@
           <w:sz w:val="28"/>
           <w:szCs w:val="28"/>
         </w:rPr>
-        <w:t>(</w:t>
-      </w:r>
-      <w:proofErr w:type="gramEnd"/>
-      <w:r>
-        <w:rPr>
-          <w:sz w:val="28"/>
-          <w:szCs w:val="28"/>
-        </w:rPr>
-        <w:t xml:space="preserve">). </w:t>
+        <w:t xml:space="preserve">(). </w:t>
       </w:r>
       <w:r>
         <w:rPr>
@@ -10612,7 +10856,6 @@
         <w:rPr>
           <w:sz w:val="28"/>
           <w:szCs w:val="28"/>
-          <w:lang w:val="en-US"/>
         </w:rPr>
       </w:pPr>
       <w:r>
@@ -10659,13 +10902,12 @@
         </w:rPr>
         <w:t xml:space="preserve">Рисунок </w:t>
       </w:r>
-      <w:proofErr w:type="gramStart"/>
-      <w:r>
-        <w:rPr>
-          <w:sz w:val="28"/>
-          <w:szCs w:val="28"/>
-        </w:rPr>
-        <w:t>_</w:t>
+      <w:r>
+        <w:rPr>
+          <w:sz w:val="28"/>
+          <w:szCs w:val="28"/>
+        </w:rPr>
+        <w:t>10</w:t>
       </w:r>
       <w:r>
         <w:rPr>
@@ -10679,22 +10921,7 @@
           <w:sz w:val="28"/>
           <w:szCs w:val="28"/>
         </w:rPr>
-        <w:t xml:space="preserve"> </w:t>
-      </w:r>
-      <w:r>
-        <w:rPr>
-          <w:sz w:val="28"/>
-          <w:szCs w:val="28"/>
-        </w:rPr>
-        <w:t xml:space="preserve"> с</w:t>
-      </w:r>
-      <w:proofErr w:type="gramEnd"/>
-      <w:r>
-        <w:rPr>
-          <w:sz w:val="28"/>
-          <w:szCs w:val="28"/>
-        </w:rPr>
-        <w:t xml:space="preserve"> правами только на чтение, после чего к нему был применён эксплойт, использующий описанный выше механизм. </w:t>
+        <w:t xml:space="preserve"> с правами только на чтение, после чего к нему был применён эксплойт, использующий описанный выше механизм. </w:t>
       </w:r>
     </w:p>
     <w:p>
@@ -10711,7 +10938,6 @@
         <w:rPr>
           <w:noProof/>
         </w:rPr>
-        <w:lastRenderedPageBreak/>
         <w:drawing>
           <wp:inline distT="0" distB="0" distL="114300" distR="114300" wp14:anchorId="777F104D" wp14:editId="60A14E1C">
             <wp:extent cx="4591050" cy="609600"/>
@@ -10730,7 +10956,7 @@
                     </pic:cNvPicPr>
                   </pic:nvPicPr>
                   <pic:blipFill>
-                    <a:blip r:embed="rId16"/>
+                    <a:blip r:embed="rId18"/>
                     <a:stretch>
                       <a:fillRect/>
                     </a:stretch>
@@ -10768,7 +10994,21 @@
           <w:sz w:val="28"/>
           <w:szCs w:val="28"/>
         </w:rPr>
-        <w:t>Рисунок _. Права на тестовый файл и текущий пользователь</w:t>
+        <w:t xml:space="preserve">Рисунок </w:t>
+      </w:r>
+      <w:r>
+        <w:rPr>
+          <w:sz w:val="28"/>
+          <w:szCs w:val="28"/>
+        </w:rPr>
+        <w:t>10</w:t>
+      </w:r>
+      <w:r>
+        <w:rPr>
+          <w:sz w:val="28"/>
+          <w:szCs w:val="28"/>
+        </w:rPr>
+        <w:t>. Права на тестовый файл и текущий пользователь</w:t>
       </w:r>
     </w:p>
     <w:p>
@@ -10779,7 +11019,6 @@
         <w:rPr>
           <w:sz w:val="28"/>
           <w:szCs w:val="28"/>
-          <w:lang w:val="en-US"/>
         </w:rPr>
       </w:pPr>
       <w:r>
@@ -10801,7 +11040,14 @@
           <w:sz w:val="28"/>
           <w:szCs w:val="28"/>
         </w:rPr>
-        <w:t>Рисунок _</w:t>
+        <w:t xml:space="preserve">Рисунок </w:t>
+      </w:r>
+      <w:r>
+        <w:rPr>
+          <w:sz w:val="28"/>
+          <w:szCs w:val="28"/>
+        </w:rPr>
+        <w:t>11</w:t>
       </w:r>
       <w:r>
         <w:rPr>
@@ -10829,6 +11075,7 @@
           <w:szCs w:val="28"/>
           <w:lang w:val="en-US"/>
         </w:rPr>
+        <w:lastRenderedPageBreak/>
         <w:drawing>
           <wp:inline distT="0" distB="0" distL="0" distR="0" wp14:anchorId="384BC307" wp14:editId="2875F8B4">
             <wp:extent cx="4000500" cy="6000750"/>
@@ -10847,7 +11094,7 @@
                     </pic:cNvPicPr>
                   </pic:nvPicPr>
                   <pic:blipFill>
-                    <a:blip r:embed="rId17">
+                    <a:blip r:embed="rId19">
                       <a:extLst>
                         <a:ext uri="{28A0092B-C50C-407E-A947-70E740481C1C}">
                           <a14:useLocalDpi xmlns:a14="http://schemas.microsoft.com/office/drawing/2010/main" val="0"/>
@@ -10891,7 +11138,21 @@
           <w:sz w:val="28"/>
           <w:szCs w:val="28"/>
         </w:rPr>
-        <w:t>Рисунок _. Блок-схема уязвимости</w:t>
+        <w:t xml:space="preserve">Рисунок </w:t>
+      </w:r>
+      <w:r>
+        <w:rPr>
+          <w:sz w:val="28"/>
+          <w:szCs w:val="28"/>
+        </w:rPr>
+        <w:t>11</w:t>
+      </w:r>
+      <w:r>
+        <w:rPr>
+          <w:sz w:val="28"/>
+          <w:szCs w:val="28"/>
+        </w:rPr>
+        <w:t>. Блок-схема уязвимости</w:t>
       </w:r>
     </w:p>
     <w:p>
@@ -10916,14 +11177,14 @@
           <w:sz w:val="28"/>
           <w:szCs w:val="28"/>
         </w:rPr>
-        <w:t>_</w:t>
-      </w:r>
-      <w:r>
-        <w:rPr>
-          <w:sz w:val="28"/>
-          <w:szCs w:val="28"/>
-        </w:rPr>
-        <w:t xml:space="preserve">]: запрос пароля root происходит только на этапе подготовки тестового файла (его создание и назначение владельцем </w:t>
+        <w:t>12</w:t>
+      </w:r>
+      <w:r>
+        <w:rPr>
+          <w:sz w:val="28"/>
+          <w:szCs w:val="28"/>
+        </w:rPr>
+        <w:t xml:space="preserve">]: запрос пароля </w:t>
       </w:r>
       <w:proofErr w:type="spellStart"/>
       <w:r>
@@ -10939,8 +11200,35 @@
           <w:sz w:val="28"/>
           <w:szCs w:val="28"/>
         </w:rPr>
+        <w:t xml:space="preserve"> происходит только на этапе подготовки тестового файла (его создание и назначение владельцем </w:t>
+      </w:r>
+      <w:proofErr w:type="spellStart"/>
+      <w:r>
+        <w:rPr>
+          <w:sz w:val="28"/>
+          <w:szCs w:val="28"/>
+        </w:rPr>
+        <w:t>root</w:t>
+      </w:r>
+      <w:proofErr w:type="spellEnd"/>
+      <w:r>
+        <w:rPr>
+          <w:sz w:val="28"/>
+          <w:szCs w:val="28"/>
+        </w:rPr>
         <w:t>), тогда как сам эксплойт запускается и завершается успешно без повторного запроса пароля — то есть запись в файл происходит от имени обычного пользователя, в обход проверки прав доступа.</w:t>
       </w:r>
+    </w:p>
+    <w:p>
+      <w:pPr>
+        <w:spacing w:line="360" w:lineRule="auto"/>
+        <w:ind w:firstLine="708"/>
+        <w:jc w:val="both"/>
+        <w:rPr>
+          <w:sz w:val="28"/>
+          <w:szCs w:val="28"/>
+        </w:rPr>
+      </w:pPr>
     </w:p>
     <w:p>
       <w:pPr>
@@ -10975,7 +11263,7 @@
                     </pic:cNvPicPr>
                   </pic:nvPicPr>
                   <pic:blipFill>
-                    <a:blip r:embed="rId18"/>
+                    <a:blip r:embed="rId20"/>
                     <a:stretch>
                       <a:fillRect/>
                     </a:stretch>
@@ -11022,7 +11310,7 @@
           <w:sz w:val="28"/>
           <w:szCs w:val="28"/>
         </w:rPr>
-        <w:t>_</w:t>
+        <w:t>12</w:t>
       </w:r>
       <w:r>
         <w:rPr>
@@ -11035,6 +11323,16 @@
     <w:p>
       <w:pPr>
         <w:spacing w:line="360" w:lineRule="auto"/>
+        <w:jc w:val="both"/>
+        <w:rPr>
+          <w:sz w:val="28"/>
+          <w:szCs w:val="28"/>
+        </w:rPr>
+      </w:pPr>
+    </w:p>
+    <w:p>
+      <w:pPr>
+        <w:spacing w:line="360" w:lineRule="auto"/>
         <w:ind w:firstLine="708"/>
         <w:jc w:val="both"/>
         <w:rPr>
@@ -11042,83 +11340,6 @@
           <w:szCs w:val="28"/>
         </w:rPr>
       </w:pPr>
-    </w:p>
-    <w:p>
-      <w:pPr>
-        <w:spacing w:line="360" w:lineRule="auto"/>
-        <w:ind w:firstLine="708"/>
-        <w:jc w:val="both"/>
-        <w:rPr>
-          <w:sz w:val="28"/>
-          <w:szCs w:val="28"/>
-        </w:rPr>
-      </w:pPr>
-    </w:p>
-    <w:p>
-      <w:pPr>
-        <w:spacing w:line="360" w:lineRule="auto"/>
-        <w:ind w:firstLine="708"/>
-        <w:jc w:val="both"/>
-        <w:rPr>
-          <w:sz w:val="28"/>
-          <w:szCs w:val="28"/>
-        </w:rPr>
-      </w:pPr>
-    </w:p>
-    <w:p>
-      <w:pPr>
-        <w:spacing w:line="360" w:lineRule="auto"/>
-        <w:ind w:firstLine="708"/>
-        <w:jc w:val="both"/>
-        <w:rPr>
-          <w:sz w:val="28"/>
-          <w:szCs w:val="28"/>
-        </w:rPr>
-      </w:pPr>
-    </w:p>
-    <w:p>
-      <w:pPr>
-        <w:spacing w:line="360" w:lineRule="auto"/>
-        <w:ind w:firstLine="708"/>
-        <w:jc w:val="both"/>
-        <w:rPr>
-          <w:sz w:val="28"/>
-          <w:szCs w:val="28"/>
-        </w:rPr>
-      </w:pPr>
-    </w:p>
-    <w:p>
-      <w:pPr>
-        <w:spacing w:line="360" w:lineRule="auto"/>
-        <w:ind w:firstLine="708"/>
-        <w:jc w:val="both"/>
-        <w:rPr>
-          <w:sz w:val="28"/>
-          <w:szCs w:val="28"/>
-        </w:rPr>
-      </w:pPr>
-    </w:p>
-    <w:p>
-      <w:pPr>
-        <w:spacing w:line="360" w:lineRule="auto"/>
-        <w:ind w:firstLine="708"/>
-        <w:jc w:val="both"/>
-        <w:rPr>
-          <w:sz w:val="28"/>
-          <w:szCs w:val="28"/>
-        </w:rPr>
-      </w:pPr>
-    </w:p>
-    <w:p>
-      <w:pPr>
-        <w:spacing w:line="360" w:lineRule="auto"/>
-        <w:ind w:firstLine="708"/>
-        <w:jc w:val="both"/>
-        <w:rPr>
-          <w:sz w:val="28"/>
-          <w:szCs w:val="28"/>
-        </w:rPr>
-      </w:pPr>
       <w:r>
         <w:rPr>
           <w:sz w:val="28"/>
@@ -11131,7 +11352,14 @@
           <w:sz w:val="28"/>
           <w:szCs w:val="28"/>
         </w:rPr>
-        <w:t xml:space="preserve"> _</w:t>
+        <w:t xml:space="preserve"> </w:t>
+      </w:r>
+      <w:r>
+        <w:rPr>
+          <w:sz w:val="28"/>
+          <w:szCs w:val="28"/>
+        </w:rPr>
+        <w:t>13</w:t>
       </w:r>
       <w:r>
         <w:rPr>
@@ -11173,7 +11401,7 @@
                     </pic:cNvPicPr>
                   </pic:nvPicPr>
                   <pic:blipFill>
-                    <a:blip r:embed="rId19"/>
+                    <a:blip r:embed="rId21"/>
                     <a:stretch>
                       <a:fillRect/>
                     </a:stretch>
@@ -11213,7 +11441,21 @@
           <w:sz w:val="28"/>
           <w:szCs w:val="28"/>
         </w:rPr>
-        <w:t xml:space="preserve">Рисунок _. </w:t>
+        <w:t xml:space="preserve">Рисунок </w:t>
+      </w:r>
+      <w:r>
+        <w:rPr>
+          <w:sz w:val="28"/>
+          <w:szCs w:val="28"/>
+        </w:rPr>
+        <w:t>13</w:t>
+      </w:r>
+      <w:r>
+        <w:rPr>
+          <w:sz w:val="28"/>
+          <w:szCs w:val="28"/>
+        </w:rPr>
+        <w:t xml:space="preserve">. </w:t>
       </w:r>
       <w:r>
         <w:rPr>
@@ -11248,46 +11490,53 @@
           <w:sz w:val="28"/>
           <w:szCs w:val="28"/>
         </w:rPr>
+        <w:t>Исправление уязвимости заключается в добавление одной проверки</w:t>
+      </w:r>
+      <w:r>
+        <w:rPr>
+          <w:sz w:val="28"/>
+          <w:szCs w:val="28"/>
+        </w:rPr>
+        <w:t xml:space="preserve"> [</w:t>
+      </w:r>
+      <w:r>
+        <w:rPr>
+          <w:sz w:val="28"/>
+          <w:szCs w:val="28"/>
+        </w:rPr>
+        <w:t xml:space="preserve">Рисунок </w:t>
+      </w:r>
+      <w:r>
+        <w:rPr>
+          <w:sz w:val="28"/>
+          <w:szCs w:val="28"/>
+        </w:rPr>
+        <w:t>14</w:t>
+      </w:r>
+      <w:r>
+        <w:rPr>
+          <w:sz w:val="28"/>
+          <w:szCs w:val="28"/>
+        </w:rPr>
+        <w:t>].</w:t>
+      </w:r>
+    </w:p>
+    <w:p>
+      <w:pPr>
+        <w:spacing w:line="360" w:lineRule="auto"/>
+        <w:jc w:val="both"/>
+        <w:rPr>
+          <w:sz w:val="28"/>
+          <w:szCs w:val="28"/>
+        </w:rPr>
+      </w:pPr>
+      <w:r>
+        <w:rPr>
+          <w:noProof/>
+          <w:sz w:val="28"/>
+          <w:szCs w:val="28"/>
+        </w:rPr>
         <w:lastRenderedPageBreak/>
-        <w:t>Исправление уязвимости заключается в добавление одной проверки</w:t>
-      </w:r>
-      <w:r>
-        <w:rPr>
-          <w:sz w:val="28"/>
-          <w:szCs w:val="28"/>
-        </w:rPr>
-        <w:t xml:space="preserve"> [</w:t>
-      </w:r>
-      <w:r>
-        <w:rPr>
-          <w:sz w:val="28"/>
-          <w:szCs w:val="28"/>
-        </w:rPr>
-        <w:t>Рисунок _</w:t>
-      </w:r>
-      <w:r>
-        <w:rPr>
-          <w:sz w:val="28"/>
-          <w:szCs w:val="28"/>
-        </w:rPr>
-        <w:t>].</w:t>
-      </w:r>
-    </w:p>
-    <w:p>
-      <w:pPr>
-        <w:spacing w:line="360" w:lineRule="auto"/>
-        <w:jc w:val="both"/>
-        <w:rPr>
-          <w:sz w:val="28"/>
-          <w:szCs w:val="28"/>
-        </w:rPr>
-      </w:pPr>
-      <w:r>
-        <w:rPr>
-          <w:noProof/>
-          <w:sz w:val="28"/>
-          <w:szCs w:val="28"/>
-        </w:rPr>
         <w:drawing>
           <wp:inline distT="0" distB="0" distL="0" distR="0" wp14:anchorId="59654B8E" wp14:editId="1EA6306F">
             <wp:extent cx="9277350" cy="3133725"/>
@@ -11306,7 +11555,7 @@
                     </pic:cNvPicPr>
                   </pic:nvPicPr>
                   <pic:blipFill>
-                    <a:blip r:embed="rId20">
+                    <a:blip r:embed="rId22">
                       <a:extLst>
                         <a:ext uri="{28A0092B-C50C-407E-A947-70E740481C1C}">
                           <a14:useLocalDpi xmlns:a14="http://schemas.microsoft.com/office/drawing/2010/main" val="0"/>
@@ -11349,268 +11598,1125 @@
           <w:sz w:val="28"/>
           <w:szCs w:val="28"/>
         </w:rPr>
-        <w:t>Рисунок _. Исправление уязвимости</w:t>
-      </w:r>
-    </w:p>
-    <w:p>
-      <w:pPr>
-        <w:spacing w:line="360" w:lineRule="auto"/>
-        <w:rPr>
-          <w:sz w:val="28"/>
-          <w:szCs w:val="28"/>
-        </w:rPr>
-      </w:pPr>
-    </w:p>
-    <w:p>
-      <w:pPr>
-        <w:spacing w:line="360" w:lineRule="auto"/>
-        <w:jc w:val="both"/>
-        <w:rPr>
-          <w:sz w:val="28"/>
-          <w:szCs w:val="28"/>
-        </w:rPr>
-      </w:pPr>
-    </w:p>
-    <w:p>
-      <w:pPr>
-        <w:spacing w:line="360" w:lineRule="auto"/>
-        <w:jc w:val="both"/>
-        <w:rPr>
-          <w:sz w:val="28"/>
-          <w:szCs w:val="28"/>
-        </w:rPr>
-      </w:pPr>
-    </w:p>
-    <w:p>
-      <w:pPr>
-        <w:spacing w:line="360" w:lineRule="auto"/>
-        <w:jc w:val="both"/>
-        <w:rPr>
-          <w:sz w:val="28"/>
-          <w:szCs w:val="28"/>
-        </w:rPr>
-      </w:pPr>
-    </w:p>
-    <w:p>
-      <w:pPr>
-        <w:spacing w:line="360" w:lineRule="auto"/>
-        <w:jc w:val="both"/>
-        <w:rPr>
-          <w:sz w:val="28"/>
-          <w:szCs w:val="28"/>
-        </w:rPr>
-      </w:pPr>
-    </w:p>
-    <w:p>
-      <w:pPr>
-        <w:spacing w:line="360" w:lineRule="auto"/>
-        <w:jc w:val="both"/>
-        <w:rPr>
-          <w:sz w:val="28"/>
-          <w:szCs w:val="28"/>
-        </w:rPr>
-      </w:pPr>
-    </w:p>
-    <w:p>
-      <w:pPr>
-        <w:spacing w:line="360" w:lineRule="auto"/>
-        <w:jc w:val="both"/>
-        <w:rPr>
-          <w:sz w:val="28"/>
-          <w:szCs w:val="28"/>
-        </w:rPr>
-      </w:pPr>
-    </w:p>
-    <w:p>
-      <w:pPr>
-        <w:spacing w:line="360" w:lineRule="auto"/>
-        <w:jc w:val="both"/>
-        <w:rPr>
-          <w:sz w:val="28"/>
-          <w:szCs w:val="28"/>
-        </w:rPr>
-      </w:pPr>
-    </w:p>
-    <w:p>
-      <w:pPr>
-        <w:spacing w:line="360" w:lineRule="auto"/>
-        <w:jc w:val="both"/>
-        <w:rPr>
-          <w:sz w:val="28"/>
-          <w:szCs w:val="28"/>
-        </w:rPr>
-      </w:pPr>
-    </w:p>
-    <w:p>
-      <w:pPr>
-        <w:spacing w:line="360" w:lineRule="auto"/>
-        <w:jc w:val="both"/>
-        <w:rPr>
-          <w:sz w:val="28"/>
-          <w:szCs w:val="28"/>
-        </w:rPr>
-      </w:pPr>
-    </w:p>
-    <w:p>
-      <w:pPr>
-        <w:spacing w:line="360" w:lineRule="auto"/>
-        <w:jc w:val="both"/>
-        <w:rPr>
-          <w:sz w:val="28"/>
-          <w:szCs w:val="28"/>
-        </w:rPr>
-      </w:pPr>
-    </w:p>
-    <w:p>
-      <w:pPr>
-        <w:spacing w:line="360" w:lineRule="auto"/>
-        <w:jc w:val="both"/>
-        <w:rPr>
-          <w:sz w:val="28"/>
-          <w:szCs w:val="28"/>
-        </w:rPr>
-      </w:pPr>
-    </w:p>
-    <w:p>
-      <w:pPr>
-        <w:spacing w:line="360" w:lineRule="auto"/>
-        <w:jc w:val="both"/>
-        <w:rPr>
-          <w:sz w:val="28"/>
-          <w:szCs w:val="28"/>
-        </w:rPr>
-      </w:pPr>
-    </w:p>
-    <w:p>
-      <w:pPr>
-        <w:spacing w:line="360" w:lineRule="auto"/>
-        <w:jc w:val="both"/>
-        <w:rPr>
-          <w:sz w:val="28"/>
-          <w:szCs w:val="28"/>
-        </w:rPr>
-      </w:pPr>
-    </w:p>
-    <w:p>
-      <w:pPr>
-        <w:spacing w:line="360" w:lineRule="auto"/>
-        <w:jc w:val="both"/>
-        <w:rPr>
-          <w:sz w:val="28"/>
-          <w:szCs w:val="28"/>
-        </w:rPr>
-      </w:pPr>
-    </w:p>
-    <w:p>
-      <w:pPr>
-        <w:spacing w:line="360" w:lineRule="auto"/>
-        <w:jc w:val="both"/>
-        <w:rPr>
-          <w:sz w:val="28"/>
-          <w:szCs w:val="28"/>
-        </w:rPr>
-      </w:pPr>
-    </w:p>
-    <w:p>
-      <w:pPr>
-        <w:spacing w:line="360" w:lineRule="auto"/>
-        <w:jc w:val="both"/>
-        <w:rPr>
-          <w:sz w:val="28"/>
-          <w:szCs w:val="28"/>
-        </w:rPr>
-      </w:pPr>
-    </w:p>
-    <w:p>
-      <w:pPr>
-        <w:spacing w:line="360" w:lineRule="auto"/>
-        <w:jc w:val="both"/>
-        <w:rPr>
-          <w:sz w:val="28"/>
-          <w:szCs w:val="28"/>
-        </w:rPr>
-      </w:pPr>
-    </w:p>
-    <w:p>
-      <w:pPr>
-        <w:spacing w:line="360" w:lineRule="auto"/>
-        <w:jc w:val="both"/>
-        <w:rPr>
-          <w:sz w:val="28"/>
-          <w:szCs w:val="28"/>
-        </w:rPr>
-      </w:pPr>
-    </w:p>
-    <w:p>
-      <w:pPr>
-        <w:spacing w:line="360" w:lineRule="auto"/>
-        <w:jc w:val="both"/>
-        <w:rPr>
-          <w:sz w:val="28"/>
-          <w:szCs w:val="28"/>
-        </w:rPr>
-      </w:pPr>
-    </w:p>
-    <w:p>
-      <w:pPr>
-        <w:spacing w:line="360" w:lineRule="auto"/>
-        <w:jc w:val="both"/>
-        <w:rPr>
-          <w:sz w:val="28"/>
-          <w:szCs w:val="28"/>
-        </w:rPr>
-      </w:pPr>
-    </w:p>
-    <w:p>
-      <w:pPr>
-        <w:spacing w:line="360" w:lineRule="auto"/>
-        <w:jc w:val="both"/>
-        <w:rPr>
-          <w:sz w:val="28"/>
-          <w:szCs w:val="28"/>
-        </w:rPr>
-      </w:pPr>
-    </w:p>
-    <w:p>
-      <w:pPr>
-        <w:spacing w:line="360" w:lineRule="auto"/>
-        <w:jc w:val="both"/>
-        <w:rPr>
-          <w:sz w:val="28"/>
-          <w:szCs w:val="28"/>
-        </w:rPr>
-      </w:pPr>
-    </w:p>
-    <w:p>
-      <w:pPr>
-        <w:spacing w:line="360" w:lineRule="auto"/>
-        <w:jc w:val="both"/>
-        <w:rPr>
-          <w:sz w:val="28"/>
-          <w:szCs w:val="28"/>
-        </w:rPr>
-      </w:pPr>
-    </w:p>
-    <w:p>
-      <w:pPr>
-        <w:spacing w:line="360" w:lineRule="auto"/>
-        <w:jc w:val="both"/>
-        <w:rPr>
-          <w:sz w:val="28"/>
-          <w:szCs w:val="28"/>
-        </w:rPr>
-      </w:pPr>
-    </w:p>
-    <w:p>
-      <w:pPr>
-        <w:spacing w:line="360" w:lineRule="auto"/>
+        <w:t xml:space="preserve">Рисунок </w:t>
+      </w:r>
+      <w:r>
+        <w:rPr>
+          <w:sz w:val="28"/>
+          <w:szCs w:val="28"/>
+        </w:rPr>
+        <w:t>14</w:t>
+      </w:r>
+      <w:r>
+        <w:rPr>
+          <w:sz w:val="28"/>
+          <w:szCs w:val="28"/>
+        </w:rPr>
+        <w:t>. Исправление уязвимости</w:t>
+      </w:r>
+    </w:p>
+    <w:p>
+      <w:pPr>
+        <w:spacing w:line="360" w:lineRule="auto"/>
+        <w:rPr>
+          <w:sz w:val="28"/>
+          <w:szCs w:val="28"/>
+        </w:rPr>
+      </w:pPr>
+    </w:p>
+    <w:p>
+      <w:pPr>
+        <w:spacing w:line="360" w:lineRule="auto"/>
+        <w:ind w:left="360"/>
+        <w:jc w:val="center"/>
+        <w:rPr>
+          <w:b/>
+          <w:bCs/>
+          <w:sz w:val="28"/>
+          <w:szCs w:val="28"/>
+        </w:rPr>
+      </w:pPr>
+      <w:r>
+        <w:rPr>
+          <w:b/>
+          <w:bCs/>
+          <w:sz w:val="28"/>
+          <w:szCs w:val="28"/>
+        </w:rPr>
+        <w:t xml:space="preserve">3.3. Уязвимость в собственном системном вызове </w:t>
+      </w:r>
+      <w:proofErr w:type="spellStart"/>
+      <w:r>
+        <w:rPr>
+          <w:b/>
+          <w:bCs/>
+          <w:sz w:val="28"/>
+          <w:szCs w:val="28"/>
+        </w:rPr>
+        <w:t>sys_task_stats</w:t>
+      </w:r>
+      <w:proofErr w:type="spellEnd"/>
+    </w:p>
+    <w:p>
+      <w:pPr>
+        <w:spacing w:line="360" w:lineRule="auto"/>
+        <w:ind w:firstLine="708"/>
+        <w:jc w:val="both"/>
+        <w:rPr>
+          <w:sz w:val="28"/>
+          <w:szCs w:val="28"/>
+        </w:rPr>
+      </w:pPr>
+      <w:r>
+        <w:rPr>
+          <w:sz w:val="28"/>
+          <w:szCs w:val="28"/>
+        </w:rPr>
+        <w:t xml:space="preserve">Как отмечено в разделе 2.2, реализация </w:t>
+      </w:r>
+      <w:proofErr w:type="spellStart"/>
+      <w:r>
+        <w:rPr>
+          <w:sz w:val="28"/>
+          <w:szCs w:val="28"/>
+        </w:rPr>
+        <w:t>sys_task_stats</w:t>
+      </w:r>
+      <w:proofErr w:type="spellEnd"/>
+      <w:r>
+        <w:rPr>
+          <w:sz w:val="28"/>
+          <w:szCs w:val="28"/>
+        </w:rPr>
+        <w:t xml:space="preserve"> намеренно не содержит двух проверок, обязательных для безопасного системного вызова: проверки прав доступа к данным запрошенного процесса и проверки итогового размера копируемых данных. Ниже эти два случая продемонстрированы практически на той же виртуальной машине, без </w:t>
+      </w:r>
+      <w:proofErr w:type="spellStart"/>
+      <w:r>
+        <w:rPr>
+          <w:sz w:val="28"/>
+          <w:szCs w:val="28"/>
+        </w:rPr>
+        <w:t>пересборки</w:t>
+      </w:r>
+      <w:proofErr w:type="spellEnd"/>
+      <w:r>
+        <w:rPr>
+          <w:sz w:val="28"/>
+          <w:szCs w:val="28"/>
+        </w:rPr>
+        <w:t xml:space="preserve"> ядра.</w:t>
+      </w:r>
+    </w:p>
+    <w:p>
+      <w:pPr>
+        <w:spacing w:line="360" w:lineRule="auto"/>
+        <w:ind w:left="360"/>
+        <w:jc w:val="center"/>
+        <w:rPr>
+          <w:b/>
+          <w:bCs/>
+          <w:sz w:val="28"/>
+          <w:szCs w:val="28"/>
+        </w:rPr>
+      </w:pPr>
+      <w:r>
+        <w:rPr>
+          <w:b/>
+          <w:bCs/>
+          <w:sz w:val="28"/>
+          <w:szCs w:val="28"/>
+        </w:rPr>
+        <w:t>3.3.1. Отсутствие проверки прав доступа</w:t>
+      </w:r>
+    </w:p>
+    <w:p>
+      <w:pPr>
+        <w:spacing w:line="360" w:lineRule="auto"/>
+        <w:ind w:firstLine="708"/>
+        <w:jc w:val="both"/>
+        <w:rPr>
+          <w:sz w:val="28"/>
+          <w:szCs w:val="28"/>
+        </w:rPr>
+      </w:pPr>
+      <w:r>
+        <w:rPr>
+          <w:sz w:val="28"/>
+          <w:szCs w:val="28"/>
+        </w:rPr>
+        <w:t>Штатные средства диагностики процессов в Linux</w:t>
+      </w:r>
+      <w:r>
+        <w:rPr>
+          <w:sz w:val="28"/>
+          <w:szCs w:val="28"/>
+        </w:rPr>
+        <w:t xml:space="preserve"> </w:t>
+      </w:r>
+      <w:r>
+        <w:rPr>
+          <w:sz w:val="28"/>
+          <w:szCs w:val="28"/>
+        </w:rPr>
+        <w:t xml:space="preserve">требуют соответствующих прав: непривилегированный пользователь не может присоединиться к процессу, принадлежащему другому пользователю, тем более — процессу </w:t>
+      </w:r>
+      <w:proofErr w:type="spellStart"/>
+      <w:r>
+        <w:rPr>
+          <w:sz w:val="28"/>
+          <w:szCs w:val="28"/>
+        </w:rPr>
+        <w:t>root</w:t>
+      </w:r>
+      <w:proofErr w:type="spellEnd"/>
+      <w:r>
+        <w:rPr>
+          <w:sz w:val="28"/>
+          <w:szCs w:val="28"/>
+        </w:rPr>
+        <w:t xml:space="preserve">. </w:t>
+      </w:r>
+      <w:proofErr w:type="spellStart"/>
+      <w:r>
+        <w:rPr>
+          <w:sz w:val="28"/>
+          <w:szCs w:val="28"/>
+        </w:rPr>
+        <w:t>sys_task_stats</w:t>
+      </w:r>
+      <w:proofErr w:type="spellEnd"/>
+      <w:r>
+        <w:rPr>
+          <w:sz w:val="28"/>
+          <w:szCs w:val="28"/>
+        </w:rPr>
+        <w:t xml:space="preserve"> же принимает произвольный PID без какой-либо проверки того, кому принадлежит вызывающий процесс и кому — запрашиваемый. На [Рисунке 15] показан вызов </w:t>
+      </w:r>
+      <w:proofErr w:type="spellStart"/>
+      <w:r>
+        <w:rPr>
+          <w:sz w:val="28"/>
+          <w:szCs w:val="28"/>
+        </w:rPr>
+        <w:t>sys_task_stats</w:t>
+      </w:r>
+      <w:proofErr w:type="spellEnd"/>
+      <w:r>
+        <w:rPr>
+          <w:sz w:val="28"/>
+          <w:szCs w:val="28"/>
+        </w:rPr>
+        <w:t xml:space="preserve"> с PID 1 (процесс </w:t>
+      </w:r>
+      <w:proofErr w:type="spellStart"/>
+      <w:r>
+        <w:rPr>
+          <w:sz w:val="28"/>
+          <w:szCs w:val="28"/>
+        </w:rPr>
+        <w:t>init</w:t>
+      </w:r>
+      <w:proofErr w:type="spellEnd"/>
+      <w:r>
+        <w:rPr>
+          <w:sz w:val="28"/>
+          <w:szCs w:val="28"/>
+        </w:rPr>
+        <w:t xml:space="preserve">, принадлежащий </w:t>
+      </w:r>
+      <w:proofErr w:type="spellStart"/>
+      <w:r>
+        <w:rPr>
+          <w:sz w:val="28"/>
+          <w:szCs w:val="28"/>
+        </w:rPr>
+        <w:t>root</w:t>
+      </w:r>
+      <w:proofErr w:type="spellEnd"/>
+      <w:r>
+        <w:rPr>
+          <w:sz w:val="28"/>
+          <w:szCs w:val="28"/>
+        </w:rPr>
+        <w:t xml:space="preserve">) от имени обычного пользователя </w:t>
+      </w:r>
+      <w:proofErr w:type="spellStart"/>
+      <w:r>
+        <w:rPr>
+          <w:sz w:val="28"/>
+          <w:szCs w:val="28"/>
+        </w:rPr>
+        <w:t>vavka</w:t>
+      </w:r>
+      <w:proofErr w:type="spellEnd"/>
+      <w:r>
+        <w:rPr>
+          <w:sz w:val="28"/>
+          <w:szCs w:val="28"/>
+        </w:rPr>
+        <w:t xml:space="preserve"> — вызов успешно возвращает реальные данные о процессе </w:t>
+      </w:r>
+      <w:proofErr w:type="spellStart"/>
+      <w:r>
+        <w:rPr>
+          <w:sz w:val="28"/>
+          <w:szCs w:val="28"/>
+        </w:rPr>
+        <w:t>root</w:t>
+      </w:r>
+      <w:proofErr w:type="spellEnd"/>
+      <w:r>
+        <w:rPr>
+          <w:sz w:val="28"/>
+          <w:szCs w:val="28"/>
+        </w:rPr>
+        <w:t>, хотя штатные механизмы такой доступ бы запретили.</w:t>
+      </w:r>
+    </w:p>
+    <w:p>
+      <w:pPr>
+        <w:spacing w:line="360" w:lineRule="auto"/>
+        <w:ind w:firstLine="708"/>
+        <w:jc w:val="both"/>
+        <w:rPr>
+          <w:sz w:val="28"/>
+          <w:szCs w:val="28"/>
+        </w:rPr>
+      </w:pPr>
+      <w:r>
+        <w:rPr>
+          <w:sz w:val="28"/>
+          <w:szCs w:val="28"/>
+        </w:rPr>
+        <w:lastRenderedPageBreak/>
+        <w:t xml:space="preserve">Не забыть вставить фото(не </w:t>
+      </w:r>
+      <w:proofErr w:type="spellStart"/>
+      <w:r>
+        <w:rPr>
+          <w:sz w:val="28"/>
+          <w:szCs w:val="28"/>
+        </w:rPr>
+        <w:t>обяза</w:t>
+      </w:r>
+      <w:proofErr w:type="spellEnd"/>
+      <w:r>
+        <w:rPr>
+          <w:sz w:val="28"/>
+          <w:szCs w:val="28"/>
+        </w:rPr>
+        <w:t>)</w:t>
+      </w:r>
+    </w:p>
+    <w:p>
+      <w:pPr>
+        <w:spacing w:line="360" w:lineRule="auto"/>
+        <w:jc w:val="center"/>
+        <w:rPr>
+          <w:sz w:val="28"/>
+          <w:szCs w:val="28"/>
+        </w:rPr>
+      </w:pPr>
+      <w:r>
+        <w:rPr>
+          <w:noProof/>
+        </w:rPr>
+        <w:drawing>
+          <wp:inline distT="0" distB="0" distL="114300" distR="114300" wp14:anchorId="3FD91219" wp14:editId="05980D0C">
+            <wp:extent cx="3840480" cy="203835"/>
+            <wp:effectExtent l="0" t="0" r="0" b="0"/>
+            <wp:docPr id="6" name="sys_task_stats pid1"/>
+            <wp:cNvGraphicFramePr>
+              <a:graphicFrameLocks xmlns:a="http://schemas.openxmlformats.org/drawingml/2006/main" noChangeAspect="1"/>
+            </wp:cNvGraphicFramePr>
+            <a:graphic xmlns:a="http://schemas.openxmlformats.org/drawingml/2006/main">
+              <a:graphicData uri="http://schemas.openxmlformats.org/drawingml/2006/picture">
+                <pic:pic xmlns:pic="http://schemas.openxmlformats.org/drawingml/2006/picture">
+                  <pic:nvPicPr>
+                    <pic:cNvPr id="6" name="sys_task_stats pid1"/>
+                    <pic:cNvPicPr>
+                      <a:picLocks noChangeAspect="1"/>
+                    </pic:cNvPicPr>
+                  </pic:nvPicPr>
+                  <pic:blipFill>
+                    <a:blip r:embed="rId23"/>
+                    <a:stretch>
+                      <a:fillRect/>
+                    </a:stretch>
+                  </pic:blipFill>
+                  <pic:spPr>
+                    <a:xfrm>
+                      <a:off x="0" y="0"/>
+                      <a:ext cx="3840480" cy="204345"/>
+                    </a:xfrm>
+                    <a:prstGeom prst="rect">
+                      <a:avLst/>
+                    </a:prstGeom>
+                  </pic:spPr>
+                </pic:pic>
+              </a:graphicData>
+            </a:graphic>
+          </wp:inline>
+        </w:drawing>
+      </w:r>
+    </w:p>
+    <w:p>
+      <w:pPr>
+        <w:spacing w:line="360" w:lineRule="auto"/>
+        <w:jc w:val="center"/>
+        <w:rPr>
+          <w:sz w:val="28"/>
+          <w:szCs w:val="28"/>
+        </w:rPr>
+      </w:pPr>
+      <w:r>
+        <w:rPr>
+          <w:sz w:val="28"/>
+          <w:szCs w:val="28"/>
+        </w:rPr>
+        <w:t xml:space="preserve">Рисунок 15. Результат вызова </w:t>
+      </w:r>
+      <w:proofErr w:type="spellStart"/>
+      <w:r>
+        <w:rPr>
+          <w:sz w:val="28"/>
+          <w:szCs w:val="28"/>
+        </w:rPr>
+        <w:t>sys_task_stats</w:t>
+      </w:r>
+      <w:proofErr w:type="spellEnd"/>
+      <w:r>
+        <w:rPr>
+          <w:sz w:val="28"/>
+          <w:szCs w:val="28"/>
+        </w:rPr>
+        <w:t xml:space="preserve"> для PID 1 (процесс </w:t>
+      </w:r>
+      <w:proofErr w:type="spellStart"/>
+      <w:r>
+        <w:rPr>
+          <w:sz w:val="28"/>
+          <w:szCs w:val="28"/>
+        </w:rPr>
+        <w:t>root</w:t>
+      </w:r>
+      <w:proofErr w:type="spellEnd"/>
+      <w:r>
+        <w:rPr>
+          <w:sz w:val="28"/>
+          <w:szCs w:val="28"/>
+        </w:rPr>
+        <w:t>) от имени обычного пользователя</w:t>
+      </w:r>
+    </w:p>
+    <w:p>
+      <w:pPr>
+        <w:spacing w:line="360" w:lineRule="auto"/>
+        <w:ind w:left="360"/>
+        <w:jc w:val="center"/>
+        <w:rPr>
+          <w:b/>
+          <w:bCs/>
+          <w:sz w:val="28"/>
+          <w:szCs w:val="28"/>
+        </w:rPr>
+      </w:pPr>
+      <w:r>
+        <w:rPr>
+          <w:b/>
+          <w:bCs/>
+          <w:sz w:val="28"/>
+          <w:szCs w:val="28"/>
+        </w:rPr>
+        <w:t>3.3.2. Отсутствие проверки размера буфера</w:t>
+      </w:r>
+    </w:p>
+    <w:p>
+      <w:pPr>
+        <w:spacing w:line="360" w:lineRule="auto"/>
+        <w:ind w:firstLine="708"/>
+        <w:jc w:val="both"/>
+        <w:rPr>
+          <w:sz w:val="28"/>
+          <w:szCs w:val="28"/>
+        </w:rPr>
+      </w:pPr>
+      <w:r>
+        <w:rPr>
+          <w:sz w:val="28"/>
+          <w:szCs w:val="28"/>
+        </w:rPr>
+        <w:t xml:space="preserve">Аргумент </w:t>
+      </w:r>
+      <w:proofErr w:type="spellStart"/>
+      <w:r>
+        <w:rPr>
+          <w:sz w:val="28"/>
+          <w:szCs w:val="28"/>
+        </w:rPr>
+        <w:t>size</w:t>
+      </w:r>
+      <w:proofErr w:type="spellEnd"/>
+      <w:r>
+        <w:rPr>
+          <w:sz w:val="28"/>
+          <w:szCs w:val="28"/>
+        </w:rPr>
+        <w:t xml:space="preserve"> передаётся в </w:t>
+      </w:r>
+      <w:proofErr w:type="spellStart"/>
+      <w:r>
+        <w:rPr>
+          <w:sz w:val="28"/>
+          <w:szCs w:val="28"/>
+        </w:rPr>
+        <w:t>copy_to_user</w:t>
+      </w:r>
+      <w:proofErr w:type="spellEnd"/>
+      <w:r>
+        <w:rPr>
+          <w:sz w:val="28"/>
+          <w:szCs w:val="28"/>
+        </w:rPr>
+        <w:t xml:space="preserve"> без ограничения сверху значением </w:t>
+      </w:r>
+      <w:proofErr w:type="spellStart"/>
+      <w:r>
+        <w:rPr>
+          <w:sz w:val="28"/>
+          <w:szCs w:val="28"/>
+        </w:rPr>
+        <w:t>sizeof</w:t>
+      </w:r>
+      <w:proofErr w:type="spellEnd"/>
+      <w:r>
+        <w:rPr>
+          <w:sz w:val="28"/>
+          <w:szCs w:val="28"/>
+        </w:rPr>
+        <w:t>(</w:t>
+      </w:r>
+      <w:proofErr w:type="spellStart"/>
+      <w:r>
+        <w:rPr>
+          <w:sz w:val="28"/>
+          <w:szCs w:val="28"/>
+        </w:rPr>
+        <w:t>struct</w:t>
+      </w:r>
+      <w:proofErr w:type="spellEnd"/>
+      <w:r>
+        <w:rPr>
+          <w:sz w:val="28"/>
+          <w:szCs w:val="28"/>
+        </w:rPr>
+        <w:t xml:space="preserve"> </w:t>
+      </w:r>
+      <w:proofErr w:type="spellStart"/>
+      <w:r>
+        <w:rPr>
+          <w:sz w:val="28"/>
+          <w:szCs w:val="28"/>
+        </w:rPr>
+        <w:t>task_stats_info</w:t>
+      </w:r>
+      <w:proofErr w:type="spellEnd"/>
+      <w:r>
+        <w:rPr>
+          <w:sz w:val="28"/>
+          <w:szCs w:val="28"/>
+        </w:rPr>
+        <w:t xml:space="preserve">) (48 байт с учётом выравнивания). Для проверки последствий была написана программа, вызывающая </w:t>
+      </w:r>
+      <w:proofErr w:type="spellStart"/>
+      <w:r>
+        <w:rPr>
+          <w:sz w:val="28"/>
+          <w:szCs w:val="28"/>
+        </w:rPr>
+        <w:t>sys_task_stats</w:t>
+      </w:r>
+      <w:proofErr w:type="spellEnd"/>
+      <w:r>
+        <w:rPr>
+          <w:sz w:val="28"/>
+          <w:szCs w:val="28"/>
+        </w:rPr>
+        <w:t xml:space="preserve"> с последовательно возрастающими значениями </w:t>
+      </w:r>
+      <w:proofErr w:type="spellStart"/>
+      <w:r>
+        <w:rPr>
+          <w:sz w:val="28"/>
+          <w:szCs w:val="28"/>
+        </w:rPr>
+        <w:t>size</w:t>
+      </w:r>
+      <w:proofErr w:type="spellEnd"/>
+      <w:r>
+        <w:rPr>
+          <w:sz w:val="28"/>
+          <w:szCs w:val="28"/>
+        </w:rPr>
+        <w:t xml:space="preserve"> (от 40 до 512 байт) и выводящая результат каждого вызова. Результат показан на [Рисунке 16]: запросы размером до 48 байт включительно (то есть не превышающие реальный размер структуры) выполняются успешно, тогда как любой запрос, превышающий 48 байт, завершается ошибкой обращения к памяти — граница проходит ровно по границе структуры, что подтверждает: код </w:t>
+      </w:r>
+      <w:proofErr w:type="spellStart"/>
+      <w:r>
+        <w:rPr>
+          <w:sz w:val="28"/>
+          <w:szCs w:val="28"/>
+        </w:rPr>
+        <w:t>sys_task_stats</w:t>
+      </w:r>
+      <w:proofErr w:type="spellEnd"/>
+      <w:r>
+        <w:rPr>
+          <w:sz w:val="28"/>
+          <w:szCs w:val="28"/>
+        </w:rPr>
+        <w:t xml:space="preserve"> действительно не ограничивает </w:t>
+      </w:r>
+      <w:proofErr w:type="spellStart"/>
+      <w:r>
+        <w:rPr>
+          <w:sz w:val="28"/>
+          <w:szCs w:val="28"/>
+        </w:rPr>
+        <w:t>size</w:t>
+      </w:r>
+      <w:proofErr w:type="spellEnd"/>
+      <w:r>
+        <w:rPr>
+          <w:sz w:val="28"/>
+          <w:szCs w:val="28"/>
+        </w:rPr>
+        <w:t xml:space="preserve"> и пытается скопировать ровно столько байт, сколько запросил пользователь, независимо от реального размера данных.</w:t>
+      </w:r>
+    </w:p>
+    <w:p>
+      <w:pPr>
+        <w:spacing w:line="360" w:lineRule="auto"/>
+        <w:jc w:val="center"/>
+        <w:rPr>
+          <w:sz w:val="28"/>
+          <w:szCs w:val="28"/>
+        </w:rPr>
+      </w:pPr>
+      <w:r>
+        <w:rPr>
+          <w:noProof/>
+        </w:rPr>
+        <w:drawing>
+          <wp:inline distT="0" distB="0" distL="114300" distR="114300" wp14:anchorId="35392F2C" wp14:editId="6DD36C18">
+            <wp:extent cx="3291840" cy="1448435"/>
+            <wp:effectExtent l="0" t="0" r="0" b="0"/>
+            <wp:docPr id="101" name="size sweep table"/>
+            <wp:cNvGraphicFramePr>
+              <a:graphicFrameLocks xmlns:a="http://schemas.openxmlformats.org/drawingml/2006/main" noChangeAspect="1"/>
+            </wp:cNvGraphicFramePr>
+            <a:graphic xmlns:a="http://schemas.openxmlformats.org/drawingml/2006/main">
+              <a:graphicData uri="http://schemas.openxmlformats.org/drawingml/2006/picture">
+                <pic:pic xmlns:pic="http://schemas.openxmlformats.org/drawingml/2006/picture">
+                  <pic:nvPicPr>
+                    <pic:cNvPr id="101" name="size sweep table"/>
+                    <pic:cNvPicPr>
+                      <a:picLocks noChangeAspect="1"/>
+                    </pic:cNvPicPr>
+                  </pic:nvPicPr>
+                  <pic:blipFill>
+                    <a:blip r:embed="rId24"/>
+                    <a:stretch>
+                      <a:fillRect/>
+                    </a:stretch>
+                  </pic:blipFill>
+                  <pic:spPr>
+                    <a:xfrm>
+                      <a:off x="0" y="0"/>
+                      <a:ext cx="3291840" cy="1448682"/>
+                    </a:xfrm>
+                    <a:prstGeom prst="rect">
+                      <a:avLst/>
+                    </a:prstGeom>
+                  </pic:spPr>
+                </pic:pic>
+              </a:graphicData>
+            </a:graphic>
+          </wp:inline>
+        </w:drawing>
+      </w:r>
+    </w:p>
+    <w:p>
+      <w:pPr>
+        <w:spacing w:line="360" w:lineRule="auto"/>
+        <w:jc w:val="center"/>
+        <w:rPr>
+          <w:sz w:val="28"/>
+          <w:szCs w:val="28"/>
+        </w:rPr>
+      </w:pPr>
+      <w:r>
+        <w:rPr>
+          <w:sz w:val="28"/>
+          <w:szCs w:val="28"/>
+        </w:rPr>
+        <w:t xml:space="preserve">Рисунок 16. Проверка обработки различных значений </w:t>
+      </w:r>
+      <w:proofErr w:type="spellStart"/>
+      <w:r>
+        <w:rPr>
+          <w:sz w:val="28"/>
+          <w:szCs w:val="28"/>
+        </w:rPr>
+        <w:t>size</w:t>
+      </w:r>
+      <w:proofErr w:type="spellEnd"/>
+    </w:p>
+    <w:p>
+      <w:pPr>
+        <w:spacing w:line="360" w:lineRule="auto"/>
+        <w:ind w:firstLine="708"/>
+        <w:jc w:val="both"/>
+        <w:rPr>
+          <w:sz w:val="28"/>
+          <w:szCs w:val="28"/>
+        </w:rPr>
+      </w:pPr>
+      <w:r>
+        <w:rPr>
+          <w:sz w:val="28"/>
+          <w:szCs w:val="28"/>
+        </w:rPr>
+        <w:t xml:space="preserve">То, что запросы с завышенным </w:t>
+      </w:r>
+      <w:proofErr w:type="spellStart"/>
+      <w:r>
+        <w:rPr>
+          <w:sz w:val="28"/>
+          <w:szCs w:val="28"/>
+        </w:rPr>
+        <w:t>size</w:t>
+      </w:r>
+      <w:proofErr w:type="spellEnd"/>
+      <w:r>
+        <w:rPr>
+          <w:sz w:val="28"/>
+          <w:szCs w:val="28"/>
+        </w:rPr>
+        <w:t xml:space="preserve"> не приводят к аварийной остановке системы, а корректно прерываются с ошибкой, говорит о наличии в ядре дополнительных, независимых от кода </w:t>
+      </w:r>
+      <w:proofErr w:type="spellStart"/>
+      <w:r>
+        <w:rPr>
+          <w:sz w:val="28"/>
+          <w:szCs w:val="28"/>
+        </w:rPr>
+        <w:t>sys_task_stats</w:t>
+      </w:r>
+      <w:proofErr w:type="spellEnd"/>
+      <w:r>
+        <w:rPr>
+          <w:sz w:val="28"/>
+          <w:szCs w:val="28"/>
+        </w:rPr>
+        <w:t xml:space="preserve"> механизмов защиты памяти. Тем не менее сама уязвимость — отсутствие проверки аргумента </w:t>
+      </w:r>
+      <w:proofErr w:type="spellStart"/>
+      <w:r>
+        <w:rPr>
+          <w:sz w:val="28"/>
+          <w:szCs w:val="28"/>
+        </w:rPr>
+        <w:t>size</w:t>
+      </w:r>
+      <w:proofErr w:type="spellEnd"/>
+      <w:r>
+        <w:rPr>
+          <w:sz w:val="28"/>
+          <w:szCs w:val="28"/>
+        </w:rPr>
+        <w:t xml:space="preserve"> в коде обработчика — в реализации присутствует: именно эта проверка, а не везение, должна быть первой линией защиты, и её отсутствие является </w:t>
+      </w:r>
+      <w:r>
+        <w:rPr>
+          <w:sz w:val="28"/>
+          <w:szCs w:val="28"/>
+        </w:rPr>
+        <w:lastRenderedPageBreak/>
+        <w:t>характерным примером класса уязвимостей «некорректная проверка размера данных», рассмотренного в разделе 3.1.</w:t>
+      </w:r>
+    </w:p>
+    <w:p>
+      <w:pPr>
+        <w:spacing w:line="360" w:lineRule="auto"/>
+        <w:ind w:firstLine="708"/>
+        <w:jc w:val="both"/>
+        <w:rPr>
+          <w:sz w:val="28"/>
+          <w:szCs w:val="28"/>
+        </w:rPr>
+      </w:pPr>
+    </w:p>
+    <w:p>
+      <w:pPr>
+        <w:spacing w:line="360" w:lineRule="auto"/>
+        <w:ind w:firstLine="708"/>
+        <w:jc w:val="both"/>
+        <w:rPr>
+          <w:b/>
+          <w:bCs/>
+          <w:sz w:val="28"/>
+          <w:szCs w:val="28"/>
+        </w:rPr>
+      </w:pPr>
+    </w:p>
+    <w:p>
+      <w:pPr>
+        <w:spacing w:line="360" w:lineRule="auto"/>
+        <w:ind w:firstLine="708"/>
+        <w:jc w:val="both"/>
+        <w:rPr>
+          <w:b/>
+          <w:bCs/>
+          <w:sz w:val="28"/>
+          <w:szCs w:val="28"/>
+        </w:rPr>
+      </w:pPr>
+    </w:p>
+    <w:p>
+      <w:pPr>
+        <w:spacing w:line="360" w:lineRule="auto"/>
+        <w:ind w:firstLine="708"/>
+        <w:jc w:val="both"/>
+        <w:rPr>
+          <w:b/>
+          <w:bCs/>
+          <w:sz w:val="28"/>
+          <w:szCs w:val="28"/>
+        </w:rPr>
+      </w:pPr>
+    </w:p>
+    <w:p>
+      <w:pPr>
+        <w:spacing w:line="360" w:lineRule="auto"/>
+        <w:ind w:firstLine="708"/>
+        <w:jc w:val="both"/>
+        <w:rPr>
+          <w:b/>
+          <w:bCs/>
+          <w:sz w:val="28"/>
+          <w:szCs w:val="28"/>
+        </w:rPr>
+      </w:pPr>
+    </w:p>
+    <w:p>
+      <w:pPr>
+        <w:spacing w:line="360" w:lineRule="auto"/>
+        <w:ind w:firstLine="708"/>
+        <w:jc w:val="both"/>
+        <w:rPr>
+          <w:b/>
+          <w:bCs/>
+          <w:sz w:val="28"/>
+          <w:szCs w:val="28"/>
+        </w:rPr>
+      </w:pPr>
+    </w:p>
+    <w:p>
+      <w:pPr>
+        <w:spacing w:line="360" w:lineRule="auto"/>
+        <w:ind w:firstLine="708"/>
+        <w:jc w:val="both"/>
+        <w:rPr>
+          <w:b/>
+          <w:bCs/>
+          <w:sz w:val="28"/>
+          <w:szCs w:val="28"/>
+        </w:rPr>
+      </w:pPr>
+    </w:p>
+    <w:p>
+      <w:pPr>
+        <w:spacing w:line="360" w:lineRule="auto"/>
+        <w:ind w:firstLine="708"/>
+        <w:jc w:val="both"/>
+        <w:rPr>
+          <w:b/>
+          <w:bCs/>
+          <w:sz w:val="28"/>
+          <w:szCs w:val="28"/>
+        </w:rPr>
+      </w:pPr>
+    </w:p>
+    <w:p>
+      <w:pPr>
+        <w:spacing w:line="360" w:lineRule="auto"/>
+        <w:ind w:firstLine="708"/>
+        <w:jc w:val="both"/>
+        <w:rPr>
+          <w:b/>
+          <w:bCs/>
+          <w:sz w:val="28"/>
+          <w:szCs w:val="28"/>
+        </w:rPr>
+      </w:pPr>
+    </w:p>
+    <w:p>
+      <w:pPr>
+        <w:spacing w:line="360" w:lineRule="auto"/>
+        <w:ind w:firstLine="708"/>
+        <w:jc w:val="both"/>
+        <w:rPr>
+          <w:b/>
+          <w:bCs/>
+          <w:sz w:val="28"/>
+          <w:szCs w:val="28"/>
+        </w:rPr>
+      </w:pPr>
+    </w:p>
+    <w:p>
+      <w:pPr>
+        <w:spacing w:line="360" w:lineRule="auto"/>
+        <w:ind w:firstLine="708"/>
+        <w:jc w:val="both"/>
+        <w:rPr>
+          <w:b/>
+          <w:bCs/>
+          <w:sz w:val="28"/>
+          <w:szCs w:val="28"/>
+        </w:rPr>
+      </w:pPr>
+    </w:p>
+    <w:p>
+      <w:pPr>
+        <w:spacing w:line="360" w:lineRule="auto"/>
+        <w:ind w:firstLine="708"/>
+        <w:jc w:val="both"/>
+        <w:rPr>
+          <w:b/>
+          <w:bCs/>
+          <w:sz w:val="28"/>
+          <w:szCs w:val="28"/>
+        </w:rPr>
+      </w:pPr>
+    </w:p>
+    <w:p>
+      <w:pPr>
+        <w:spacing w:line="360" w:lineRule="auto"/>
+        <w:ind w:firstLine="708"/>
+        <w:jc w:val="both"/>
+        <w:rPr>
+          <w:b/>
+          <w:bCs/>
+          <w:sz w:val="28"/>
+          <w:szCs w:val="28"/>
+        </w:rPr>
+      </w:pPr>
+    </w:p>
+    <w:p>
+      <w:pPr>
+        <w:spacing w:line="360" w:lineRule="auto"/>
+        <w:ind w:firstLine="708"/>
+        <w:jc w:val="both"/>
+        <w:rPr>
+          <w:b/>
+          <w:bCs/>
+          <w:sz w:val="28"/>
+          <w:szCs w:val="28"/>
+        </w:rPr>
+      </w:pPr>
+    </w:p>
+    <w:p>
+      <w:pPr>
+        <w:spacing w:line="360" w:lineRule="auto"/>
+        <w:ind w:firstLine="708"/>
+        <w:jc w:val="both"/>
+        <w:rPr>
+          <w:b/>
+          <w:bCs/>
+          <w:sz w:val="28"/>
+          <w:szCs w:val="28"/>
+        </w:rPr>
+      </w:pPr>
+    </w:p>
+    <w:p>
+      <w:pPr>
+        <w:spacing w:line="360" w:lineRule="auto"/>
+        <w:ind w:firstLine="708"/>
+        <w:jc w:val="both"/>
+        <w:rPr>
+          <w:b/>
+          <w:bCs/>
+          <w:sz w:val="28"/>
+          <w:szCs w:val="28"/>
+        </w:rPr>
+      </w:pPr>
+    </w:p>
+    <w:p>
+      <w:pPr>
+        <w:spacing w:line="360" w:lineRule="auto"/>
+        <w:ind w:firstLine="708"/>
+        <w:jc w:val="both"/>
+        <w:rPr>
+          <w:b/>
+          <w:bCs/>
+          <w:sz w:val="28"/>
+          <w:szCs w:val="28"/>
+        </w:rPr>
+      </w:pPr>
+    </w:p>
+    <w:p>
+      <w:pPr>
+        <w:spacing w:line="360" w:lineRule="auto"/>
+        <w:ind w:firstLine="708"/>
+        <w:jc w:val="both"/>
+        <w:rPr>
+          <w:b/>
+          <w:bCs/>
+          <w:sz w:val="28"/>
+          <w:szCs w:val="28"/>
+        </w:rPr>
+      </w:pPr>
+    </w:p>
+    <w:p>
+      <w:pPr>
+        <w:spacing w:line="360" w:lineRule="auto"/>
+        <w:ind w:firstLine="708"/>
+        <w:jc w:val="both"/>
+        <w:rPr>
+          <w:b/>
+          <w:bCs/>
+          <w:sz w:val="28"/>
+          <w:szCs w:val="28"/>
+        </w:rPr>
+      </w:pPr>
+    </w:p>
+    <w:p>
+      <w:pPr>
+        <w:spacing w:line="360" w:lineRule="auto"/>
+        <w:ind w:firstLine="708"/>
+        <w:jc w:val="both"/>
+        <w:rPr>
+          <w:b/>
+          <w:bCs/>
+          <w:sz w:val="28"/>
+          <w:szCs w:val="28"/>
+        </w:rPr>
+      </w:pPr>
+    </w:p>
+    <w:p>
+      <w:pPr>
+        <w:spacing w:line="360" w:lineRule="auto"/>
+        <w:ind w:firstLine="708"/>
+        <w:jc w:val="both"/>
+        <w:rPr>
+          <w:b/>
+          <w:bCs/>
+          <w:sz w:val="28"/>
+          <w:szCs w:val="28"/>
+        </w:rPr>
+      </w:pPr>
+    </w:p>
+    <w:p>
+      <w:pPr>
+        <w:spacing w:line="360" w:lineRule="auto"/>
+        <w:ind w:firstLine="708"/>
+        <w:jc w:val="both"/>
+        <w:rPr>
+          <w:b/>
+          <w:bCs/>
+          <w:sz w:val="28"/>
+          <w:szCs w:val="28"/>
+        </w:rPr>
+      </w:pPr>
+    </w:p>
+    <w:p>
+      <w:pPr>
+        <w:spacing w:line="360" w:lineRule="auto"/>
+        <w:ind w:firstLine="708"/>
+        <w:jc w:val="both"/>
+        <w:rPr>
+          <w:b/>
+          <w:bCs/>
+          <w:sz w:val="28"/>
+          <w:szCs w:val="28"/>
+        </w:rPr>
+      </w:pPr>
+    </w:p>
+    <w:p>
+      <w:pPr>
+        <w:spacing w:line="360" w:lineRule="auto"/>
+        <w:ind w:firstLine="708"/>
+        <w:jc w:val="both"/>
+        <w:rPr>
+          <w:b/>
+          <w:bCs/>
+          <w:sz w:val="28"/>
+          <w:szCs w:val="28"/>
+        </w:rPr>
+      </w:pPr>
+    </w:p>
+    <w:p>
+      <w:pPr>
+        <w:spacing w:line="360" w:lineRule="auto"/>
+        <w:ind w:firstLine="708"/>
+        <w:jc w:val="both"/>
+        <w:rPr>
+          <w:b/>
+          <w:bCs/>
+          <w:sz w:val="28"/>
+          <w:szCs w:val="28"/>
+        </w:rPr>
+      </w:pPr>
+    </w:p>
+    <w:p>
+      <w:pPr>
+        <w:spacing w:line="360" w:lineRule="auto"/>
+        <w:ind w:firstLine="708"/>
+        <w:jc w:val="both"/>
+        <w:rPr>
+          <w:b/>
+          <w:bCs/>
+          <w:sz w:val="28"/>
+          <w:szCs w:val="28"/>
+        </w:rPr>
+      </w:pPr>
+    </w:p>
+    <w:p>
+      <w:pPr>
+        <w:spacing w:line="360" w:lineRule="auto"/>
+        <w:ind w:firstLine="708"/>
+        <w:jc w:val="both"/>
+        <w:rPr>
+          <w:b/>
+          <w:bCs/>
+          <w:sz w:val="28"/>
+          <w:szCs w:val="28"/>
+        </w:rPr>
+      </w:pPr>
+    </w:p>
+    <w:p>
+      <w:pPr>
+        <w:spacing w:line="360" w:lineRule="auto"/>
+        <w:ind w:firstLine="708"/>
+        <w:jc w:val="both"/>
+        <w:rPr>
+          <w:b/>
+          <w:bCs/>
+          <w:sz w:val="28"/>
+          <w:szCs w:val="28"/>
+        </w:rPr>
+      </w:pPr>
+    </w:p>
+    <w:p>
+      <w:pPr>
+        <w:spacing w:line="360" w:lineRule="auto"/>
+        <w:ind w:firstLine="708"/>
         <w:jc w:val="center"/>
         <w:rPr>
           <w:b/>
           <w:bCs/>
           <w:sz w:val="32"/>
           <w:szCs w:val="32"/>
-          <w:lang w:val="en-US"/>
         </w:rPr>
       </w:pPr>
       <w:r>
@@ -11620,6 +12726,371 @@
           <w:sz w:val="32"/>
           <w:szCs w:val="32"/>
         </w:rPr>
+        <w:lastRenderedPageBreak/>
+        <w:t>Заключение</w:t>
+      </w:r>
+    </w:p>
+    <w:p>
+      <w:pPr>
+        <w:spacing w:line="360" w:lineRule="auto"/>
+        <w:ind w:firstLine="708"/>
+        <w:jc w:val="both"/>
+        <w:rPr>
+          <w:sz w:val="28"/>
+          <w:szCs w:val="28"/>
+        </w:rPr>
+      </w:pPr>
+      <w:r>
+        <w:rPr>
+          <w:sz w:val="28"/>
+          <w:szCs w:val="28"/>
+        </w:rPr>
+        <w:t xml:space="preserve">В ходе курсовой работы исследован механизм системных вызовов в архитектуре x86-64. Изучены принцип колец защиты, соглашение о передаче параметров через регистры, работа инструкции </w:t>
+      </w:r>
+      <w:proofErr w:type="spellStart"/>
+      <w:r>
+        <w:rPr>
+          <w:sz w:val="28"/>
+          <w:szCs w:val="28"/>
+        </w:rPr>
+        <w:t>syscall</w:t>
+      </w:r>
+      <w:proofErr w:type="spellEnd"/>
+      <w:r>
+        <w:rPr>
+          <w:sz w:val="28"/>
+          <w:szCs w:val="28"/>
+        </w:rPr>
+        <w:t xml:space="preserve"> и обработка вызовов внутри ядра через таблицу </w:t>
+      </w:r>
+      <w:proofErr w:type="spellStart"/>
+      <w:r>
+        <w:rPr>
+          <w:sz w:val="28"/>
+          <w:szCs w:val="28"/>
+        </w:rPr>
+        <w:t>sys_call_table</w:t>
+      </w:r>
+      <w:proofErr w:type="spellEnd"/>
+      <w:r>
+        <w:rPr>
+          <w:sz w:val="28"/>
+          <w:szCs w:val="28"/>
+        </w:rPr>
+        <w:t xml:space="preserve">. Теория подтверждена практически: с помощью утилиты </w:t>
+      </w:r>
+      <w:proofErr w:type="spellStart"/>
+      <w:r>
+        <w:rPr>
+          <w:sz w:val="28"/>
+          <w:szCs w:val="28"/>
+        </w:rPr>
+        <w:t>strace</w:t>
+      </w:r>
+      <w:proofErr w:type="spellEnd"/>
+      <w:r>
+        <w:rPr>
+          <w:sz w:val="28"/>
+          <w:szCs w:val="28"/>
+        </w:rPr>
+        <w:t xml:space="preserve"> и программы на ассемблере продемонстрированы реальные системные вызовы.</w:t>
+      </w:r>
+    </w:p>
+    <w:p>
+      <w:pPr>
+        <w:spacing w:line="360" w:lineRule="auto"/>
+        <w:ind w:firstLine="708"/>
+        <w:jc w:val="both"/>
+        <w:rPr>
+          <w:sz w:val="28"/>
+          <w:szCs w:val="28"/>
+        </w:rPr>
+      </w:pPr>
+      <w:r>
+        <w:rPr>
+          <w:sz w:val="28"/>
+          <w:szCs w:val="28"/>
+        </w:rPr>
+        <w:t>Разработан и внедрён в ядро Linux собственный системный вызов, работоспособность которого подтверждена тестовой программой.</w:t>
+      </w:r>
+    </w:p>
+    <w:p>
+      <w:pPr>
+        <w:spacing w:line="360" w:lineRule="auto"/>
+        <w:ind w:firstLine="708"/>
+        <w:jc w:val="both"/>
+        <w:rPr>
+          <w:sz w:val="28"/>
+          <w:szCs w:val="28"/>
+        </w:rPr>
+      </w:pPr>
+      <w:r>
+        <w:rPr>
+          <w:sz w:val="28"/>
+          <w:szCs w:val="28"/>
+        </w:rPr>
+        <w:t>Проведён анализ уязвимости CVE-2022-0847 (</w:t>
+      </w:r>
+      <w:proofErr w:type="spellStart"/>
+      <w:r>
+        <w:rPr>
+          <w:sz w:val="28"/>
+          <w:szCs w:val="28"/>
+        </w:rPr>
+        <w:t>Dirty</w:t>
+      </w:r>
+      <w:proofErr w:type="spellEnd"/>
+      <w:r>
+        <w:rPr>
+          <w:sz w:val="28"/>
+          <w:szCs w:val="28"/>
+        </w:rPr>
+        <w:t xml:space="preserve"> </w:t>
+      </w:r>
+      <w:proofErr w:type="spellStart"/>
+      <w:r>
+        <w:rPr>
+          <w:sz w:val="28"/>
+          <w:szCs w:val="28"/>
+        </w:rPr>
+        <w:t>Pipe</w:t>
+      </w:r>
+      <w:proofErr w:type="spellEnd"/>
+      <w:r>
+        <w:rPr>
+          <w:sz w:val="28"/>
+          <w:szCs w:val="28"/>
+        </w:rPr>
+        <w:t xml:space="preserve">): показано, как отсутствие инициализации одного поля структуры ядра позволяло записывать данные в файлы только для чтения через системные вызовы </w:t>
+      </w:r>
+      <w:proofErr w:type="spellStart"/>
+      <w:r>
+        <w:rPr>
+          <w:sz w:val="28"/>
+          <w:szCs w:val="28"/>
+        </w:rPr>
+        <w:t>pipe</w:t>
+      </w:r>
+      <w:proofErr w:type="spellEnd"/>
+      <w:r>
+        <w:rPr>
+          <w:sz w:val="28"/>
+          <w:szCs w:val="28"/>
+        </w:rPr>
+        <w:t xml:space="preserve">, </w:t>
+      </w:r>
+      <w:proofErr w:type="spellStart"/>
+      <w:r>
+        <w:rPr>
+          <w:sz w:val="28"/>
+          <w:szCs w:val="28"/>
+        </w:rPr>
+        <w:t>splice</w:t>
+      </w:r>
+      <w:proofErr w:type="spellEnd"/>
+      <w:r>
+        <w:rPr>
+          <w:sz w:val="28"/>
+          <w:szCs w:val="28"/>
+        </w:rPr>
+        <w:t xml:space="preserve"> и </w:t>
+      </w:r>
+      <w:proofErr w:type="spellStart"/>
+      <w:r>
+        <w:rPr>
+          <w:sz w:val="28"/>
+          <w:szCs w:val="28"/>
+        </w:rPr>
+        <w:t>write</w:t>
+      </w:r>
+      <w:proofErr w:type="spellEnd"/>
+      <w:r>
+        <w:rPr>
+          <w:sz w:val="28"/>
+          <w:szCs w:val="28"/>
+        </w:rPr>
+        <w:t>.</w:t>
+      </w:r>
+    </w:p>
+    <w:p>
+      <w:pPr>
+        <w:spacing w:line="360" w:lineRule="auto"/>
+        <w:ind w:firstLine="708"/>
+        <w:jc w:val="both"/>
+        <w:rPr>
+          <w:sz w:val="28"/>
+          <w:szCs w:val="28"/>
+        </w:rPr>
+      </w:pPr>
+      <w:r>
+        <w:rPr>
+          <w:sz w:val="28"/>
+          <w:szCs w:val="28"/>
+        </w:rPr>
+        <w:t>Все поставленные задачи выполнены. Полученные результаты подтверждают, что системные вызовы являются критически важной границей между пользовательским пространством и ядром, требующей строгого контроля на стороне ядра.</w:t>
+      </w:r>
+    </w:p>
+    <w:p>
+      <w:pPr>
+        <w:spacing w:line="360" w:lineRule="auto"/>
+        <w:ind w:firstLine="708"/>
+        <w:jc w:val="both"/>
+        <w:rPr>
+          <w:sz w:val="28"/>
+          <w:szCs w:val="28"/>
+        </w:rPr>
+      </w:pPr>
+    </w:p>
+    <w:p>
+      <w:pPr>
+        <w:spacing w:line="360" w:lineRule="auto"/>
+        <w:jc w:val="both"/>
+        <w:rPr>
+          <w:sz w:val="28"/>
+          <w:szCs w:val="28"/>
+        </w:rPr>
+      </w:pPr>
+    </w:p>
+    <w:p>
+      <w:pPr>
+        <w:spacing w:line="360" w:lineRule="auto"/>
+        <w:jc w:val="both"/>
+        <w:rPr>
+          <w:sz w:val="28"/>
+          <w:szCs w:val="28"/>
+        </w:rPr>
+      </w:pPr>
+    </w:p>
+    <w:p>
+      <w:pPr>
+        <w:spacing w:line="360" w:lineRule="auto"/>
+        <w:jc w:val="both"/>
+        <w:rPr>
+          <w:sz w:val="28"/>
+          <w:szCs w:val="28"/>
+        </w:rPr>
+      </w:pPr>
+    </w:p>
+    <w:p>
+      <w:pPr>
+        <w:spacing w:line="360" w:lineRule="auto"/>
+        <w:jc w:val="both"/>
+        <w:rPr>
+          <w:sz w:val="28"/>
+          <w:szCs w:val="28"/>
+        </w:rPr>
+      </w:pPr>
+    </w:p>
+    <w:p>
+      <w:pPr>
+        <w:spacing w:line="360" w:lineRule="auto"/>
+        <w:jc w:val="both"/>
+        <w:rPr>
+          <w:sz w:val="28"/>
+          <w:szCs w:val="28"/>
+        </w:rPr>
+      </w:pPr>
+    </w:p>
+    <w:p>
+      <w:pPr>
+        <w:spacing w:line="360" w:lineRule="auto"/>
+        <w:jc w:val="both"/>
+        <w:rPr>
+          <w:sz w:val="28"/>
+          <w:szCs w:val="28"/>
+        </w:rPr>
+      </w:pPr>
+    </w:p>
+    <w:p>
+      <w:pPr>
+        <w:spacing w:line="360" w:lineRule="auto"/>
+        <w:jc w:val="both"/>
+        <w:rPr>
+          <w:sz w:val="28"/>
+          <w:szCs w:val="28"/>
+        </w:rPr>
+      </w:pPr>
+    </w:p>
+    <w:p>
+      <w:pPr>
+        <w:spacing w:line="360" w:lineRule="auto"/>
+        <w:jc w:val="both"/>
+        <w:rPr>
+          <w:sz w:val="28"/>
+          <w:szCs w:val="28"/>
+        </w:rPr>
+      </w:pPr>
+    </w:p>
+    <w:p>
+      <w:pPr>
+        <w:spacing w:line="360" w:lineRule="auto"/>
+        <w:jc w:val="both"/>
+        <w:rPr>
+          <w:sz w:val="28"/>
+          <w:szCs w:val="28"/>
+        </w:rPr>
+      </w:pPr>
+    </w:p>
+    <w:p>
+      <w:pPr>
+        <w:spacing w:line="360" w:lineRule="auto"/>
+        <w:jc w:val="both"/>
+        <w:rPr>
+          <w:sz w:val="28"/>
+          <w:szCs w:val="28"/>
+        </w:rPr>
+      </w:pPr>
+    </w:p>
+    <w:p>
+      <w:pPr>
+        <w:spacing w:line="360" w:lineRule="auto"/>
+        <w:jc w:val="both"/>
+        <w:rPr>
+          <w:sz w:val="28"/>
+          <w:szCs w:val="28"/>
+        </w:rPr>
+      </w:pPr>
+    </w:p>
+    <w:p>
+      <w:pPr>
+        <w:spacing w:line="360" w:lineRule="auto"/>
+        <w:jc w:val="both"/>
+        <w:rPr>
+          <w:sz w:val="28"/>
+          <w:szCs w:val="28"/>
+        </w:rPr>
+      </w:pPr>
+    </w:p>
+    <w:p>
+      <w:pPr>
+        <w:spacing w:line="360" w:lineRule="auto"/>
+        <w:jc w:val="both"/>
+        <w:rPr>
+          <w:sz w:val="28"/>
+          <w:szCs w:val="28"/>
+        </w:rPr>
+      </w:pPr>
+    </w:p>
+    <w:p>
+      <w:pPr>
+        <w:spacing w:line="360" w:lineRule="auto"/>
+        <w:jc w:val="center"/>
+        <w:rPr>
+          <w:b/>
+          <w:bCs/>
+          <w:sz w:val="32"/>
+          <w:szCs w:val="32"/>
+          <w:lang w:val="en-US"/>
+        </w:rPr>
+      </w:pPr>
+      <w:r>
+        <w:rPr>
+          <w:b/>
+          <w:bCs/>
+          <w:sz w:val="32"/>
+          <w:szCs w:val="32"/>
+        </w:rPr>
+        <w:lastRenderedPageBreak/>
         <w:t>Список</w:t>
       </w:r>
       <w:r>
@@ -11724,7 +13195,7 @@
         </w:rPr>
         <w:t xml:space="preserve">: </w:t>
       </w:r>
-      <w:hyperlink r:id="rId21" w:tgtFrame="_blank" w:history="1">
+      <w:hyperlink r:id="rId25" w:tgtFrame="_blank" w:history="1">
         <w:r>
           <w:rPr>
             <w:rStyle w:val="af1"/>
@@ -11768,7 +13239,7 @@
         </w:rPr>
         <w:t xml:space="preserve">[2] CVE-2022-0847 — CVE Record — URL: </w:t>
       </w:r>
-      <w:hyperlink r:id="rId22" w:tgtFrame="_blank" w:history="1">
+      <w:hyperlink r:id="rId26" w:tgtFrame="_blank" w:history="1">
         <w:r>
           <w:rPr>
             <w:rStyle w:val="af1"/>
@@ -11838,7 +13309,7 @@
         </w:rPr>
         <w:t xml:space="preserve">. The Dirty Pipe Vulnerability — URL: </w:t>
       </w:r>
-      <w:hyperlink r:id="rId23" w:tgtFrame="_blank" w:history="1">
+      <w:hyperlink r:id="rId27" w:tgtFrame="_blank" w:history="1">
         <w:r>
           <w:rPr>
             <w:rStyle w:val="af1"/>
@@ -11887,7 +13358,7 @@
         </w:rPr>
         <w:t xml:space="preserve">[4] CVE-2022-0847-dirty-pipe-poc — URL: </w:t>
       </w:r>
-      <w:hyperlink r:id="rId24" w:tgtFrame="_blank" w:history="1">
+      <w:hyperlink r:id="rId28" w:tgtFrame="_blank" w:history="1">
         <w:r>
           <w:rPr>
             <w:rStyle w:val="af1"/>
@@ -11938,7 +13409,7 @@
       </w:pPr>
     </w:p>
     <w:sectPr>
-      <w:footerReference w:type="default" r:id="rId25"/>
+      <w:footerReference w:type="default" r:id="rId29"/>
       <w:pgSz w:w="11906" w:h="16838"/>
       <w:pgMar w:top="1134" w:right="850" w:bottom="1134" w:left="1701" w:header="708" w:footer="708" w:gutter="0"/>
       <w:cols w:space="708"/>

</xml_diff>